<commit_message>
Address PR review: remove screenshot tooling and update Member 5 doc.
Keep only Member 5 deliverables (swat.html, ci-prod.yml) and fill Table 1 in the term project document.

Co-authored-by: Cursor <cursoragent@cursor.com>
</commit_message>
<xml_diff>
--- a/DF_TermProject_Spring2026.docx
+++ b/DF_TermProject_Spring2026.docx
@@ -1525,7 +1525,11 @@
             </w:tcMar>
             <w:vAlign w:val="center"/>
           </w:tcPr>
-          <w:p/>
+          <w:p>
+            <w:r>
+              <w:t>5</w:t>
+            </w:r>
+          </w:p>
         </w:tc>
         <w:tc>
           <w:tcPr>
@@ -1545,7 +1549,11 @@
             </w:tcMar>
             <w:vAlign w:val="center"/>
           </w:tcPr>
-          <w:p/>
+          <w:p>
+            <w:r>
+              <w:t>ABDUR Raffay Iftakhar DURRANI</w:t>
+            </w:r>
+          </w:p>
         </w:tc>
         <w:tc>
           <w:tcPr>
@@ -1565,7 +1573,11 @@
             </w:tcMar>
             <w:vAlign w:val="center"/>
           </w:tcPr>
-          <w:p/>
+          <w:p>
+            <w:r>
+              <w:t>AbdurRaffay123</w:t>
+            </w:r>
+          </w:p>
         </w:tc>
         <w:tc>
           <w:tcPr>
@@ -1585,7 +1597,11 @@
             </w:tcMar>
             <w:vAlign w:val="center"/>
           </w:tcPr>
-          <w:p/>
+          <w:p>
+            <w:r>
+              <w:t>Member</w:t>
+            </w:r>
+          </w:p>
         </w:tc>
         <w:tc>
           <w:tcPr>
@@ -1605,7 +1621,11 @@
             </w:tcMar>
             <w:vAlign w:val="center"/>
           </w:tcPr>
-          <w:p/>
+          <w:p>
+            <w:r>
+              <w:t>.github/workflows/ci-prod.yml</w:t>
+            </w:r>
+          </w:p>
         </w:tc>
         <w:tc>
           <w:tcPr>
@@ -1625,7 +1645,11 @@
             </w:tcMar>
             <w:vAlign w:val="center"/>
           </w:tcPr>
-          <w:p/>
+          <w:p>
+            <w:r>
+              <w:t>swat.html</w:t>
+            </w:r>
+          </w:p>
         </w:tc>
         <w:tc>
           <w:tcPr>
@@ -1645,7 +1669,11 @@
             </w:tcMar>
             <w:vAlign w:val="center"/>
           </w:tcPr>
-          <w:p/>
+          <w:p>
+            <w:r>
+              <w:t>feature/AbdurRaffay123/swat</w:t>
+            </w:r>
+          </w:p>
         </w:tc>
         <w:tc>
           <w:tcPr>
@@ -1665,7 +1693,11 @@
             </w:tcMar>
             <w:vAlign w:val="center"/>
           </w:tcPr>
-          <w:p/>
+          <w:p>
+            <w:r>
+              <w:t>N</w:t>
+            </w:r>
+          </w:p>
         </w:tc>
       </w:tr>
     </w:tbl>
@@ -1675,20 +1707,7 @@
         <w:spacing w:before="60" w:after="60" w:line="276" w:lineRule="auto"/>
       </w:pPr>
       <w:r>
-        <w:rPr>
-          <w:b/>
-          <w:bCs/>
-          <w:color w:val="1F3864"/>
-        </w:rPr>
-        <w:t xml:space="preserve">Group Repository URL: </w:t>
-      </w:r>
-      <w:r>
-        <w:rPr>
-          <w:i/>
-          <w:iCs/>
-          <w:color w:val="595959"/>
-        </w:rPr>
-        <w:t>[Paste Your GitHub Repository URL Here]</w:t>
+        <w:t>Group Repository URL: https://github.com/moeez907/pakvista-cicd</w:t>
       </w:r>
     </w:p>
     <w:p/>
@@ -15784,12 +15803,7 @@
         <w:spacing w:before="100" w:after="40"/>
       </w:pPr>
       <w:r>
-        <w:rPr>
-          <w:b/>
-          <w:bCs/>
-          <w:color w:val="2E75B6"/>
-        </w:rPr>
-        <w:t>Member 5: [Student Name] – Reflection</w:t>
+        <w:t>Member 5: ABDUR Raffay Iftakhar DURRANI – Reflection</w:t>
       </w:r>
     </w:p>
     <w:p>
@@ -15800,12 +15814,7 @@
         <w:spacing w:before="160" w:after="40"/>
       </w:pPr>
       <w:r>
-        <w:rPr>
-          <w:i/>
-          <w:iCs/>
-          <w:color w:val="595959"/>
-        </w:rPr>
-        <w:t>[Write your 4–5 line reflection here]</w:t>
+        <w:t>I built the Swat destination page using HTML5 and the shared style.css, covering Malam Jabba, Mingora Bazaar, and the Swat Museum with image placeholders and site navigation. I authored ci-prod.yml for production CI, triggered on pull requests to production, to build and push the prod-latest Docker image to Docker Hub. I followed GitFlow on feature/AbdurRaffay123/swat and opened a PR to develop so ci-dev could validate my changes before merge.</w:t>
       </w:r>
     </w:p>
     <w:p/>

</xml_diff>

<commit_message>
Update project document with member details
</commit_message>
<xml_diff>
--- a/DF_TermProject_Spring2026.docx
+++ b/DF_TermProject_Spring2026.docx
@@ -1,6 +1,6 @@
 
 <file path=word/document.xml><?xml version="1.0" encoding="utf-8"?>
-<w:document xmlns:wpc="http://schemas.microsoft.com/office/word/2010/wordprocessingCanvas" xmlns:cx="http://schemas.microsoft.com/office/drawing/2014/chartex" xmlns:cx1="http://schemas.microsoft.com/office/drawing/2015/9/8/chartex" xmlns:cx2="http://schemas.microsoft.com/office/drawing/2015/10/21/chartex" xmlns:cx3="http://schemas.microsoft.com/office/drawing/2016/5/9/chartex" xmlns:cx4="http://schemas.microsoft.com/office/drawing/2016/5/10/chartex" xmlns:cx5="http://schemas.microsoft.com/office/drawing/2016/5/11/chartex" xmlns:cx6="http://schemas.microsoft.com/office/drawing/2016/5/12/chartex" xmlns:cx7="http://schemas.microsoft.com/office/drawing/2016/5/13/chartex" xmlns:cx8="http://schemas.microsoft.com/office/drawing/2016/5/14/chartex" xmlns:mc="http://schemas.openxmlformats.org/markup-compatibility/2006" xmlns:aink="http://schemas.microsoft.com/office/drawing/2016/ink" xmlns:am3d="http://schemas.microsoft.com/office/drawing/2017/model3d" xmlns:o="urn:schemas-microsoft-com:office:office" xmlns:oel="http://schemas.microsoft.com/office/2019/extlst" xmlns:r="http://schemas.openxmlformats.org/officeDocument/2006/relationships" xmlns:m="http://schemas.openxmlformats.org/officeDocument/2006/math" xmlns:v="urn:schemas-microsoft-com:vml" xmlns:wp14="http://schemas.microsoft.com/office/word/2010/wordprocessingDrawing" xmlns:wp="http://schemas.openxmlformats.org/drawingml/2006/wordprocessingDrawing" xmlns:w10="urn:schemas-microsoft-com:office:word" xmlns:w="http://schemas.openxmlformats.org/wordprocessingml/2006/main" xmlns:w14="http://schemas.microsoft.com/office/word/2010/wordml" xmlns:w15="http://schemas.microsoft.com/office/word/2012/wordml" xmlns:w16cex="http://schemas.microsoft.com/office/word/2018/wordml/cex" xmlns:w16cid="http://schemas.microsoft.com/office/word/2016/wordml/cid" xmlns:w16="http://schemas.microsoft.com/office/word/2018/wordml" xmlns:w16du="http://schemas.microsoft.com/office/word/2023/wordml/word16du" xmlns:w16sdtdh="http://schemas.microsoft.com/office/word/2020/wordml/sdtdatahash" xmlns:w16sdtfl="http://schemas.microsoft.com/office/word/2024/wordml/sdtformatlock" xmlns:w16se="http://schemas.microsoft.com/office/word/2015/wordml/symex" xmlns:wpg="http://schemas.microsoft.com/office/word/2010/wordprocessingGroup" xmlns:wpi="http://schemas.microsoft.com/office/word/2010/wordprocessingInk" xmlns:wne="http://schemas.microsoft.com/office/word/2006/wordml" xmlns:wps="http://schemas.microsoft.com/office/word/2010/wordprocessingShape" mc:Ignorable="w14 w15 w16se w16cid w16 w16cex w16sdtdh w16sdtfl w16du wp14">
+<w:document xmlns:wpc="http://schemas.microsoft.com/office/word/2010/wordprocessingCanvas" xmlns:cx="http://schemas.microsoft.com/office/drawing/2014/chartex" xmlns:cx1="http://schemas.microsoft.com/office/drawing/2015/9/8/chartex" xmlns:cx2="http://schemas.microsoft.com/office/drawing/2015/10/21/chartex" xmlns:cx3="http://schemas.microsoft.com/office/drawing/2016/5/9/chartex" xmlns:cx4="http://schemas.microsoft.com/office/drawing/2016/5/10/chartex" xmlns:cx5="http://schemas.microsoft.com/office/drawing/2016/5/11/chartex" xmlns:cx6="http://schemas.microsoft.com/office/drawing/2016/5/12/chartex" xmlns:cx7="http://schemas.microsoft.com/office/drawing/2016/5/13/chartex" xmlns:cx8="http://schemas.microsoft.com/office/drawing/2016/5/14/chartex" xmlns:mc="http://schemas.openxmlformats.org/markup-compatibility/2006" xmlns:aink="http://schemas.microsoft.com/office/drawing/2016/ink" xmlns:am3d="http://schemas.microsoft.com/office/drawing/2017/model3d" xmlns:o="urn:schemas-microsoft-com:office:office" xmlns:oel="http://schemas.microsoft.com/office/2019/extlst" xmlns:r="http://schemas.openxmlformats.org/officeDocument/2006/relationships" xmlns:m="http://schemas.openxmlformats.org/officeDocument/2006/math" xmlns:v="urn:schemas-microsoft-com:vml" xmlns:wp14="http://schemas.microsoft.com/office/word/2010/wordprocessingDrawing" xmlns:wp="http://schemas.openxmlformats.org/drawingml/2006/wordprocessingDrawing" xmlns:w10="urn:schemas-microsoft-com:office:word" xmlns:w="http://schemas.openxmlformats.org/wordprocessingml/2006/main" xmlns:w14="http://schemas.microsoft.com/office/word/2010/wordml" xmlns:w15="http://schemas.microsoft.com/office/word/2012/wordml" xmlns:w16cex="http://schemas.microsoft.com/office/word/2018/wordml/cex" xmlns:w16cid="http://schemas.microsoft.com/office/word/2016/wordml/cid" xmlns:w16="http://schemas.microsoft.com/office/word/2018/wordml" xmlns:w16sdtdh="http://schemas.microsoft.com/office/word/2020/wordml/sdtdatahash" xmlns:w16se="http://schemas.microsoft.com/office/word/2015/wordml/symex" xmlns:wpg="http://schemas.microsoft.com/office/word/2010/wordprocessingGroup" xmlns:wpi="http://schemas.microsoft.com/office/word/2010/wordprocessingInk" xmlns:wne="http://schemas.microsoft.com/office/word/2006/wordml" xmlns:wps="http://schemas.microsoft.com/office/word/2010/wordprocessingShape" mc:Ignorable="w14 w15 w16se w16cid w16 w16cex w16sdtdh wp14">
   <w:body>
     <w:p>
       <w:pPr>
@@ -146,91 +146,7 @@
         <w:rPr>
           <w:color w:val="000000"/>
         </w:rPr>
-        <w:t>Design and implement six GitHub Actions workflow files: ci-</w:t>
-      </w:r>
-      <w:proofErr w:type="spellStart"/>
-      <w:r>
-        <w:rPr>
-          <w:color w:val="000000"/>
-        </w:rPr>
-        <w:t>dev.yml</w:t>
-      </w:r>
-      <w:proofErr w:type="spellEnd"/>
-      <w:r>
-        <w:rPr>
-          <w:color w:val="000000"/>
-        </w:rPr>
-        <w:t>, cd-</w:t>
-      </w:r>
-      <w:proofErr w:type="spellStart"/>
-      <w:r>
-        <w:rPr>
-          <w:color w:val="000000"/>
-        </w:rPr>
-        <w:t>dev.yml</w:t>
-      </w:r>
-      <w:proofErr w:type="spellEnd"/>
-      <w:r>
-        <w:rPr>
-          <w:color w:val="000000"/>
-        </w:rPr>
-        <w:t>, ci-</w:t>
-      </w:r>
-      <w:proofErr w:type="spellStart"/>
-      <w:r>
-        <w:rPr>
-          <w:color w:val="000000"/>
-        </w:rPr>
-        <w:t>staging.yml</w:t>
-      </w:r>
-      <w:proofErr w:type="spellEnd"/>
-      <w:r>
-        <w:rPr>
-          <w:color w:val="000000"/>
-        </w:rPr>
-        <w:t>, cd-</w:t>
-      </w:r>
-      <w:proofErr w:type="spellStart"/>
-      <w:r>
-        <w:rPr>
-          <w:color w:val="000000"/>
-        </w:rPr>
-        <w:t>staging.yml</w:t>
-      </w:r>
-      <w:proofErr w:type="spellEnd"/>
-      <w:r>
-        <w:rPr>
-          <w:color w:val="000000"/>
-        </w:rPr>
-        <w:t>, ci-</w:t>
-      </w:r>
-      <w:proofErr w:type="spellStart"/>
-      <w:r>
-        <w:rPr>
-          <w:color w:val="000000"/>
-        </w:rPr>
-        <w:t>prod.yml</w:t>
-      </w:r>
-      <w:proofErr w:type="spellEnd"/>
-      <w:r>
-        <w:rPr>
-          <w:color w:val="000000"/>
-        </w:rPr>
-        <w:t>, and cd-</w:t>
-      </w:r>
-      <w:proofErr w:type="spellStart"/>
-      <w:r>
-        <w:rPr>
-          <w:color w:val="000000"/>
-        </w:rPr>
-        <w:t>prod.yml</w:t>
-      </w:r>
-      <w:proofErr w:type="spellEnd"/>
-      <w:r>
-        <w:rPr>
-          <w:color w:val="000000"/>
-        </w:rPr>
-        <w:t>.</w:t>
+        <w:t>Design and implement six GitHub Actions workflow files: ci-dev.yml, cd-dev.yml, ci-staging.yml, cd-staging.yml, ci-prod.yml, and cd-prod.yml.</w:t>
       </w:r>
     </w:p>
     <w:p>
@@ -480,21 +396,7 @@
         <w:rPr>
           <w:color w:val="000000"/>
         </w:rPr>
-        <w:t xml:space="preserve">No JavaScript of any kind is permitted. All pages must be built exclusively using HTML5 and CSS3. Forms must use HTML-only attributes (no JS event listeners, no fetch, no </w:t>
-      </w:r>
-      <w:proofErr w:type="spellStart"/>
-      <w:r>
-        <w:rPr>
-          <w:color w:val="000000"/>
-        </w:rPr>
-        <w:t>XMLHttpRequest</w:t>
-      </w:r>
-      <w:proofErr w:type="spellEnd"/>
-      <w:r>
-        <w:rPr>
-          <w:color w:val="000000"/>
-        </w:rPr>
-        <w:t>).</w:t>
+        <w:t>No JavaScript of any kind is permitted. All pages must be built exclusively using HTML5 and CSS3. Forms must use HTML-only attributes (no JS event listeners, no fetch, no XMLHttpRequest).</w:t>
       </w:r>
     </w:p>
     <w:p>
@@ -542,14 +444,14 @@
         <w:tblLook w:val="04A0" w:firstRow="1" w:lastRow="0" w:firstColumn="1" w:lastColumn="0" w:noHBand="0" w:noVBand="1"/>
       </w:tblPr>
       <w:tblGrid>
-        <w:gridCol w:w="419"/>
-        <w:gridCol w:w="964"/>
-        <w:gridCol w:w="1604"/>
-        <w:gridCol w:w="1442"/>
-        <w:gridCol w:w="1001"/>
-        <w:gridCol w:w="1160"/>
-        <w:gridCol w:w="2234"/>
-        <w:gridCol w:w="1254"/>
+        <w:gridCol w:w="405"/>
+        <w:gridCol w:w="954"/>
+        <w:gridCol w:w="1497"/>
+        <w:gridCol w:w="1348"/>
+        <w:gridCol w:w="1106"/>
+        <w:gridCol w:w="1106"/>
+        <w:gridCol w:w="2487"/>
+        <w:gridCol w:w="1175"/>
       </w:tblGrid>
       <w:tr>
         <w:tc>
@@ -1100,13 +1002,8 @@
           </w:tcPr>
           <w:p>
             <w:r>
-              <w:t>cd-</w:t>
-            </w:r>
-            <w:proofErr w:type="spellStart"/>
-            <w:r>
-              <w:t>dev.yml</w:t>
-            </w:r>
-            <w:proofErr w:type="spellEnd"/>
+              <w:t>cd-dev.yml</w:t>
+            </w:r>
           </w:p>
         </w:tc>
         <w:tc>
@@ -1221,7 +1118,11 @@
             </w:tcMar>
             <w:vAlign w:val="center"/>
           </w:tcPr>
-          <w:p/>
+          <w:p>
+            <w:r>
+              <w:t>Mukaram</w:t>
+            </w:r>
+          </w:p>
         </w:tc>
         <w:tc>
           <w:tcPr>
@@ -1241,7 +1142,11 @@
             </w:tcMar>
             <w:vAlign w:val="center"/>
           </w:tcPr>
-          <w:p/>
+          <w:p>
+            <w:r>
+              <w:t>Mukaram2999</w:t>
+            </w:r>
+          </w:p>
         </w:tc>
         <w:tc>
           <w:tcPr>
@@ -1261,7 +1166,11 @@
             </w:tcMar>
             <w:vAlign w:val="center"/>
           </w:tcPr>
-          <w:p/>
+          <w:p>
+            <w:r>
+              <w:t>Member</w:t>
+            </w:r>
+          </w:p>
         </w:tc>
         <w:tc>
           <w:tcPr>
@@ -1281,7 +1190,11 @@
             </w:tcMar>
             <w:vAlign w:val="center"/>
           </w:tcPr>
-          <w:p/>
+          <w:p>
+            <w:r>
+              <w:t>ci-staging.yml</w:t>
+            </w:r>
+          </w:p>
         </w:tc>
         <w:tc>
           <w:tcPr>
@@ -1301,7 +1214,11 @@
             </w:tcMar>
             <w:vAlign w:val="center"/>
           </w:tcPr>
-          <w:p/>
+          <w:p>
+            <w:r>
+              <w:t>Hunza.html</w:t>
+            </w:r>
+          </w:p>
         </w:tc>
         <w:tc>
           <w:tcPr>
@@ -1321,7 +1238,11 @@
             </w:tcMar>
             <w:vAlign w:val="center"/>
           </w:tcPr>
-          <w:p/>
+          <w:p>
+            <w:r>
+              <w:t>Feature/mukaram2999/hunza</w:t>
+            </w:r>
+          </w:p>
         </w:tc>
         <w:tc>
           <w:tcPr>
@@ -1341,7 +1262,11 @@
             </w:tcMar>
             <w:vAlign w:val="center"/>
           </w:tcPr>
-          <w:p/>
+          <w:p>
+            <w:r>
+              <w:t>y</w:t>
+            </w:r>
+          </w:p>
         </w:tc>
       </w:tr>
       <w:tr>
@@ -1781,7 +1706,6 @@
       <w:r>
         <w:t xml:space="preserve">Your team is the engineering crew for </w:t>
       </w:r>
-      <w:proofErr w:type="spellStart"/>
       <w:r>
         <w:rPr>
           <w:b/>
@@ -1790,7 +1714,6 @@
         </w:rPr>
         <w:t>PakVista</w:t>
       </w:r>
-      <w:proofErr w:type="spellEnd"/>
       <w:r>
         <w:t xml:space="preserve"> – a static informational website about Pakistan's top five tourist destinations. The site consists of five HTML pages, each dedicated to one destination, plus a shared stylesheet that enforces a consistent visual identity. The website must be built using </w:t>
       </w:r>
@@ -1869,6 +1792,7 @@
                 <w:sz w:val="20"/>
                 <w:szCs w:val="20"/>
               </w:rPr>
+              <w:lastRenderedPageBreak/>
               <w:t>Environment</w:t>
             </w:r>
           </w:p>
@@ -2004,7 +1928,6 @@
                 <w:sz w:val="20"/>
                 <w:szCs w:val="20"/>
               </w:rPr>
-              <w:lastRenderedPageBreak/>
               <w:t>Development</w:t>
             </w:r>
           </w:p>
@@ -2086,23 +2009,13 @@
             <w:vAlign w:val="center"/>
           </w:tcPr>
           <w:p>
-            <w:proofErr w:type="spellStart"/>
-            <w:r>
-              <w:rPr>
-                <w:color w:val="000000"/>
-                <w:sz w:val="20"/>
-                <w:szCs w:val="20"/>
-              </w:rPr>
-              <w:t>pakvista</w:t>
-            </w:r>
-            <w:proofErr w:type="spellEnd"/>
-            <w:r>
-              <w:rPr>
-                <w:color w:val="000000"/>
-                <w:sz w:val="20"/>
-                <w:szCs w:val="20"/>
-              </w:rPr>
-              <w:t>-dev (on Render)</w:t>
+            <w:r>
+              <w:rPr>
+                <w:color w:val="000000"/>
+                <w:sz w:val="20"/>
+                <w:szCs w:val="20"/>
+              </w:rPr>
+              <w:t>pakvista-dev (on Render)</w:t>
             </w:r>
           </w:p>
         </w:tc>
@@ -2216,23 +2129,13 @@
             <w:vAlign w:val="center"/>
           </w:tcPr>
           <w:p>
-            <w:proofErr w:type="spellStart"/>
-            <w:r>
-              <w:rPr>
-                <w:color w:val="000000"/>
-                <w:sz w:val="20"/>
-                <w:szCs w:val="20"/>
-              </w:rPr>
-              <w:t>pakvista</w:t>
-            </w:r>
-            <w:proofErr w:type="spellEnd"/>
-            <w:r>
-              <w:rPr>
-                <w:color w:val="000000"/>
-                <w:sz w:val="20"/>
-                <w:szCs w:val="20"/>
-              </w:rPr>
-              <w:t>-staging (on Render)</w:t>
+            <w:r>
+              <w:rPr>
+                <w:color w:val="000000"/>
+                <w:sz w:val="20"/>
+                <w:szCs w:val="20"/>
+              </w:rPr>
+              <w:t>pakvista-staging (on Render)</w:t>
             </w:r>
           </w:p>
         </w:tc>
@@ -2346,23 +2249,13 @@
             <w:vAlign w:val="center"/>
           </w:tcPr>
           <w:p>
-            <w:proofErr w:type="spellStart"/>
-            <w:r>
-              <w:rPr>
-                <w:color w:val="000000"/>
-                <w:sz w:val="20"/>
-                <w:szCs w:val="20"/>
-              </w:rPr>
-              <w:t>pakvista</w:t>
-            </w:r>
-            <w:proofErr w:type="spellEnd"/>
-            <w:r>
-              <w:rPr>
-                <w:color w:val="000000"/>
-                <w:sz w:val="20"/>
-                <w:szCs w:val="20"/>
-              </w:rPr>
-              <w:t>-prod (on Render)</w:t>
+            <w:r>
+              <w:rPr>
+                <w:color w:val="000000"/>
+                <w:sz w:val="20"/>
+                <w:szCs w:val="20"/>
+              </w:rPr>
+              <w:t>pakvista-prod (on Render)</w:t>
             </w:r>
           </w:p>
         </w:tc>
@@ -2377,21 +2270,7 @@
         <w:rPr>
           <w:color w:val="000000"/>
         </w:rPr>
-        <w:t xml:space="preserve">The Team Lead sets up the repository, </w:t>
-      </w:r>
-      <w:proofErr w:type="spellStart"/>
-      <w:r>
-        <w:rPr>
-          <w:color w:val="000000"/>
-        </w:rPr>
-        <w:t>Dockerfile</w:t>
-      </w:r>
-      <w:proofErr w:type="spellEnd"/>
-      <w:r>
-        <w:rPr>
-          <w:color w:val="000000"/>
-        </w:rPr>
-        <w:t>, shared stylesheet (style.css), and all six CI/CD workflow files. Each team member is individually responsible for building one destination page (HTML + CSS) and authoring one workflow file – either a CI or a CD workflow for any one environment.</w:t>
+        <w:t>The Team Lead sets up the repository, Dockerfile, shared stylesheet (style.css), and all six CI/CD workflow files. Each team member is individually responsible for building one destination page (HTML + CSS) and authoring one workflow file – either a CI or a CD workflow for any one environment.</w:t>
       </w:r>
     </w:p>
     <w:p/>
@@ -2400,15 +2279,7 @@
         <w:pStyle w:val="Heading2"/>
       </w:pPr>
       <w:r>
-        <w:t xml:space="preserve">Table 2: </w:t>
-      </w:r>
-      <w:proofErr w:type="spellStart"/>
-      <w:r>
-        <w:t>PakVista</w:t>
-      </w:r>
-      <w:proofErr w:type="spellEnd"/>
-      <w:r>
-        <w:t xml:space="preserve"> Page Assignment</w:t>
+        <w:t>Table 2: PakVista Page Assignment</w:t>
       </w:r>
     </w:p>
     <w:tbl>
@@ -2692,25 +2563,7 @@
                 <w:sz w:val="20"/>
                 <w:szCs w:val="20"/>
               </w:rPr>
-              <w:t xml:space="preserve">A welcoming landing page introducing </w:t>
-            </w:r>
-            <w:proofErr w:type="spellStart"/>
-            <w:r>
-              <w:rPr>
-                <w:color w:val="000000"/>
-                <w:sz w:val="20"/>
-                <w:szCs w:val="20"/>
-              </w:rPr>
-              <w:t>PakVista</w:t>
-            </w:r>
-            <w:proofErr w:type="spellEnd"/>
-            <w:r>
-              <w:rPr>
-                <w:color w:val="000000"/>
-                <w:sz w:val="20"/>
-                <w:szCs w:val="20"/>
-              </w:rPr>
-              <w:t>, with a hero section, a brief paragraph about Pakistan's tourism, and navigation links to all five destination pages.</w:t>
+              <w:t>A welcoming landing page introducing PakVista, with a hero section, a brief paragraph about Pakistan's tourism, and navigation links to all five destination pages.</w:t>
             </w:r>
           </w:p>
         </w:tc>
@@ -2960,61 +2813,7 @@
                 <w:sz w:val="20"/>
                 <w:szCs w:val="20"/>
               </w:rPr>
-              <w:t xml:space="preserve">Dedicated page for Hunza Valley covering </w:t>
-            </w:r>
-            <w:proofErr w:type="spellStart"/>
-            <w:r>
-              <w:rPr>
-                <w:color w:val="000000"/>
-                <w:sz w:val="20"/>
-                <w:szCs w:val="20"/>
-              </w:rPr>
-              <w:t>Rakaposhi</w:t>
-            </w:r>
-            <w:proofErr w:type="spellEnd"/>
-            <w:r>
-              <w:rPr>
-                <w:color w:val="000000"/>
-                <w:sz w:val="20"/>
-                <w:szCs w:val="20"/>
-              </w:rPr>
-              <w:t xml:space="preserve"> viewpoint, </w:t>
-            </w:r>
-            <w:proofErr w:type="spellStart"/>
-            <w:r>
-              <w:rPr>
-                <w:color w:val="000000"/>
-                <w:sz w:val="20"/>
-                <w:szCs w:val="20"/>
-              </w:rPr>
-              <w:t>Attabad</w:t>
-            </w:r>
-            <w:proofErr w:type="spellEnd"/>
-            <w:r>
-              <w:rPr>
-                <w:color w:val="000000"/>
-                <w:sz w:val="20"/>
-                <w:szCs w:val="20"/>
-              </w:rPr>
-              <w:t xml:space="preserve"> Lake, and </w:t>
-            </w:r>
-            <w:proofErr w:type="spellStart"/>
-            <w:r>
-              <w:rPr>
-                <w:color w:val="000000"/>
-                <w:sz w:val="20"/>
-                <w:szCs w:val="20"/>
-              </w:rPr>
-              <w:t>Baltit</w:t>
-            </w:r>
-            <w:proofErr w:type="spellEnd"/>
-            <w:r>
-              <w:rPr>
-                <w:color w:val="000000"/>
-                <w:sz w:val="20"/>
-                <w:szCs w:val="20"/>
-              </w:rPr>
-              <w:t xml:space="preserve"> Fort, with descriptive paragraphs and an HTML-only image placeholder section.</w:t>
+              <w:t>Dedicated page for Hunza Valley covering Rakaposhi viewpoint, Attabad Lake, and Baltit Fort, with descriptive paragraphs and an HTML-only image placeholder section.</w:t>
             </w:r>
           </w:p>
         </w:tc>
@@ -3139,25 +2938,7 @@
                 <w:sz w:val="20"/>
                 <w:szCs w:val="20"/>
               </w:rPr>
-              <w:t xml:space="preserve">Dedicated page for Karachi covering Clifton Beach, </w:t>
-            </w:r>
-            <w:proofErr w:type="spellStart"/>
-            <w:r>
-              <w:rPr>
-                <w:color w:val="000000"/>
-                <w:sz w:val="20"/>
-                <w:szCs w:val="20"/>
-              </w:rPr>
-              <w:t>Mohatta</w:t>
-            </w:r>
-            <w:proofErr w:type="spellEnd"/>
-            <w:r>
-              <w:rPr>
-                <w:color w:val="000000"/>
-                <w:sz w:val="20"/>
-                <w:szCs w:val="20"/>
-              </w:rPr>
-              <w:t xml:space="preserve"> Palace, and the Pakistan Maritime Museum, with descriptive paragraphs and an HTML-only image placeholder section.</w:t>
+              <w:t>Dedicated page for Karachi covering Clifton Beach, Mohatta Palace, and the Pakistan Maritime Museum, with descriptive paragraphs and an HTML-only image placeholder section.</w:t>
             </w:r>
           </w:p>
         </w:tc>
@@ -3536,6 +3317,7 @@
                 <w:sz w:val="20"/>
                 <w:szCs w:val="20"/>
               </w:rPr>
+              <w:lastRenderedPageBreak/>
               <w:t>1</w:t>
             </w:r>
           </w:p>
@@ -3567,42 +3349,8 @@
                 <w:sz w:val="20"/>
                 <w:szCs w:val="20"/>
               </w:rPr>
-              <w:t>.</w:t>
-            </w:r>
-            <w:proofErr w:type="spellStart"/>
-            <w:r>
-              <w:rPr>
-                <w:b/>
-                <w:bCs/>
-                <w:color w:val="000000"/>
-                <w:sz w:val="20"/>
-                <w:szCs w:val="20"/>
-              </w:rPr>
-              <w:t>github</w:t>
-            </w:r>
-            <w:proofErr w:type="spellEnd"/>
-            <w:r>
-              <w:rPr>
-                <w:b/>
-                <w:bCs/>
-                <w:color w:val="000000"/>
-                <w:sz w:val="20"/>
-                <w:szCs w:val="20"/>
-              </w:rPr>
-              <w:t>/workflows/ci-</w:t>
-            </w:r>
-            <w:proofErr w:type="spellStart"/>
-            <w:r>
-              <w:rPr>
-                <w:b/>
-                <w:bCs/>
-                <w:color w:val="000000"/>
-                <w:sz w:val="20"/>
-                <w:szCs w:val="20"/>
-              </w:rPr>
-              <w:t>dev.yml</w:t>
-            </w:r>
-            <w:proofErr w:type="spellEnd"/>
+              <w:t>.github/workflows/ci-dev.yml</w:t>
+            </w:r>
           </w:p>
         </w:tc>
         <w:tc>
@@ -3653,23 +3401,13 @@
             <w:vAlign w:val="center"/>
           </w:tcPr>
           <w:p>
-            <w:proofErr w:type="spellStart"/>
-            <w:r>
-              <w:rPr>
-                <w:color w:val="000000"/>
-                <w:sz w:val="20"/>
-                <w:szCs w:val="20"/>
-              </w:rPr>
-              <w:t>pull_request</w:t>
-            </w:r>
-            <w:proofErr w:type="spellEnd"/>
-            <w:r>
-              <w:rPr>
-                <w:color w:val="000000"/>
-                <w:sz w:val="20"/>
-                <w:szCs w:val="20"/>
-              </w:rPr>
-              <w:t xml:space="preserve"> → develop</w:t>
+            <w:r>
+              <w:rPr>
+                <w:color w:val="000000"/>
+                <w:sz w:val="20"/>
+                <w:szCs w:val="20"/>
+              </w:rPr>
+              <w:t>pull_request → develop</w:t>
             </w:r>
           </w:p>
         </w:tc>
@@ -3706,16 +3444,7 @@
                 <w:sz w:val="20"/>
                 <w:szCs w:val="20"/>
               </w:rPr>
-              <w:t xml:space="preserve"> HTML &amp; CSS Linting, Building with </w:t>
-            </w:r>
-            <w:r>
-              <w:rPr>
-                <w:color w:val="000000"/>
-                <w:sz w:val="20"/>
-                <w:szCs w:val="20"/>
-              </w:rPr>
-              <w:lastRenderedPageBreak/>
-              <w:t>Parcel,</w:t>
+              <w:t xml:space="preserve"> HTML &amp; CSS Linting, Building with Parcel,</w:t>
             </w:r>
             <w:r>
               <w:rPr>
@@ -3759,7 +3488,6 @@
                 <w:sz w:val="20"/>
                 <w:szCs w:val="20"/>
               </w:rPr>
-              <w:lastRenderedPageBreak/>
               <w:t>2</w:t>
             </w:r>
           </w:p>
@@ -3791,42 +3519,8 @@
                 <w:sz w:val="20"/>
                 <w:szCs w:val="20"/>
               </w:rPr>
-              <w:t>.</w:t>
-            </w:r>
-            <w:proofErr w:type="spellStart"/>
-            <w:r>
-              <w:rPr>
-                <w:b/>
-                <w:bCs/>
-                <w:color w:val="000000"/>
-                <w:sz w:val="20"/>
-                <w:szCs w:val="20"/>
-              </w:rPr>
-              <w:t>github</w:t>
-            </w:r>
-            <w:proofErr w:type="spellEnd"/>
-            <w:r>
-              <w:rPr>
-                <w:b/>
-                <w:bCs/>
-                <w:color w:val="000000"/>
-                <w:sz w:val="20"/>
-                <w:szCs w:val="20"/>
-              </w:rPr>
-              <w:t>/workflows/cd-</w:t>
-            </w:r>
-            <w:proofErr w:type="spellStart"/>
-            <w:r>
-              <w:rPr>
-                <w:b/>
-                <w:bCs/>
-                <w:color w:val="000000"/>
-                <w:sz w:val="20"/>
-                <w:szCs w:val="20"/>
-              </w:rPr>
-              <w:t>dev.yml</w:t>
-            </w:r>
-            <w:proofErr w:type="spellEnd"/>
+              <w:t>.github/workflows/cd-dev.yml</w:t>
+            </w:r>
           </w:p>
         </w:tc>
         <w:tc>
@@ -3979,42 +3673,8 @@
                 <w:sz w:val="20"/>
                 <w:szCs w:val="20"/>
               </w:rPr>
-              <w:t>.</w:t>
-            </w:r>
-            <w:proofErr w:type="spellStart"/>
-            <w:r>
-              <w:rPr>
-                <w:b/>
-                <w:bCs/>
-                <w:color w:val="000000"/>
-                <w:sz w:val="20"/>
-                <w:szCs w:val="20"/>
-              </w:rPr>
-              <w:t>github</w:t>
-            </w:r>
-            <w:proofErr w:type="spellEnd"/>
-            <w:r>
-              <w:rPr>
-                <w:b/>
-                <w:bCs/>
-                <w:color w:val="000000"/>
-                <w:sz w:val="20"/>
-                <w:szCs w:val="20"/>
-              </w:rPr>
-              <w:t>/workflows/ci-</w:t>
-            </w:r>
-            <w:proofErr w:type="spellStart"/>
-            <w:r>
-              <w:rPr>
-                <w:b/>
-                <w:bCs/>
-                <w:color w:val="000000"/>
-                <w:sz w:val="20"/>
-                <w:szCs w:val="20"/>
-              </w:rPr>
-              <w:t>staging.yml</w:t>
-            </w:r>
-            <w:proofErr w:type="spellEnd"/>
+              <w:t>.github/workflows/ci-staging.yml</w:t>
+            </w:r>
           </w:p>
         </w:tc>
         <w:tc>
@@ -4065,23 +3725,13 @@
             <w:vAlign w:val="center"/>
           </w:tcPr>
           <w:p>
-            <w:proofErr w:type="spellStart"/>
-            <w:r>
-              <w:rPr>
-                <w:color w:val="000000"/>
-                <w:sz w:val="20"/>
-                <w:szCs w:val="20"/>
-              </w:rPr>
-              <w:t>pull_request</w:t>
-            </w:r>
-            <w:proofErr w:type="spellEnd"/>
-            <w:r>
-              <w:rPr>
-                <w:color w:val="000000"/>
-                <w:sz w:val="20"/>
-                <w:szCs w:val="20"/>
-              </w:rPr>
-              <w:t xml:space="preserve"> → staging</w:t>
+            <w:r>
+              <w:rPr>
+                <w:color w:val="000000"/>
+                <w:sz w:val="20"/>
+                <w:szCs w:val="20"/>
+              </w:rPr>
+              <w:t>pull_request → staging</w:t>
             </w:r>
           </w:p>
         </w:tc>
@@ -4193,42 +3843,8 @@
                 <w:sz w:val="20"/>
                 <w:szCs w:val="20"/>
               </w:rPr>
-              <w:t>.</w:t>
-            </w:r>
-            <w:proofErr w:type="spellStart"/>
-            <w:r>
-              <w:rPr>
-                <w:b/>
-                <w:bCs/>
-                <w:color w:val="000000"/>
-                <w:sz w:val="20"/>
-                <w:szCs w:val="20"/>
-              </w:rPr>
-              <w:t>github</w:t>
-            </w:r>
-            <w:proofErr w:type="spellEnd"/>
-            <w:r>
-              <w:rPr>
-                <w:b/>
-                <w:bCs/>
-                <w:color w:val="000000"/>
-                <w:sz w:val="20"/>
-                <w:szCs w:val="20"/>
-              </w:rPr>
-              <w:t>/workflows/cd-</w:t>
-            </w:r>
-            <w:proofErr w:type="spellStart"/>
-            <w:r>
-              <w:rPr>
-                <w:b/>
-                <w:bCs/>
-                <w:color w:val="000000"/>
-                <w:sz w:val="20"/>
-                <w:szCs w:val="20"/>
-              </w:rPr>
-              <w:t>staging.yml</w:t>
-            </w:r>
-            <w:proofErr w:type="spellEnd"/>
+              <w:t>.github/workflows/cd-staging.yml</w:t>
+            </w:r>
           </w:p>
         </w:tc>
         <w:tc>
@@ -4381,42 +3997,8 @@
                 <w:sz w:val="20"/>
                 <w:szCs w:val="20"/>
               </w:rPr>
-              <w:t>.</w:t>
-            </w:r>
-            <w:proofErr w:type="spellStart"/>
-            <w:r>
-              <w:rPr>
-                <w:b/>
-                <w:bCs/>
-                <w:color w:val="000000"/>
-                <w:sz w:val="20"/>
-                <w:szCs w:val="20"/>
-              </w:rPr>
-              <w:t>github</w:t>
-            </w:r>
-            <w:proofErr w:type="spellEnd"/>
-            <w:r>
-              <w:rPr>
-                <w:b/>
-                <w:bCs/>
-                <w:color w:val="000000"/>
-                <w:sz w:val="20"/>
-                <w:szCs w:val="20"/>
-              </w:rPr>
-              <w:t>/workflows/ci-</w:t>
-            </w:r>
-            <w:proofErr w:type="spellStart"/>
-            <w:r>
-              <w:rPr>
-                <w:b/>
-                <w:bCs/>
-                <w:color w:val="000000"/>
-                <w:sz w:val="20"/>
-                <w:szCs w:val="20"/>
-              </w:rPr>
-              <w:t>prod.yml</w:t>
-            </w:r>
-            <w:proofErr w:type="spellEnd"/>
+              <w:t>.github/workflows/ci-prod.yml</w:t>
+            </w:r>
           </w:p>
         </w:tc>
         <w:tc>
@@ -4467,23 +4049,13 @@
             <w:vAlign w:val="center"/>
           </w:tcPr>
           <w:p>
-            <w:proofErr w:type="spellStart"/>
-            <w:r>
-              <w:rPr>
-                <w:color w:val="000000"/>
-                <w:sz w:val="20"/>
-                <w:szCs w:val="20"/>
-              </w:rPr>
-              <w:t>pull_request</w:t>
-            </w:r>
-            <w:proofErr w:type="spellEnd"/>
-            <w:r>
-              <w:rPr>
-                <w:color w:val="000000"/>
-                <w:sz w:val="20"/>
-                <w:szCs w:val="20"/>
-              </w:rPr>
-              <w:t xml:space="preserve"> → main</w:t>
+            <w:r>
+              <w:rPr>
+                <w:color w:val="000000"/>
+                <w:sz w:val="20"/>
+                <w:szCs w:val="20"/>
+              </w:rPr>
+              <w:t>pull_request → main</w:t>
             </w:r>
           </w:p>
         </w:tc>
@@ -4595,42 +4167,8 @@
                 <w:sz w:val="20"/>
                 <w:szCs w:val="20"/>
               </w:rPr>
-              <w:t>.</w:t>
-            </w:r>
-            <w:proofErr w:type="spellStart"/>
-            <w:r>
-              <w:rPr>
-                <w:b/>
-                <w:bCs/>
-                <w:color w:val="000000"/>
-                <w:sz w:val="20"/>
-                <w:szCs w:val="20"/>
-              </w:rPr>
-              <w:t>github</w:t>
-            </w:r>
-            <w:proofErr w:type="spellEnd"/>
-            <w:r>
-              <w:rPr>
-                <w:b/>
-                <w:bCs/>
-                <w:color w:val="000000"/>
-                <w:sz w:val="20"/>
-                <w:szCs w:val="20"/>
-              </w:rPr>
-              <w:t>/workflows/cd-</w:t>
-            </w:r>
-            <w:proofErr w:type="spellStart"/>
-            <w:r>
-              <w:rPr>
-                <w:b/>
-                <w:bCs/>
-                <w:color w:val="000000"/>
-                <w:sz w:val="20"/>
-                <w:szCs w:val="20"/>
-              </w:rPr>
-              <w:t>prod.yml</w:t>
-            </w:r>
-            <w:proofErr w:type="spellEnd"/>
+              <w:t>.github/workflows/cd-prod.yml</w:t>
+            </w:r>
           </w:p>
         </w:tc>
         <w:tc>
@@ -4739,21 +4277,7 @@
         <w:rPr>
           <w:color w:val="000000"/>
         </w:rPr>
-        <w:t xml:space="preserve">Each team member independently follows the complete </w:t>
-      </w:r>
-      <w:proofErr w:type="spellStart"/>
-      <w:r>
-        <w:rPr>
-          <w:color w:val="000000"/>
-        </w:rPr>
-        <w:t>GitFlow</w:t>
-      </w:r>
-      <w:proofErr w:type="spellEnd"/>
-      <w:r>
-        <w:rPr>
-          <w:color w:val="000000"/>
-        </w:rPr>
-        <w:t xml:space="preserve"> for their assigned page and workflow file:</w:t>
+        <w:t>Each team member independently follows the complete GitFlow for their assigned page and workflow file:</w:t>
       </w:r>
     </w:p>
     <w:p>
@@ -4786,47 +4310,7 @@
           <w:sz w:val="20"/>
           <w:szCs w:val="20"/>
         </w:rPr>
-        <w:t>feature/&lt;</w:t>
-      </w:r>
-      <w:proofErr w:type="spellStart"/>
-      <w:r>
-        <w:rPr>
-          <w:rFonts w:ascii="Courier New" w:eastAsia="Courier New" w:hAnsi="Courier New" w:cs="Courier New"/>
-          <w:color w:val="C7254E"/>
-          <w:sz w:val="20"/>
-          <w:szCs w:val="20"/>
-        </w:rPr>
-        <w:t>github</w:t>
-      </w:r>
-      <w:proofErr w:type="spellEnd"/>
-      <w:r>
-        <w:rPr>
-          <w:rFonts w:ascii="Courier New" w:eastAsia="Courier New" w:hAnsi="Courier New" w:cs="Courier New"/>
-          <w:color w:val="C7254E"/>
-          <w:sz w:val="20"/>
-          <w:szCs w:val="20"/>
-        </w:rPr>
-        <w:t>-username&gt;/&lt;page-name&gt;   (e.g., feature/sara-malik/</w:t>
-      </w:r>
-      <w:proofErr w:type="spellStart"/>
-      <w:r>
-        <w:rPr>
-          <w:rFonts w:ascii="Courier New" w:eastAsia="Courier New" w:hAnsi="Courier New" w:cs="Courier New"/>
-          <w:color w:val="C7254E"/>
-          <w:sz w:val="20"/>
-          <w:szCs w:val="20"/>
-        </w:rPr>
-        <w:t>lahore</w:t>
-      </w:r>
-      <w:proofErr w:type="spellEnd"/>
-      <w:r>
-        <w:rPr>
-          <w:rFonts w:ascii="Courier New" w:eastAsia="Courier New" w:hAnsi="Courier New" w:cs="Courier New"/>
-          <w:color w:val="C7254E"/>
-          <w:sz w:val="20"/>
-          <w:szCs w:val="20"/>
-        </w:rPr>
-        <w:t>)</w:t>
+        <w:t>feature/&lt;github-username&gt;/&lt;page-name&gt;   (e.g., feature/sara-malik/lahore)</w:t>
       </w:r>
     </w:p>
     <w:p>
@@ -4858,21 +4342,7 @@
         <w:rPr>
           <w:color w:val="000000"/>
         </w:rPr>
-        <w:t>Author the assigned workflow file (Table 3) in .</w:t>
-      </w:r>
-      <w:proofErr w:type="spellStart"/>
-      <w:r>
-        <w:rPr>
-          <w:color w:val="000000"/>
-        </w:rPr>
-        <w:t>github</w:t>
-      </w:r>
-      <w:proofErr w:type="spellEnd"/>
-      <w:r>
-        <w:rPr>
-          <w:color w:val="000000"/>
-        </w:rPr>
-        <w:t>/workflows/. The workflow must be syntactically correct YAML.</w:t>
+        <w:t>Author the assigned workflow file (Table 3) in .github/workflows/. The workflow must be syntactically correct YAML.</w:t>
       </w:r>
     </w:p>
     <w:p>
@@ -4904,21 +4374,7 @@
         <w:rPr>
           <w:color w:val="000000"/>
         </w:rPr>
-        <w:t>Open a Pull Request (PR) targeting the develop branch. The CI workflow for the development environment (ci-</w:t>
-      </w:r>
-      <w:proofErr w:type="spellStart"/>
-      <w:r>
-        <w:rPr>
-          <w:color w:val="000000"/>
-        </w:rPr>
-        <w:t>dev.yml</w:t>
-      </w:r>
-      <w:proofErr w:type="spellEnd"/>
-      <w:r>
-        <w:rPr>
-          <w:color w:val="000000"/>
-        </w:rPr>
-        <w:t>) fires automatically. Verify all steps pass.</w:t>
+        <w:t>Open a Pull Request (PR) targeting the develop branch. The CI workflow for the development environment (ci-dev.yml) fires automatically. Verify all steps pass.</w:t>
       </w:r>
     </w:p>
     <w:p>
@@ -4934,21 +4390,7 @@
         <w:rPr>
           <w:color w:val="000000"/>
         </w:rPr>
-        <w:t>Request a review from the Team Lead. Once CI passes and the PR is approved, the Team Lead merges it. The merge triggers the CD pipeline (cd-</w:t>
-      </w:r>
-      <w:proofErr w:type="spellStart"/>
-      <w:r>
-        <w:rPr>
-          <w:color w:val="000000"/>
-        </w:rPr>
-        <w:t>dev.yml</w:t>
-      </w:r>
-      <w:proofErr w:type="spellEnd"/>
-      <w:r>
-        <w:rPr>
-          <w:color w:val="000000"/>
-        </w:rPr>
-        <w:t>) and deploys the updated site to the Render development service.</w:t>
+        <w:t>Request a review from the Team Lead. Once CI passes and the PR is approved, the Team Lead merges it. The merge triggers the CD pipeline (cd-dev.yml) and deploys the updated site to the Render development service.</w:t>
       </w:r>
     </w:p>
     <w:p/>
@@ -4974,87 +4416,7 @@
           <w:sz w:val="19"/>
           <w:szCs w:val="19"/>
         </w:rPr>
-        <w:t>Feature Branch → PR to develop → ci-</w:t>
-      </w:r>
-      <w:proofErr w:type="spellStart"/>
-      <w:r>
-        <w:rPr>
-          <w:rFonts w:ascii="Courier New" w:eastAsia="Courier New" w:hAnsi="Courier New" w:cs="Courier New"/>
-          <w:color w:val="1F3864"/>
-          <w:sz w:val="19"/>
-          <w:szCs w:val="19"/>
-        </w:rPr>
-        <w:t>dev.yml</w:t>
-      </w:r>
-      <w:proofErr w:type="spellEnd"/>
-      <w:r>
-        <w:rPr>
-          <w:rFonts w:ascii="Courier New" w:eastAsia="Courier New" w:hAnsi="Courier New" w:cs="Courier New"/>
-          <w:color w:val="1F3864"/>
-          <w:sz w:val="19"/>
-          <w:szCs w:val="19"/>
-        </w:rPr>
-        <w:t xml:space="preserve"> builds &amp; pushes :dev-latest → PR merged → push on develop → cd-</w:t>
-      </w:r>
-      <w:proofErr w:type="spellStart"/>
-      <w:r>
-        <w:rPr>
-          <w:rFonts w:ascii="Courier New" w:eastAsia="Courier New" w:hAnsi="Courier New" w:cs="Courier New"/>
-          <w:color w:val="1F3864"/>
-          <w:sz w:val="19"/>
-          <w:szCs w:val="19"/>
-        </w:rPr>
-        <w:t>dev.yml</w:t>
-      </w:r>
-      <w:proofErr w:type="spellEnd"/>
-      <w:r>
-        <w:rPr>
-          <w:rFonts w:ascii="Courier New" w:eastAsia="Courier New" w:hAnsi="Courier New" w:cs="Courier New"/>
-          <w:color w:val="1F3864"/>
-          <w:sz w:val="19"/>
-          <w:szCs w:val="19"/>
-        </w:rPr>
-        <w:t xml:space="preserve"> deploys to </w:t>
-      </w:r>
-      <w:proofErr w:type="spellStart"/>
-      <w:r>
-        <w:rPr>
-          <w:rFonts w:ascii="Courier New" w:eastAsia="Courier New" w:hAnsi="Courier New" w:cs="Courier New"/>
-          <w:color w:val="1F3864"/>
-          <w:sz w:val="19"/>
-          <w:szCs w:val="19"/>
-        </w:rPr>
-        <w:t>pakvista</w:t>
-      </w:r>
-      <w:proofErr w:type="spellEnd"/>
-      <w:r>
-        <w:rPr>
-          <w:rFonts w:ascii="Courier New" w:eastAsia="Courier New" w:hAnsi="Courier New" w:cs="Courier New"/>
-          <w:color w:val="1F3864"/>
-          <w:sz w:val="19"/>
-          <w:szCs w:val="19"/>
-        </w:rPr>
-        <w:t xml:space="preserve">-dev on Render → Live </w:t>
-      </w:r>
-      <w:proofErr w:type="spellStart"/>
-      <w:r>
-        <w:rPr>
-          <w:rFonts w:ascii="Courier New" w:eastAsia="Courier New" w:hAnsi="Courier New" w:cs="Courier New"/>
-          <w:color w:val="1F3864"/>
-          <w:sz w:val="19"/>
-          <w:szCs w:val="19"/>
-        </w:rPr>
-        <w:t>PakVista</w:t>
-      </w:r>
-      <w:proofErr w:type="spellEnd"/>
-      <w:r>
-        <w:rPr>
-          <w:rFonts w:ascii="Courier New" w:eastAsia="Courier New" w:hAnsi="Courier New" w:cs="Courier New"/>
-          <w:color w:val="1F3864"/>
-          <w:sz w:val="19"/>
-          <w:szCs w:val="19"/>
-        </w:rPr>
-        <w:t xml:space="preserve"> Development updated.</w:t>
+        <w:t>Feature Branch → PR to develop → ci-dev.yml builds &amp; pushes :dev-latest → PR merged → push on develop → cd-dev.yml deploys to pakvista-dev on Render → Live PakVista Development updated.</w:t>
       </w:r>
     </w:p>
     <w:p/>
@@ -5105,21 +4467,7 @@
         <w:rPr>
           <w:color w:val="000000"/>
         </w:rPr>
-        <w:t xml:space="preserve">Create a new public GitHub repository named </w:t>
-      </w:r>
-      <w:proofErr w:type="spellStart"/>
-      <w:r>
-        <w:rPr>
-          <w:color w:val="000000"/>
-        </w:rPr>
-        <w:t>pakvista-cicd</w:t>
-      </w:r>
-      <w:proofErr w:type="spellEnd"/>
-      <w:r>
-        <w:rPr>
-          <w:color w:val="000000"/>
-        </w:rPr>
-        <w:t xml:space="preserve"> (or a name agreed by the team). Do NOT clone or fork any existing repository.</w:t>
+        <w:t>Create a new public GitHub repository named pakvista-cicd (or a name agreed by the team). Do NOT clone or fork any existing repository.</w:t>
       </w:r>
     </w:p>
     <w:p>
@@ -5450,27 +4798,15 @@
             <w:vAlign w:val="center"/>
           </w:tcPr>
           <w:p>
-            <w:proofErr w:type="spellStart"/>
-            <w:r>
-              <w:rPr>
-                <w:b/>
-                <w:bCs/>
-                <w:color w:val="000000"/>
-                <w:sz w:val="20"/>
-                <w:szCs w:val="20"/>
-              </w:rPr>
-              <w:t>pakvista</w:t>
-            </w:r>
-            <w:proofErr w:type="spellEnd"/>
-            <w:r>
-              <w:rPr>
-                <w:b/>
-                <w:bCs/>
-                <w:color w:val="000000"/>
-                <w:sz w:val="20"/>
-                <w:szCs w:val="20"/>
-              </w:rPr>
-              <w:t>-dev</w:t>
+            <w:r>
+              <w:rPr>
+                <w:b/>
+                <w:bCs/>
+                <w:color w:val="000000"/>
+                <w:sz w:val="20"/>
+                <w:szCs w:val="20"/>
+              </w:rPr>
+              <w:t>pakvista-dev</w:t>
             </w:r>
           </w:p>
         </w:tc>
@@ -5582,27 +4918,15 @@
             <w:vAlign w:val="center"/>
           </w:tcPr>
           <w:p>
-            <w:proofErr w:type="spellStart"/>
-            <w:r>
-              <w:rPr>
-                <w:b/>
-                <w:bCs/>
-                <w:color w:val="000000"/>
-                <w:sz w:val="20"/>
-                <w:szCs w:val="20"/>
-              </w:rPr>
-              <w:t>pakvista</w:t>
-            </w:r>
-            <w:proofErr w:type="spellEnd"/>
-            <w:r>
-              <w:rPr>
-                <w:b/>
-                <w:bCs/>
-                <w:color w:val="000000"/>
-                <w:sz w:val="20"/>
-                <w:szCs w:val="20"/>
-              </w:rPr>
-              <w:t>-staging</w:t>
+            <w:r>
+              <w:rPr>
+                <w:b/>
+                <w:bCs/>
+                <w:color w:val="000000"/>
+                <w:sz w:val="20"/>
+                <w:szCs w:val="20"/>
+              </w:rPr>
+              <w:t>pakvista-staging</w:t>
             </w:r>
           </w:p>
         </w:tc>
@@ -5714,27 +5038,15 @@
             <w:vAlign w:val="center"/>
           </w:tcPr>
           <w:p>
-            <w:proofErr w:type="spellStart"/>
-            <w:r>
-              <w:rPr>
-                <w:b/>
-                <w:bCs/>
-                <w:color w:val="000000"/>
-                <w:sz w:val="20"/>
-                <w:szCs w:val="20"/>
-              </w:rPr>
-              <w:t>pakvista</w:t>
-            </w:r>
-            <w:proofErr w:type="spellEnd"/>
-            <w:r>
-              <w:rPr>
-                <w:b/>
-                <w:bCs/>
-                <w:color w:val="000000"/>
-                <w:sz w:val="20"/>
-                <w:szCs w:val="20"/>
-              </w:rPr>
-              <w:t>-prod</w:t>
+            <w:r>
+              <w:rPr>
+                <w:b/>
+                <w:bCs/>
+                <w:color w:val="000000"/>
+                <w:sz w:val="20"/>
+                <w:szCs w:val="20"/>
+              </w:rPr>
+              <w:t>pakvista-prod</w:t>
             </w:r>
           </w:p>
         </w:tc>
@@ -5990,23 +5302,13 @@
             <w:vAlign w:val="center"/>
           </w:tcPr>
           <w:p>
-            <w:proofErr w:type="spellStart"/>
-            <w:r>
-              <w:rPr>
-                <w:color w:val="000000"/>
-                <w:sz w:val="20"/>
-                <w:szCs w:val="20"/>
-              </w:rPr>
-              <w:t>PakVista</w:t>
-            </w:r>
-            <w:proofErr w:type="spellEnd"/>
-            <w:r>
-              <w:rPr>
-                <w:color w:val="000000"/>
-                <w:sz w:val="20"/>
-                <w:szCs w:val="20"/>
-              </w:rPr>
-              <w:t xml:space="preserve"> Home / Welcome page – created by Member 1 (Team Lead)</w:t>
+            <w:r>
+              <w:rPr>
+                <w:color w:val="000000"/>
+                <w:sz w:val="20"/>
+                <w:szCs w:val="20"/>
+              </w:rPr>
+              <w:t>PakVista Home / Welcome page – created by Member 1 (Team Lead)</w:t>
             </w:r>
           </w:p>
         </w:tc>
@@ -6342,7 +5644,6 @@
             <w:vAlign w:val="center"/>
           </w:tcPr>
           <w:p>
-            <w:proofErr w:type="spellStart"/>
             <w:r>
               <w:rPr>
                 <w:b/>
@@ -6353,7 +5654,6 @@
               </w:rPr>
               <w:t>Dockerfile</w:t>
             </w:r>
-            <w:proofErr w:type="spellEnd"/>
           </w:p>
         </w:tc>
         <w:tc>
@@ -6381,61 +5681,7 @@
                 <w:sz w:val="20"/>
                 <w:szCs w:val="20"/>
               </w:rPr>
-              <w:t xml:space="preserve">Multi-stage </w:t>
-            </w:r>
-            <w:proofErr w:type="spellStart"/>
-            <w:r>
-              <w:rPr>
-                <w:color w:val="000000"/>
-                <w:sz w:val="20"/>
-                <w:szCs w:val="20"/>
-              </w:rPr>
-              <w:t>Dockerfile</w:t>
-            </w:r>
-            <w:proofErr w:type="spellEnd"/>
-            <w:r>
-              <w:rPr>
-                <w:color w:val="000000"/>
-                <w:sz w:val="20"/>
-                <w:szCs w:val="20"/>
-              </w:rPr>
-              <w:t xml:space="preserve"> to </w:t>
-            </w:r>
-            <w:proofErr w:type="spellStart"/>
-            <w:r>
-              <w:rPr>
-                <w:color w:val="000000"/>
-                <w:sz w:val="20"/>
-                <w:szCs w:val="20"/>
-              </w:rPr>
-              <w:t>containerise</w:t>
-            </w:r>
-            <w:proofErr w:type="spellEnd"/>
-            <w:r>
-              <w:rPr>
-                <w:color w:val="000000"/>
-                <w:sz w:val="20"/>
-                <w:szCs w:val="20"/>
-              </w:rPr>
-              <w:t xml:space="preserve"> the application (</w:t>
-            </w:r>
-            <w:proofErr w:type="spellStart"/>
-            <w:r>
-              <w:rPr>
-                <w:color w:val="000000"/>
-                <w:sz w:val="20"/>
-                <w:szCs w:val="20"/>
-              </w:rPr>
-              <w:t>nginx:alpine-based</w:t>
-            </w:r>
-            <w:proofErr w:type="spellEnd"/>
-            <w:r>
-              <w:rPr>
-                <w:color w:val="000000"/>
-                <w:sz w:val="20"/>
-                <w:szCs w:val="20"/>
-              </w:rPr>
-              <w:t>)</w:t>
+              <w:t>Multi-stage Dockerfile to containerise the application (nginx:alpine-based)</w:t>
             </w:r>
           </w:p>
         </w:tc>
@@ -6468,42 +5714,8 @@
                 <w:sz w:val="20"/>
                 <w:szCs w:val="20"/>
               </w:rPr>
-              <w:t>.</w:t>
-            </w:r>
-            <w:proofErr w:type="spellStart"/>
-            <w:r>
-              <w:rPr>
-                <w:b/>
-                <w:bCs/>
-                <w:color w:val="000000"/>
-                <w:sz w:val="20"/>
-                <w:szCs w:val="20"/>
-              </w:rPr>
-              <w:t>github</w:t>
-            </w:r>
-            <w:proofErr w:type="spellEnd"/>
-            <w:r>
-              <w:rPr>
-                <w:b/>
-                <w:bCs/>
-                <w:color w:val="000000"/>
-                <w:sz w:val="20"/>
-                <w:szCs w:val="20"/>
-              </w:rPr>
-              <w:t>/workflows/ci-</w:t>
-            </w:r>
-            <w:proofErr w:type="spellStart"/>
-            <w:r>
-              <w:rPr>
-                <w:b/>
-                <w:bCs/>
-                <w:color w:val="000000"/>
-                <w:sz w:val="20"/>
-                <w:szCs w:val="20"/>
-              </w:rPr>
-              <w:t>dev.yml</w:t>
-            </w:r>
-            <w:proofErr w:type="spellEnd"/>
+              <w:t>.github/workflows/ci-dev.yml</w:t>
+            </w:r>
           </w:p>
         </w:tc>
         <w:tc>
@@ -6531,25 +5743,7 @@
                 <w:sz w:val="20"/>
                 <w:szCs w:val="20"/>
               </w:rPr>
-              <w:t xml:space="preserve">CI workflow for Development – triggered on </w:t>
-            </w:r>
-            <w:proofErr w:type="spellStart"/>
-            <w:r>
-              <w:rPr>
-                <w:color w:val="000000"/>
-                <w:sz w:val="20"/>
-                <w:szCs w:val="20"/>
-              </w:rPr>
-              <w:t>pull_request</w:t>
-            </w:r>
-            <w:proofErr w:type="spellEnd"/>
-            <w:r>
-              <w:rPr>
-                <w:color w:val="000000"/>
-                <w:sz w:val="20"/>
-                <w:szCs w:val="20"/>
-              </w:rPr>
-              <w:t xml:space="preserve"> targeting develop</w:t>
+              <w:t>CI workflow for Development – triggered on pull_request targeting develop</w:t>
             </w:r>
           </w:p>
         </w:tc>
@@ -6582,42 +5776,8 @@
                 <w:sz w:val="20"/>
                 <w:szCs w:val="20"/>
               </w:rPr>
-              <w:t>.</w:t>
-            </w:r>
-            <w:proofErr w:type="spellStart"/>
-            <w:r>
-              <w:rPr>
-                <w:b/>
-                <w:bCs/>
-                <w:color w:val="000000"/>
-                <w:sz w:val="20"/>
-                <w:szCs w:val="20"/>
-              </w:rPr>
-              <w:t>github</w:t>
-            </w:r>
-            <w:proofErr w:type="spellEnd"/>
-            <w:r>
-              <w:rPr>
-                <w:b/>
-                <w:bCs/>
-                <w:color w:val="000000"/>
-                <w:sz w:val="20"/>
-                <w:szCs w:val="20"/>
-              </w:rPr>
-              <w:t>/workflows/cd-</w:t>
-            </w:r>
-            <w:proofErr w:type="spellStart"/>
-            <w:r>
-              <w:rPr>
-                <w:b/>
-                <w:bCs/>
-                <w:color w:val="000000"/>
-                <w:sz w:val="20"/>
-                <w:szCs w:val="20"/>
-              </w:rPr>
-              <w:t>dev.yml</w:t>
-            </w:r>
-            <w:proofErr w:type="spellEnd"/>
+              <w:t>.github/workflows/cd-dev.yml</w:t>
+            </w:r>
           </w:p>
         </w:tc>
         <w:tc>
@@ -6678,42 +5838,8 @@
                 <w:sz w:val="20"/>
                 <w:szCs w:val="20"/>
               </w:rPr>
-              <w:t>.</w:t>
-            </w:r>
-            <w:proofErr w:type="spellStart"/>
-            <w:r>
-              <w:rPr>
-                <w:b/>
-                <w:bCs/>
-                <w:color w:val="000000"/>
-                <w:sz w:val="20"/>
-                <w:szCs w:val="20"/>
-              </w:rPr>
-              <w:t>github</w:t>
-            </w:r>
-            <w:proofErr w:type="spellEnd"/>
-            <w:r>
-              <w:rPr>
-                <w:b/>
-                <w:bCs/>
-                <w:color w:val="000000"/>
-                <w:sz w:val="20"/>
-                <w:szCs w:val="20"/>
-              </w:rPr>
-              <w:t>/workflows/ci-</w:t>
-            </w:r>
-            <w:proofErr w:type="spellStart"/>
-            <w:r>
-              <w:rPr>
-                <w:b/>
-                <w:bCs/>
-                <w:color w:val="000000"/>
-                <w:sz w:val="20"/>
-                <w:szCs w:val="20"/>
-              </w:rPr>
-              <w:t>staging.yml</w:t>
-            </w:r>
-            <w:proofErr w:type="spellEnd"/>
+              <w:t>.github/workflows/ci-staging.yml</w:t>
+            </w:r>
           </w:p>
         </w:tc>
         <w:tc>
@@ -6741,25 +5867,7 @@
                 <w:sz w:val="20"/>
                 <w:szCs w:val="20"/>
               </w:rPr>
-              <w:t xml:space="preserve">CI workflow for Staging – triggered on </w:t>
-            </w:r>
-            <w:proofErr w:type="spellStart"/>
-            <w:r>
-              <w:rPr>
-                <w:color w:val="000000"/>
-                <w:sz w:val="20"/>
-                <w:szCs w:val="20"/>
-              </w:rPr>
-              <w:t>pull_request</w:t>
-            </w:r>
-            <w:proofErr w:type="spellEnd"/>
-            <w:r>
-              <w:rPr>
-                <w:color w:val="000000"/>
-                <w:sz w:val="20"/>
-                <w:szCs w:val="20"/>
-              </w:rPr>
-              <w:t xml:space="preserve"> targeting staging</w:t>
+              <w:t>CI workflow for Staging – triggered on pull_request targeting staging</w:t>
             </w:r>
           </w:p>
         </w:tc>
@@ -6792,42 +5900,8 @@
                 <w:sz w:val="20"/>
                 <w:szCs w:val="20"/>
               </w:rPr>
-              <w:t>.</w:t>
-            </w:r>
-            <w:proofErr w:type="spellStart"/>
-            <w:r>
-              <w:rPr>
-                <w:b/>
-                <w:bCs/>
-                <w:color w:val="000000"/>
-                <w:sz w:val="20"/>
-                <w:szCs w:val="20"/>
-              </w:rPr>
-              <w:t>github</w:t>
-            </w:r>
-            <w:proofErr w:type="spellEnd"/>
-            <w:r>
-              <w:rPr>
-                <w:b/>
-                <w:bCs/>
-                <w:color w:val="000000"/>
-                <w:sz w:val="20"/>
-                <w:szCs w:val="20"/>
-              </w:rPr>
-              <w:t>/workflows/cd-</w:t>
-            </w:r>
-            <w:proofErr w:type="spellStart"/>
-            <w:r>
-              <w:rPr>
-                <w:b/>
-                <w:bCs/>
-                <w:color w:val="000000"/>
-                <w:sz w:val="20"/>
-                <w:szCs w:val="20"/>
-              </w:rPr>
-              <w:t>staging.yml</w:t>
-            </w:r>
-            <w:proofErr w:type="spellEnd"/>
+              <w:t>.github/workflows/cd-staging.yml</w:t>
+            </w:r>
           </w:p>
         </w:tc>
         <w:tc>
@@ -6888,42 +5962,8 @@
                 <w:sz w:val="20"/>
                 <w:szCs w:val="20"/>
               </w:rPr>
-              <w:t>.</w:t>
-            </w:r>
-            <w:proofErr w:type="spellStart"/>
-            <w:r>
-              <w:rPr>
-                <w:b/>
-                <w:bCs/>
-                <w:color w:val="000000"/>
-                <w:sz w:val="20"/>
-                <w:szCs w:val="20"/>
-              </w:rPr>
-              <w:t>github</w:t>
-            </w:r>
-            <w:proofErr w:type="spellEnd"/>
-            <w:r>
-              <w:rPr>
-                <w:b/>
-                <w:bCs/>
-                <w:color w:val="000000"/>
-                <w:sz w:val="20"/>
-                <w:szCs w:val="20"/>
-              </w:rPr>
-              <w:t>/workflows/ci-</w:t>
-            </w:r>
-            <w:proofErr w:type="spellStart"/>
-            <w:r>
-              <w:rPr>
-                <w:b/>
-                <w:bCs/>
-                <w:color w:val="000000"/>
-                <w:sz w:val="20"/>
-                <w:szCs w:val="20"/>
-              </w:rPr>
-              <w:t>prod.yml</w:t>
-            </w:r>
-            <w:proofErr w:type="spellEnd"/>
+              <w:t>.github/workflows/ci-prod.yml</w:t>
+            </w:r>
           </w:p>
         </w:tc>
         <w:tc>
@@ -6951,25 +5991,7 @@
                 <w:sz w:val="20"/>
                 <w:szCs w:val="20"/>
               </w:rPr>
-              <w:t xml:space="preserve">CI workflow for Production – triggered on </w:t>
-            </w:r>
-            <w:proofErr w:type="spellStart"/>
-            <w:r>
-              <w:rPr>
-                <w:color w:val="000000"/>
-                <w:sz w:val="20"/>
-                <w:szCs w:val="20"/>
-              </w:rPr>
-              <w:t>pull_request</w:t>
-            </w:r>
-            <w:proofErr w:type="spellEnd"/>
-            <w:r>
-              <w:rPr>
-                <w:color w:val="000000"/>
-                <w:sz w:val="20"/>
-                <w:szCs w:val="20"/>
-              </w:rPr>
-              <w:t xml:space="preserve"> targeting main</w:t>
+              <w:t>CI workflow for Production – triggered on pull_request targeting main</w:t>
             </w:r>
           </w:p>
         </w:tc>
@@ -7002,42 +6024,8 @@
                 <w:sz w:val="20"/>
                 <w:szCs w:val="20"/>
               </w:rPr>
-              <w:t>.</w:t>
-            </w:r>
-            <w:proofErr w:type="spellStart"/>
-            <w:r>
-              <w:rPr>
-                <w:b/>
-                <w:bCs/>
-                <w:color w:val="000000"/>
-                <w:sz w:val="20"/>
-                <w:szCs w:val="20"/>
-              </w:rPr>
-              <w:t>github</w:t>
-            </w:r>
-            <w:proofErr w:type="spellEnd"/>
-            <w:r>
-              <w:rPr>
-                <w:b/>
-                <w:bCs/>
-                <w:color w:val="000000"/>
-                <w:sz w:val="20"/>
-                <w:szCs w:val="20"/>
-              </w:rPr>
-              <w:t>/workflows/cd-</w:t>
-            </w:r>
-            <w:proofErr w:type="spellStart"/>
-            <w:r>
-              <w:rPr>
-                <w:b/>
-                <w:bCs/>
-                <w:color w:val="000000"/>
-                <w:sz w:val="20"/>
-                <w:szCs w:val="20"/>
-              </w:rPr>
-              <w:t>prod.yml</w:t>
-            </w:r>
-            <w:proofErr w:type="spellEnd"/>
+              <w:t>.github/workflows/cd-prod.yml</w:t>
+            </w:r>
           </w:p>
         </w:tc>
         <w:tc>
@@ -7655,25 +6643,7 @@
                 <w:sz w:val="20"/>
                 <w:szCs w:val="20"/>
               </w:rPr>
-              <w:t xml:space="preserve">Deploy-hook webhook URL from the </w:t>
-            </w:r>
-            <w:proofErr w:type="spellStart"/>
-            <w:r>
-              <w:rPr>
-                <w:color w:val="000000"/>
-                <w:sz w:val="20"/>
-                <w:szCs w:val="20"/>
-              </w:rPr>
-              <w:t>pakvista</w:t>
-            </w:r>
-            <w:proofErr w:type="spellEnd"/>
-            <w:r>
-              <w:rPr>
-                <w:color w:val="000000"/>
-                <w:sz w:val="20"/>
-                <w:szCs w:val="20"/>
-              </w:rPr>
-              <w:t>-dev Render service. Added inside the 'development' environment secrets.</w:t>
+              <w:t>Deploy-hook webhook URL from the pakvista-dev Render service. Added inside the 'development' environment secrets.</w:t>
             </w:r>
           </w:p>
         </w:tc>
@@ -7766,25 +6736,7 @@
                 <w:sz w:val="20"/>
                 <w:szCs w:val="20"/>
               </w:rPr>
-              <w:t xml:space="preserve">Deploy-hook webhook URL from the </w:t>
-            </w:r>
-            <w:proofErr w:type="spellStart"/>
-            <w:r>
-              <w:rPr>
-                <w:color w:val="000000"/>
-                <w:sz w:val="20"/>
-                <w:szCs w:val="20"/>
-              </w:rPr>
-              <w:t>pakvista</w:t>
-            </w:r>
-            <w:proofErr w:type="spellEnd"/>
-            <w:r>
-              <w:rPr>
-                <w:color w:val="000000"/>
-                <w:sz w:val="20"/>
-                <w:szCs w:val="20"/>
-              </w:rPr>
-              <w:t>-staging Render service. Added inside the 'staging' environment secrets.</w:t>
+              <w:t>Deploy-hook webhook URL from the pakvista-staging Render service. Added inside the 'staging' environment secrets.</w:t>
             </w:r>
           </w:p>
         </w:tc>
@@ -7877,25 +6829,7 @@
                 <w:sz w:val="20"/>
                 <w:szCs w:val="20"/>
               </w:rPr>
-              <w:t xml:space="preserve">Deploy-hook webhook URL from the </w:t>
-            </w:r>
-            <w:proofErr w:type="spellStart"/>
-            <w:r>
-              <w:rPr>
-                <w:color w:val="000000"/>
-                <w:sz w:val="20"/>
-                <w:szCs w:val="20"/>
-              </w:rPr>
-              <w:t>pakvista</w:t>
-            </w:r>
-            <w:proofErr w:type="spellEnd"/>
-            <w:r>
-              <w:rPr>
-                <w:color w:val="000000"/>
-                <w:sz w:val="20"/>
-                <w:szCs w:val="20"/>
-              </w:rPr>
-              <w:t>-prod Render service. Added inside the 'production' environment secrets.</w:t>
+              <w:t>Deploy-hook webhook URL from the pakvista-prod Render service. Added inside the 'production' environment secrets.</w:t>
             </w:r>
           </w:p>
         </w:tc>
@@ -8136,20 +7070,8 @@
                 <w:sz w:val="20"/>
                 <w:szCs w:val="20"/>
               </w:rPr>
-              <w:t>ci-</w:t>
-            </w:r>
-            <w:proofErr w:type="spellStart"/>
-            <w:r>
-              <w:rPr>
-                <w:b/>
-                <w:bCs/>
-                <w:color w:val="000000"/>
-                <w:sz w:val="20"/>
-                <w:szCs w:val="20"/>
-              </w:rPr>
-              <w:t>dev.yml</w:t>
-            </w:r>
-            <w:proofErr w:type="spellEnd"/>
+              <w:t>ci-dev.yml</w:t>
+            </w:r>
           </w:p>
         </w:tc>
         <w:tc>
@@ -8171,7 +7093,6 @@
             <w:vAlign w:val="center"/>
           </w:tcPr>
           <w:p>
-            <w:proofErr w:type="spellStart"/>
             <w:r>
               <w:rPr>
                 <w:color w:val="000000"/>
@@ -8180,7 +7101,6 @@
               </w:rPr>
               <w:t>pull_request</w:t>
             </w:r>
-            <w:proofErr w:type="spellEnd"/>
           </w:p>
         </w:tc>
         <w:tc>
@@ -8270,20 +7190,8 @@
                 <w:sz w:val="20"/>
                 <w:szCs w:val="20"/>
               </w:rPr>
-              <w:t>ci-</w:t>
-            </w:r>
-            <w:proofErr w:type="spellStart"/>
-            <w:r>
-              <w:rPr>
-                <w:b/>
-                <w:bCs/>
-                <w:color w:val="000000"/>
-                <w:sz w:val="20"/>
-                <w:szCs w:val="20"/>
-              </w:rPr>
-              <w:t>staging.yml</w:t>
-            </w:r>
-            <w:proofErr w:type="spellEnd"/>
+              <w:t>ci-staging.yml</w:t>
+            </w:r>
           </w:p>
         </w:tc>
         <w:tc>
@@ -8305,7 +7213,6 @@
             <w:vAlign w:val="center"/>
           </w:tcPr>
           <w:p>
-            <w:proofErr w:type="spellStart"/>
             <w:r>
               <w:rPr>
                 <w:color w:val="000000"/>
@@ -8314,7 +7221,6 @@
               </w:rPr>
               <w:t>pull_request</w:t>
             </w:r>
-            <w:proofErr w:type="spellEnd"/>
           </w:p>
         </w:tc>
         <w:tc>
@@ -8404,20 +7310,8 @@
                 <w:sz w:val="20"/>
                 <w:szCs w:val="20"/>
               </w:rPr>
-              <w:t>ci-</w:t>
-            </w:r>
-            <w:proofErr w:type="spellStart"/>
-            <w:r>
-              <w:rPr>
-                <w:b/>
-                <w:bCs/>
-                <w:color w:val="000000"/>
-                <w:sz w:val="20"/>
-                <w:szCs w:val="20"/>
-              </w:rPr>
-              <w:t>prod.yml</w:t>
-            </w:r>
-            <w:proofErr w:type="spellEnd"/>
+              <w:t>ci-prod.yml</w:t>
+            </w:r>
           </w:p>
         </w:tc>
         <w:tc>
@@ -8439,7 +7333,6 @@
             <w:vAlign w:val="center"/>
           </w:tcPr>
           <w:p>
-            <w:proofErr w:type="spellStart"/>
             <w:r>
               <w:rPr>
                 <w:color w:val="000000"/>
@@ -8448,7 +7341,6 @@
               </w:rPr>
               <w:t>pull_request</w:t>
             </w:r>
-            <w:proofErr w:type="spellEnd"/>
           </w:p>
         </w:tc>
         <w:tc>
@@ -8603,23 +7495,7 @@
     </w:p>
     <w:p>
       <w:r>
-        <w:t xml:space="preserve">Lint HTML with </w:t>
-      </w:r>
-      <w:proofErr w:type="spellStart"/>
-      <w:r>
-        <w:t>HTMLHint</w:t>
-      </w:r>
-      <w:proofErr w:type="spellEnd"/>
-      <w:r>
-        <w:t xml:space="preserve">, CSS with </w:t>
-      </w:r>
-      <w:proofErr w:type="spellStart"/>
-      <w:r>
-        <w:t>Stylelint</w:t>
-      </w:r>
-      <w:proofErr w:type="spellEnd"/>
-      <w:r>
-        <w:t xml:space="preserve"> and Build with Parcel.</w:t>
+        <w:t>Lint HTML with HTMLHint, CSS with Stylelint and Build with Parcel.</w:t>
       </w:r>
     </w:p>
     <w:p/>
@@ -8716,21 +7592,7 @@
         <w:rPr>
           <w:color w:val="000000"/>
         </w:rPr>
-        <w:t xml:space="preserve">Build the Docker image from the </w:t>
-      </w:r>
-      <w:proofErr w:type="spellStart"/>
-      <w:r>
-        <w:rPr>
-          <w:color w:val="000000"/>
-        </w:rPr>
-        <w:t>Dockerfile</w:t>
-      </w:r>
-      <w:proofErr w:type="spellEnd"/>
-      <w:r>
-        <w:rPr>
-          <w:color w:val="000000"/>
-        </w:rPr>
-        <w:t xml:space="preserve"> in the project root using docker/build-push-action@v5 with push: false.</w:t>
+        <w:t>Build the Docker image from the Dockerfile in the project root using docker/build-push-action@v5 with push: false.</w:t>
       </w:r>
     </w:p>
     <w:p>
@@ -8868,21 +7730,7 @@
         <w:rPr>
           <w:color w:val="000000"/>
         </w:rPr>
-        <w:t xml:space="preserve">The workflow must exit with a non-zero code if any step fails, preventing a broken image from being available for deployment. This is the default </w:t>
-      </w:r>
-      <w:proofErr w:type="spellStart"/>
-      <w:r>
-        <w:rPr>
-          <w:color w:val="000000"/>
-        </w:rPr>
-        <w:t>behaviour</w:t>
-      </w:r>
-      <w:proofErr w:type="spellEnd"/>
-      <w:r>
-        <w:rPr>
-          <w:color w:val="000000"/>
-        </w:rPr>
-        <w:t xml:space="preserve"> of GitHub Actions (fail-fast).</w:t>
+        <w:t>The workflow must exit with a non-zero code if any step fails, preventing a broken image from being available for deployment. This is the default behaviour of GitHub Actions (fail-fast).</w:t>
       </w:r>
     </w:p>
     <w:p>
@@ -9143,20 +7991,8 @@
                 <w:sz w:val="20"/>
                 <w:szCs w:val="20"/>
               </w:rPr>
-              <w:t>cd-</w:t>
-            </w:r>
-            <w:proofErr w:type="spellStart"/>
-            <w:r>
-              <w:rPr>
-                <w:b/>
-                <w:bCs/>
-                <w:color w:val="000000"/>
-                <w:sz w:val="20"/>
-                <w:szCs w:val="20"/>
-              </w:rPr>
-              <w:t>dev.yml</w:t>
-            </w:r>
-            <w:proofErr w:type="spellEnd"/>
+              <w:t>cd-dev.yml</w:t>
+            </w:r>
           </w:p>
         </w:tc>
         <w:tc>
@@ -9275,20 +8111,8 @@
                 <w:sz w:val="20"/>
                 <w:szCs w:val="20"/>
               </w:rPr>
-              <w:t>cd-</w:t>
-            </w:r>
-            <w:proofErr w:type="spellStart"/>
-            <w:r>
-              <w:rPr>
-                <w:b/>
-                <w:bCs/>
-                <w:color w:val="000000"/>
-                <w:sz w:val="20"/>
-                <w:szCs w:val="20"/>
-              </w:rPr>
-              <w:t>staging.yml</w:t>
-            </w:r>
-            <w:proofErr w:type="spellEnd"/>
+              <w:t>cd-staging.yml</w:t>
+            </w:r>
           </w:p>
         </w:tc>
         <w:tc>
@@ -9407,20 +8231,8 @@
                 <w:sz w:val="20"/>
                 <w:szCs w:val="20"/>
               </w:rPr>
-              <w:t>cd-</w:t>
-            </w:r>
-            <w:proofErr w:type="spellStart"/>
-            <w:r>
-              <w:rPr>
-                <w:b/>
-                <w:bCs/>
-                <w:color w:val="000000"/>
-                <w:sz w:val="20"/>
-                <w:szCs w:val="20"/>
-              </w:rPr>
-              <w:t>prod.yml</w:t>
-            </w:r>
-            <w:proofErr w:type="spellEnd"/>
+              <w:t>cd-prod.yml</w:t>
+            </w:r>
           </w:p>
         </w:tc>
         <w:tc>
@@ -9649,9 +8461,14 @@
           <w:sz w:val="20"/>
           <w:szCs w:val="20"/>
         </w:rPr>
-        <w:t xml:space="preserve">curl -X POST ${{ </w:t>
-      </w:r>
-      <w:proofErr w:type="spellStart"/>
+        <w:t>curl -X POST ${{ secrets.RENDER_DEPLOY_HOOK_DEV_URL }}    # cd-dev.yml</w:t>
+      </w:r>
+    </w:p>
+    <w:p>
+      <w:pPr>
+        <w:spacing w:before="40" w:after="40"/>
+        <w:ind w:left="720"/>
+      </w:pPr>
       <w:r>
         <w:rPr>
           <w:rFonts w:ascii="Courier New" w:eastAsia="Courier New" w:hAnsi="Courier New" w:cs="Courier New"/>
@@ -9659,9 +8476,14 @@
           <w:sz w:val="20"/>
           <w:szCs w:val="20"/>
         </w:rPr>
-        <w:t>secrets.RENDER_DEPLOY_HOOK_DEV_URL</w:t>
-      </w:r>
-      <w:proofErr w:type="spellEnd"/>
+        <w:t>curl -X POST ${{ secrets.RENDER_DEPLOY_HOOK_STAGING_URL }} # cd-staging.yml</w:t>
+      </w:r>
+    </w:p>
+    <w:p>
+      <w:pPr>
+        <w:spacing w:before="40" w:after="40"/>
+        <w:ind w:left="720"/>
+      </w:pPr>
       <w:r>
         <w:rPr>
           <w:rFonts w:ascii="Courier New" w:eastAsia="Courier New" w:hAnsi="Courier New" w:cs="Courier New"/>
@@ -9669,111 +8491,8 @@
           <w:sz w:val="20"/>
           <w:szCs w:val="20"/>
         </w:rPr>
-        <w:t xml:space="preserve"> }}    # cd-</w:t>
-      </w:r>
-      <w:proofErr w:type="spellStart"/>
-      <w:r>
-        <w:rPr>
-          <w:rFonts w:ascii="Courier New" w:eastAsia="Courier New" w:hAnsi="Courier New" w:cs="Courier New"/>
-          <w:color w:val="C7254E"/>
-          <w:sz w:val="20"/>
-          <w:szCs w:val="20"/>
-        </w:rPr>
-        <w:t>dev.yml</w:t>
-      </w:r>
-      <w:proofErr w:type="spellEnd"/>
-    </w:p>
-    <w:p>
-      <w:pPr>
-        <w:spacing w:before="40" w:after="40"/>
-        <w:ind w:left="720"/>
-      </w:pPr>
-      <w:r>
-        <w:rPr>
-          <w:rFonts w:ascii="Courier New" w:eastAsia="Courier New" w:hAnsi="Courier New" w:cs="Courier New"/>
-          <w:color w:val="C7254E"/>
-          <w:sz w:val="20"/>
-          <w:szCs w:val="20"/>
-        </w:rPr>
-        <w:t xml:space="preserve">curl -X POST ${{ </w:t>
-      </w:r>
-      <w:proofErr w:type="spellStart"/>
-      <w:r>
-        <w:rPr>
-          <w:rFonts w:ascii="Courier New" w:eastAsia="Courier New" w:hAnsi="Courier New" w:cs="Courier New"/>
-          <w:color w:val="C7254E"/>
-          <w:sz w:val="20"/>
-          <w:szCs w:val="20"/>
-        </w:rPr>
-        <w:t>secrets.RENDER_DEPLOY_HOOK_STAGING_URL</w:t>
-      </w:r>
-      <w:proofErr w:type="spellEnd"/>
-      <w:r>
-        <w:rPr>
-          <w:rFonts w:ascii="Courier New" w:eastAsia="Courier New" w:hAnsi="Courier New" w:cs="Courier New"/>
-          <w:color w:val="C7254E"/>
-          <w:sz w:val="20"/>
-          <w:szCs w:val="20"/>
-        </w:rPr>
-        <w:t xml:space="preserve"> }} # cd-</w:t>
-      </w:r>
-      <w:proofErr w:type="spellStart"/>
-      <w:r>
-        <w:rPr>
-          <w:rFonts w:ascii="Courier New" w:eastAsia="Courier New" w:hAnsi="Courier New" w:cs="Courier New"/>
-          <w:color w:val="C7254E"/>
-          <w:sz w:val="20"/>
-          <w:szCs w:val="20"/>
-        </w:rPr>
-        <w:t>staging.yml</w:t>
-      </w:r>
-      <w:proofErr w:type="spellEnd"/>
-    </w:p>
-    <w:p>
-      <w:pPr>
-        <w:spacing w:before="40" w:after="40"/>
-        <w:ind w:left="720"/>
-      </w:pPr>
-      <w:r>
-        <w:rPr>
-          <w:rFonts w:ascii="Courier New" w:eastAsia="Courier New" w:hAnsi="Courier New" w:cs="Courier New"/>
-          <w:color w:val="C7254E"/>
-          <w:sz w:val="20"/>
-          <w:szCs w:val="20"/>
-        </w:rPr>
-        <w:t xml:space="preserve">curl -X POST ${{ </w:t>
-      </w:r>
-      <w:proofErr w:type="spellStart"/>
-      <w:r>
-        <w:rPr>
-          <w:rFonts w:ascii="Courier New" w:eastAsia="Courier New" w:hAnsi="Courier New" w:cs="Courier New"/>
-          <w:color w:val="C7254E"/>
-          <w:sz w:val="20"/>
-          <w:szCs w:val="20"/>
-        </w:rPr>
-        <w:t>secrets.RENDER_DEPLOY_HOOK_PROD_URL</w:t>
-      </w:r>
-      <w:proofErr w:type="spellEnd"/>
-      <w:r>
-        <w:rPr>
-          <w:rFonts w:ascii="Courier New" w:eastAsia="Courier New" w:hAnsi="Courier New" w:cs="Courier New"/>
-          <w:color w:val="C7254E"/>
-          <w:sz w:val="20"/>
-          <w:szCs w:val="20"/>
-        </w:rPr>
-        <w:t xml:space="preserve"> }}    # cd-</w:t>
-      </w:r>
-      <w:proofErr w:type="spellStart"/>
-      <w:r>
-        <w:rPr>
-          <w:rFonts w:ascii="Courier New" w:eastAsia="Courier New" w:hAnsi="Courier New" w:cs="Courier New"/>
-          <w:color w:val="C7254E"/>
-          <w:sz w:val="20"/>
-          <w:szCs w:val="20"/>
-        </w:rPr>
-        <w:t>prod.yml</w:t>
-      </w:r>
-      <w:proofErr w:type="spellEnd"/>
+        <w:t>curl -X POST ${{ secrets.RENDER_DEPLOY_HOOK_PROD_URL }}    # cd-prod.yml</w:t>
+      </w:r>
     </w:p>
     <w:p>
       <w:pPr>
@@ -9885,21 +8604,7 @@
         <w:rPr>
           <w:color w:val="000000"/>
         </w:rPr>
-        <w:t xml:space="preserve">The workflow must be triggered only on push events to the specified branch (no </w:t>
-      </w:r>
-      <w:proofErr w:type="spellStart"/>
-      <w:r>
-        <w:rPr>
-          <w:color w:val="000000"/>
-        </w:rPr>
-        <w:t>workflow_dispatch</w:t>
-      </w:r>
-      <w:proofErr w:type="spellEnd"/>
-      <w:r>
-        <w:rPr>
-          <w:color w:val="000000"/>
-        </w:rPr>
-        <w:t xml:space="preserve"> or schedule triggers are required, though they may be added as extras).</w:t>
+        <w:t>The workflow must be triggered only on push events to the specified branch (no workflow_dispatch or schedule triggers are required, though they may be added as extras).</w:t>
       </w:r>
     </w:p>
     <w:p/>
@@ -9925,21 +8630,7 @@
         <w:rPr>
           <w:color w:val="000000"/>
         </w:rPr>
-        <w:t xml:space="preserve">The Team Lead must create the </w:t>
-      </w:r>
-      <w:proofErr w:type="spellStart"/>
-      <w:r>
-        <w:rPr>
-          <w:color w:val="000000"/>
-        </w:rPr>
-        <w:t>Dockerfile</w:t>
-      </w:r>
-      <w:proofErr w:type="spellEnd"/>
-      <w:r>
-        <w:rPr>
-          <w:color w:val="000000"/>
-        </w:rPr>
-        <w:t xml:space="preserve"> in the repository root. The following requirements must be met:</w:t>
+        <w:t>The Team Lead must create the Dockerfile in the repository root. The following requirements must be met:</w:t>
       </w:r>
     </w:p>
     <w:p/>
@@ -9956,21 +8647,7 @@
         <w:rPr>
           <w:color w:val="000000"/>
         </w:rPr>
-        <w:t xml:space="preserve">Base image: </w:t>
-      </w:r>
-      <w:proofErr w:type="spellStart"/>
-      <w:r>
-        <w:rPr>
-          <w:color w:val="000000"/>
-        </w:rPr>
-        <w:t>nginx:alpine</w:t>
-      </w:r>
-      <w:proofErr w:type="spellEnd"/>
-      <w:r>
-        <w:rPr>
-          <w:color w:val="000000"/>
-        </w:rPr>
-        <w:t xml:space="preserve"> (official Nginx image on Alpine Linux). Reference: https://hub.docker.com/_/nginx</w:t>
+        <w:t>Base image: nginx:alpine (official Nginx image on Alpine Linux). Reference: https://hub.docker.com/_/nginx</w:t>
       </w:r>
     </w:p>
     <w:p>
@@ -9986,21 +8663,7 @@
         <w:rPr>
           <w:color w:val="000000"/>
         </w:rPr>
-        <w:t>The COPY instruction must copy all HTML pages and style.css from the project root into /</w:t>
-      </w:r>
-      <w:proofErr w:type="spellStart"/>
-      <w:r>
-        <w:rPr>
-          <w:color w:val="000000"/>
-        </w:rPr>
-        <w:t>usr</w:t>
-      </w:r>
-      <w:proofErr w:type="spellEnd"/>
-      <w:r>
-        <w:rPr>
-          <w:color w:val="000000"/>
-        </w:rPr>
-        <w:t>/share/nginx/html/.</w:t>
+        <w:t>The COPY instruction must copy all HTML pages and style.css from the project root into /usr/share/nginx/html/.</w:t>
       </w:r>
     </w:p>
     <w:p>
@@ -10048,47 +8711,19 @@
         <w:rPr>
           <w:color w:val="000000"/>
         </w:rPr>
-        <w:t xml:space="preserve">The </w:t>
-      </w:r>
-      <w:proofErr w:type="spellStart"/>
+        <w:t>The Dockerfile must be placed in the repository root (not in a subdirectory).</w:t>
+      </w:r>
+    </w:p>
+    <w:p/>
+    <w:p>
+      <w:pPr>
+        <w:spacing w:before="60" w:after="60" w:line="276" w:lineRule="auto"/>
+      </w:pPr>
       <w:r>
         <w:rPr>
           <w:color w:val="000000"/>
         </w:rPr>
-        <w:t>Dockerfile</w:t>
-      </w:r>
-      <w:proofErr w:type="spellEnd"/>
-      <w:r>
-        <w:rPr>
-          <w:color w:val="000000"/>
-        </w:rPr>
-        <w:t xml:space="preserve"> must be placed in the repository root (not in a subdirectory).</w:t>
-      </w:r>
-    </w:p>
-    <w:p/>
-    <w:p>
-      <w:pPr>
-        <w:spacing w:before="60" w:after="60" w:line="276" w:lineRule="auto"/>
-      </w:pPr>
-      <w:r>
-        <w:rPr>
-          <w:color w:val="000000"/>
-        </w:rPr>
-        <w:t xml:space="preserve">Example minimal </w:t>
-      </w:r>
-      <w:proofErr w:type="spellStart"/>
-      <w:r>
-        <w:rPr>
-          <w:color w:val="000000"/>
-        </w:rPr>
-        <w:t>Dockerfile</w:t>
-      </w:r>
-      <w:proofErr w:type="spellEnd"/>
-      <w:r>
-        <w:rPr>
-          <w:color w:val="000000"/>
-        </w:rPr>
-        <w:t>:</w:t>
+        <w:t>Example minimal Dockerfile:</w:t>
       </w:r>
     </w:p>
     <w:p>
@@ -10103,9 +8738,14 @@
           <w:sz w:val="20"/>
           <w:szCs w:val="20"/>
         </w:rPr>
-        <w:t xml:space="preserve">FROM </w:t>
-      </w:r>
-      <w:proofErr w:type="spellStart"/>
+        <w:t>FROM nginx:alpine</w:t>
+      </w:r>
+    </w:p>
+    <w:p>
+      <w:pPr>
+        <w:spacing w:before="40" w:after="40"/>
+        <w:ind w:left="720"/>
+      </w:pPr>
       <w:r>
         <w:rPr>
           <w:rFonts w:ascii="Courier New" w:eastAsia="Courier New" w:hAnsi="Courier New" w:cs="Courier New"/>
@@ -10113,9 +8753,8 @@
           <w:sz w:val="20"/>
           <w:szCs w:val="20"/>
         </w:rPr>
-        <w:t>nginx:alpine</w:t>
-      </w:r>
-      <w:proofErr w:type="spellEnd"/>
+        <w:t>COPY *.html /usr/share/nginx/html/</w:t>
+      </w:r>
     </w:p>
     <w:p>
       <w:pPr>
@@ -10129,62 +8768,7 @@
           <w:sz w:val="20"/>
           <w:szCs w:val="20"/>
         </w:rPr>
-        <w:t>COPY *.html /</w:t>
-      </w:r>
-      <w:proofErr w:type="spellStart"/>
-      <w:r>
-        <w:rPr>
-          <w:rFonts w:ascii="Courier New" w:eastAsia="Courier New" w:hAnsi="Courier New" w:cs="Courier New"/>
-          <w:color w:val="C7254E"/>
-          <w:sz w:val="20"/>
-          <w:szCs w:val="20"/>
-        </w:rPr>
-        <w:t>usr</w:t>
-      </w:r>
-      <w:proofErr w:type="spellEnd"/>
-      <w:r>
-        <w:rPr>
-          <w:rFonts w:ascii="Courier New" w:eastAsia="Courier New" w:hAnsi="Courier New" w:cs="Courier New"/>
-          <w:color w:val="C7254E"/>
-          <w:sz w:val="20"/>
-          <w:szCs w:val="20"/>
-        </w:rPr>
-        <w:t>/share/nginx/html/</w:t>
-      </w:r>
-    </w:p>
-    <w:p>
-      <w:pPr>
-        <w:spacing w:before="40" w:after="40"/>
-        <w:ind w:left="720"/>
-      </w:pPr>
-      <w:r>
-        <w:rPr>
-          <w:rFonts w:ascii="Courier New" w:eastAsia="Courier New" w:hAnsi="Courier New" w:cs="Courier New"/>
-          <w:color w:val="C7254E"/>
-          <w:sz w:val="20"/>
-          <w:szCs w:val="20"/>
-        </w:rPr>
-        <w:t>COPY style.css /</w:t>
-      </w:r>
-      <w:proofErr w:type="spellStart"/>
-      <w:r>
-        <w:rPr>
-          <w:rFonts w:ascii="Courier New" w:eastAsia="Courier New" w:hAnsi="Courier New" w:cs="Courier New"/>
-          <w:color w:val="C7254E"/>
-          <w:sz w:val="20"/>
-          <w:szCs w:val="20"/>
-        </w:rPr>
-        <w:t>usr</w:t>
-      </w:r>
-      <w:proofErr w:type="spellEnd"/>
-      <w:r>
-        <w:rPr>
-          <w:rFonts w:ascii="Courier New" w:eastAsia="Courier New" w:hAnsi="Courier New" w:cs="Courier New"/>
-          <w:color w:val="C7254E"/>
-          <w:sz w:val="20"/>
-          <w:szCs w:val="20"/>
-        </w:rPr>
-        <w:t>/share/nginx/html/</w:t>
+        <w:t>COPY style.css /usr/share/nginx/html/</w:t>
       </w:r>
     </w:p>
     <w:p>
@@ -10215,29 +8799,7 @@
           <w:sz w:val="20"/>
           <w:szCs w:val="20"/>
         </w:rPr>
-        <w:t xml:space="preserve">Reference – Docker Official nginx Image: https://hub.docker.com/_/nginx | </w:t>
-      </w:r>
-      <w:proofErr w:type="spellStart"/>
-      <w:r>
-        <w:rPr>
-          <w:i/>
-          <w:iCs/>
-          <w:color w:val="595959"/>
-          <w:sz w:val="20"/>
-          <w:szCs w:val="20"/>
-        </w:rPr>
-        <w:t>Dockerfile</w:t>
-      </w:r>
-      <w:proofErr w:type="spellEnd"/>
-      <w:r>
-        <w:rPr>
-          <w:i/>
-          <w:iCs/>
-          <w:color w:val="595959"/>
-          <w:sz w:val="20"/>
-          <w:szCs w:val="20"/>
-        </w:rPr>
-        <w:t xml:space="preserve"> Reference: https://docs.docker.com/reference/dockerfile/</w:t>
+        <w:t>Reference – Docker Official nginx Image: https://hub.docker.com/_/nginx | Dockerfile Reference: https://docs.docker.com/reference/dockerfile/</w:t>
       </w:r>
     </w:p>
     <w:p/>
@@ -10306,35 +8868,7 @@
         <w:rPr>
           <w:color w:val="000000"/>
         </w:rPr>
-        <w:t xml:space="preserve">All pages must link to the shared style.css using: &lt;link </w:t>
-      </w:r>
-      <w:proofErr w:type="spellStart"/>
-      <w:r>
-        <w:rPr>
-          <w:color w:val="000000"/>
-        </w:rPr>
-        <w:t>rel</w:t>
-      </w:r>
-      <w:proofErr w:type="spellEnd"/>
-      <w:r>
-        <w:rPr>
-          <w:color w:val="000000"/>
-        </w:rPr>
-        <w:t xml:space="preserve">="stylesheet" </w:t>
-      </w:r>
-      <w:proofErr w:type="spellStart"/>
-      <w:r>
-        <w:rPr>
-          <w:color w:val="000000"/>
-        </w:rPr>
-        <w:t>href</w:t>
-      </w:r>
-      <w:proofErr w:type="spellEnd"/>
-      <w:r>
-        <w:rPr>
-          <w:color w:val="000000"/>
-        </w:rPr>
-        <w:t>="style.css"&gt;</w:t>
+        <w:t>All pages must link to the shared style.css using: &lt;link rel="stylesheet" href="style.css"&gt;</w:t>
       </w:r>
     </w:p>
     <w:p>
@@ -10382,35 +8916,7 @@
         <w:rPr>
           <w:color w:val="000000"/>
         </w:rPr>
-        <w:t xml:space="preserve">No JavaScript: &lt;script&gt; tags, inline event handlers (onclick, </w:t>
-      </w:r>
-      <w:proofErr w:type="spellStart"/>
-      <w:r>
-        <w:rPr>
-          <w:color w:val="000000"/>
-        </w:rPr>
-        <w:t>onsubmit</w:t>
-      </w:r>
-      <w:proofErr w:type="spellEnd"/>
-      <w:r>
-        <w:rPr>
-          <w:color w:val="000000"/>
-        </w:rPr>
-        <w:t>, etc.), and external .</w:t>
-      </w:r>
-      <w:proofErr w:type="spellStart"/>
-      <w:r>
-        <w:rPr>
-          <w:color w:val="000000"/>
-        </w:rPr>
-        <w:t>js</w:t>
-      </w:r>
-      <w:proofErr w:type="spellEnd"/>
-      <w:r>
-        <w:rPr>
-          <w:color w:val="000000"/>
-        </w:rPr>
-        <w:t xml:space="preserve"> file links are strictly prohibited.</w:t>
+        <w:t>No JavaScript: &lt;script&gt; tags, inline event handlers (onclick, onsubmit, etc.), and external .js file links are strictly prohibited.</w:t>
       </w:r>
     </w:p>
     <w:p>
@@ -10426,35 +8932,7 @@
         <w:rPr>
           <w:color w:val="000000"/>
         </w:rPr>
-        <w:t>All images must use HTML &lt;figure&gt; and &lt;</w:t>
-      </w:r>
-      <w:proofErr w:type="spellStart"/>
-      <w:r>
-        <w:rPr>
-          <w:color w:val="000000"/>
-        </w:rPr>
-        <w:t>figcaption</w:t>
-      </w:r>
-      <w:proofErr w:type="spellEnd"/>
-      <w:r>
-        <w:rPr>
-          <w:color w:val="000000"/>
-        </w:rPr>
-        <w:t>&gt; elements with descriptive alt attributes. Actual image files are optional; a styled empty &lt;div class="</w:t>
-      </w:r>
-      <w:proofErr w:type="spellStart"/>
-      <w:r>
-        <w:rPr>
-          <w:color w:val="000000"/>
-        </w:rPr>
-        <w:t>img</w:t>
-      </w:r>
-      <w:proofErr w:type="spellEnd"/>
-      <w:r>
-        <w:rPr>
-          <w:color w:val="000000"/>
-        </w:rPr>
-        <w:t>-placeholder"&gt; with a descriptive label inside is acceptable.</w:t>
+        <w:t>All images must use HTML &lt;figure&gt; and &lt;figcaption&gt; elements with descriptive alt attributes. Actual image files are optional; a styled empty &lt;div class="img-placeholder"&gt; with a descriptive label inside is acceptable.</w:t>
       </w:r>
     </w:p>
     <w:p>
@@ -10524,21 +9002,7 @@
         <w:rPr>
           <w:color w:val="000000"/>
         </w:rPr>
-        <w:t xml:space="preserve">Define a consistent </w:t>
-      </w:r>
-      <w:proofErr w:type="spellStart"/>
-      <w:r>
-        <w:rPr>
-          <w:color w:val="000000"/>
-        </w:rPr>
-        <w:t>colour</w:t>
-      </w:r>
-      <w:proofErr w:type="spellEnd"/>
-      <w:r>
-        <w:rPr>
-          <w:color w:val="000000"/>
-        </w:rPr>
-        <w:t xml:space="preserve"> palette using CSS custom properties (CSS variables) at :root level.</w:t>
+        <w:t>Define a consistent colour palette using CSS custom properties (CSS variables) at :root level.</w:t>
       </w:r>
     </w:p>
     <w:p>
@@ -10554,21 +9018,7 @@
         <w:rPr>
           <w:color w:val="000000"/>
         </w:rPr>
-        <w:t xml:space="preserve">Provide base styles for: body, h1–h3, p, a, nav, ul/li, table, </w:t>
-      </w:r>
-      <w:proofErr w:type="spellStart"/>
-      <w:r>
-        <w:rPr>
-          <w:color w:val="000000"/>
-        </w:rPr>
-        <w:t>th</w:t>
-      </w:r>
-      <w:proofErr w:type="spellEnd"/>
-      <w:r>
-        <w:rPr>
-          <w:color w:val="000000"/>
-        </w:rPr>
-        <w:t>, td, footer.</w:t>
+        <w:t>Provide base styles for: body, h1–h3, p, a, nav, ul/li, table, th, td, footer.</w:t>
       </w:r>
     </w:p>
     <w:p>
@@ -10600,35 +9050,7 @@
         <w:rPr>
           <w:color w:val="000000"/>
         </w:rPr>
-        <w:t>Provide a .</w:t>
-      </w:r>
-      <w:proofErr w:type="spellStart"/>
-      <w:r>
-        <w:rPr>
-          <w:color w:val="000000"/>
-        </w:rPr>
-        <w:t>img</w:t>
-      </w:r>
-      <w:proofErr w:type="spellEnd"/>
-      <w:r>
-        <w:rPr>
-          <w:color w:val="000000"/>
-        </w:rPr>
-        <w:t xml:space="preserve">-placeholder class that renders an empty box (e.g., 200px × 150px, with a border and background </w:t>
-      </w:r>
-      <w:proofErr w:type="spellStart"/>
-      <w:r>
-        <w:rPr>
-          <w:color w:val="000000"/>
-        </w:rPr>
-        <w:t>colour</w:t>
-      </w:r>
-      <w:proofErr w:type="spellEnd"/>
-      <w:r>
-        <w:rPr>
-          <w:color w:val="000000"/>
-        </w:rPr>
-        <w:t>) as a stand-in for actual images.</w:t>
+        <w:t>Provide a .img-placeholder class that renders an empty box (e.g., 200px × 150px, with a border and background colour) as a stand-in for actual images.</w:t>
       </w:r>
     </w:p>
     <w:p>
@@ -10895,20 +9317,8 @@
                 <w:sz w:val="20"/>
                 <w:szCs w:val="20"/>
               </w:rPr>
-              <w:t>ci-</w:t>
-            </w:r>
-            <w:proofErr w:type="spellStart"/>
-            <w:r>
-              <w:rPr>
-                <w:b/>
-                <w:bCs/>
-                <w:color w:val="000000"/>
-                <w:sz w:val="20"/>
-                <w:szCs w:val="20"/>
-              </w:rPr>
-              <w:t>dev.yml</w:t>
-            </w:r>
-            <w:proofErr w:type="spellEnd"/>
+              <w:t>ci-dev.yml</w:t>
+            </w:r>
           </w:p>
         </w:tc>
         <w:tc>
@@ -10930,23 +9340,13 @@
             <w:vAlign w:val="center"/>
           </w:tcPr>
           <w:p>
-            <w:proofErr w:type="spellStart"/>
-            <w:r>
-              <w:rPr>
-                <w:color w:val="000000"/>
-                <w:sz w:val="20"/>
-                <w:szCs w:val="20"/>
-              </w:rPr>
-              <w:t>pull_request</w:t>
-            </w:r>
-            <w:proofErr w:type="spellEnd"/>
-            <w:r>
-              <w:rPr>
-                <w:color w:val="000000"/>
-                <w:sz w:val="20"/>
-                <w:szCs w:val="20"/>
-              </w:rPr>
-              <w:t xml:space="preserve"> → develop</w:t>
+            <w:r>
+              <w:rPr>
+                <w:color w:val="000000"/>
+                <w:sz w:val="20"/>
+                <w:szCs w:val="20"/>
+              </w:rPr>
+              <w:t>pull_request → develop</w:t>
             </w:r>
           </w:p>
         </w:tc>
@@ -11037,20 +9437,8 @@
                 <w:sz w:val="20"/>
                 <w:szCs w:val="20"/>
               </w:rPr>
-              <w:t>cd-</w:t>
-            </w:r>
-            <w:proofErr w:type="spellStart"/>
-            <w:r>
-              <w:rPr>
-                <w:b/>
-                <w:bCs/>
-                <w:color w:val="000000"/>
-                <w:sz w:val="20"/>
-                <w:szCs w:val="20"/>
-              </w:rPr>
-              <w:t>dev.yml</w:t>
-            </w:r>
-            <w:proofErr w:type="spellEnd"/>
+              <w:t>cd-dev.yml</w:t>
+            </w:r>
           </w:p>
         </w:tc>
         <w:tc>
@@ -11169,20 +9557,8 @@
                 <w:sz w:val="20"/>
                 <w:szCs w:val="20"/>
               </w:rPr>
-              <w:t>ci-</w:t>
-            </w:r>
-            <w:proofErr w:type="spellStart"/>
-            <w:r>
-              <w:rPr>
-                <w:b/>
-                <w:bCs/>
-                <w:color w:val="000000"/>
-                <w:sz w:val="20"/>
-                <w:szCs w:val="20"/>
-              </w:rPr>
-              <w:t>staging.yml</w:t>
-            </w:r>
-            <w:proofErr w:type="spellEnd"/>
+              <w:t>ci-staging.yml</w:t>
+            </w:r>
           </w:p>
         </w:tc>
         <w:tc>
@@ -11204,23 +9580,13 @@
             <w:vAlign w:val="center"/>
           </w:tcPr>
           <w:p>
-            <w:proofErr w:type="spellStart"/>
-            <w:r>
-              <w:rPr>
-                <w:color w:val="000000"/>
-                <w:sz w:val="20"/>
-                <w:szCs w:val="20"/>
-              </w:rPr>
-              <w:t>pull_request</w:t>
-            </w:r>
-            <w:proofErr w:type="spellEnd"/>
-            <w:r>
-              <w:rPr>
-                <w:color w:val="000000"/>
-                <w:sz w:val="20"/>
-                <w:szCs w:val="20"/>
-              </w:rPr>
-              <w:t xml:space="preserve"> → staging</w:t>
+            <w:r>
+              <w:rPr>
+                <w:color w:val="000000"/>
+                <w:sz w:val="20"/>
+                <w:szCs w:val="20"/>
+              </w:rPr>
+              <w:t>pull_request → staging</w:t>
             </w:r>
           </w:p>
         </w:tc>
@@ -11311,20 +9677,8 @@
                 <w:sz w:val="20"/>
                 <w:szCs w:val="20"/>
               </w:rPr>
-              <w:t>cd-</w:t>
-            </w:r>
-            <w:proofErr w:type="spellStart"/>
-            <w:r>
-              <w:rPr>
-                <w:b/>
-                <w:bCs/>
-                <w:color w:val="000000"/>
-                <w:sz w:val="20"/>
-                <w:szCs w:val="20"/>
-              </w:rPr>
-              <w:t>staging.yml</w:t>
-            </w:r>
-            <w:proofErr w:type="spellEnd"/>
+              <w:t>cd-staging.yml</w:t>
+            </w:r>
           </w:p>
         </w:tc>
         <w:tc>
@@ -11443,20 +9797,8 @@
                 <w:sz w:val="20"/>
                 <w:szCs w:val="20"/>
               </w:rPr>
-              <w:t>ci-</w:t>
-            </w:r>
-            <w:proofErr w:type="spellStart"/>
-            <w:r>
-              <w:rPr>
-                <w:b/>
-                <w:bCs/>
-                <w:color w:val="000000"/>
-                <w:sz w:val="20"/>
-                <w:szCs w:val="20"/>
-              </w:rPr>
-              <w:t>prod.yml</w:t>
-            </w:r>
-            <w:proofErr w:type="spellEnd"/>
+              <w:t>ci-prod.yml</w:t>
+            </w:r>
           </w:p>
         </w:tc>
         <w:tc>
@@ -11478,23 +9820,13 @@
             <w:vAlign w:val="center"/>
           </w:tcPr>
           <w:p>
-            <w:proofErr w:type="spellStart"/>
-            <w:r>
-              <w:rPr>
-                <w:color w:val="000000"/>
-                <w:sz w:val="20"/>
-                <w:szCs w:val="20"/>
-              </w:rPr>
-              <w:t>pull_request</w:t>
-            </w:r>
-            <w:proofErr w:type="spellEnd"/>
-            <w:r>
-              <w:rPr>
-                <w:color w:val="000000"/>
-                <w:sz w:val="20"/>
-                <w:szCs w:val="20"/>
-              </w:rPr>
-              <w:t xml:space="preserve"> → main</w:t>
+            <w:r>
+              <w:rPr>
+                <w:color w:val="000000"/>
+                <w:sz w:val="20"/>
+                <w:szCs w:val="20"/>
+              </w:rPr>
+              <w:t>pull_request → main</w:t>
             </w:r>
           </w:p>
         </w:tc>
@@ -11585,20 +9917,8 @@
                 <w:sz w:val="20"/>
                 <w:szCs w:val="20"/>
               </w:rPr>
-              <w:t>cd-</w:t>
-            </w:r>
-            <w:proofErr w:type="spellStart"/>
-            <w:r>
-              <w:rPr>
-                <w:b/>
-                <w:bCs/>
-                <w:color w:val="000000"/>
-                <w:sz w:val="20"/>
-                <w:szCs w:val="20"/>
-              </w:rPr>
-              <w:t>prod.yml</w:t>
-            </w:r>
-            <w:proofErr w:type="spellEnd"/>
+              <w:t>cd-prod.yml</w:t>
+            </w:r>
           </w:p>
         </w:tc>
         <w:tc>
@@ -11732,21 +10052,7 @@
         <w:rPr>
           <w:color w:val="000000"/>
         </w:rPr>
-        <w:t>Create a new GitHub repository from scratch (</w:t>
-      </w:r>
-      <w:proofErr w:type="spellStart"/>
-      <w:r>
-        <w:rPr>
-          <w:color w:val="000000"/>
-        </w:rPr>
-        <w:t>pakvista-cicd</w:t>
-      </w:r>
-      <w:proofErr w:type="spellEnd"/>
-      <w:r>
-        <w:rPr>
-          <w:color w:val="000000"/>
-        </w:rPr>
-        <w:t xml:space="preserve"> or team-agreed name). Do NOT reuse any previous repository.</w:t>
+        <w:t>Create a new GitHub repository from scratch (pakvista-cicd or team-agreed name). Do NOT reuse any previous repository.</w:t>
       </w:r>
     </w:p>
     <w:p>
@@ -11810,49 +10116,7 @@
         <w:rPr>
           <w:color w:val="000000"/>
         </w:rPr>
-        <w:t>Create three Render Web Services (</w:t>
-      </w:r>
-      <w:proofErr w:type="spellStart"/>
-      <w:r>
-        <w:rPr>
-          <w:color w:val="000000"/>
-        </w:rPr>
-        <w:t>pakvista</w:t>
-      </w:r>
-      <w:proofErr w:type="spellEnd"/>
-      <w:r>
-        <w:rPr>
-          <w:color w:val="000000"/>
-        </w:rPr>
-        <w:t xml:space="preserve">-dev, </w:t>
-      </w:r>
-      <w:proofErr w:type="spellStart"/>
-      <w:r>
-        <w:rPr>
-          <w:color w:val="000000"/>
-        </w:rPr>
-        <w:t>pakvista</w:t>
-      </w:r>
-      <w:proofErr w:type="spellEnd"/>
-      <w:r>
-        <w:rPr>
-          <w:color w:val="000000"/>
-        </w:rPr>
-        <w:t xml:space="preserve">-staging, </w:t>
-      </w:r>
-      <w:proofErr w:type="spellStart"/>
-      <w:r>
-        <w:rPr>
-          <w:color w:val="000000"/>
-        </w:rPr>
-        <w:t>pakvista</w:t>
-      </w:r>
-      <w:proofErr w:type="spellEnd"/>
-      <w:r>
-        <w:rPr>
-          <w:color w:val="000000"/>
-        </w:rPr>
-        <w:t>-prod) each connected to the TL's Docker Hub image. Copy each deploy hook URL and store it in the correct GitHub Environment secret.</w:t>
+        <w:t>Create three Render Web Services (pakvista-dev, pakvista-staging, pakvista-prod) each connected to the TL's Docker Hub image. Copy each deploy hook URL and store it in the correct GitHub Environment secret.</w:t>
       </w:r>
     </w:p>
     <w:p>
@@ -11884,21 +10148,7 @@
         <w:rPr>
           <w:color w:val="000000"/>
         </w:rPr>
-        <w:t xml:space="preserve">Set up the initial repository structure: commit style.css, the </w:t>
-      </w:r>
-      <w:proofErr w:type="spellStart"/>
-      <w:r>
-        <w:rPr>
-          <w:color w:val="000000"/>
-        </w:rPr>
-        <w:t>Dockerfile</w:t>
-      </w:r>
-      <w:proofErr w:type="spellEnd"/>
-      <w:r>
-        <w:rPr>
-          <w:color w:val="000000"/>
-        </w:rPr>
-        <w:t>, and a skeleton index.html (Home / Welcome page).</w:t>
+        <w:t>Set up the initial repository structure: commit style.css, the Dockerfile, and a skeleton index.html (Home / Welcome page).</w:t>
       </w:r>
     </w:p>
     <w:p>
@@ -11972,21 +10222,7 @@
         <w:rPr>
           <w:color w:val="000000"/>
         </w:rPr>
-        <w:t>Create a personal feature branch from develop using the convention: feature/&lt;</w:t>
-      </w:r>
-      <w:proofErr w:type="spellStart"/>
-      <w:r>
-        <w:rPr>
-          <w:color w:val="000000"/>
-        </w:rPr>
-        <w:t>github</w:t>
-      </w:r>
-      <w:proofErr w:type="spellEnd"/>
-      <w:r>
-        <w:rPr>
-          <w:color w:val="000000"/>
-        </w:rPr>
-        <w:t>-username&gt;/&lt;page-name&gt;.</w:t>
+        <w:t>Create a personal feature branch from develop using the convention: feature/&lt;github-username&gt;/&lt;page-name&gt;.</w:t>
       </w:r>
     </w:p>
     <w:p>
@@ -12018,21 +10254,7 @@
         <w:rPr>
           <w:color w:val="000000"/>
         </w:rPr>
-        <w:t>Author the assigned workflow file (Table 3) in .</w:t>
-      </w:r>
-      <w:proofErr w:type="spellStart"/>
-      <w:r>
-        <w:rPr>
-          <w:color w:val="000000"/>
-        </w:rPr>
-        <w:t>github</w:t>
-      </w:r>
-      <w:proofErr w:type="spellEnd"/>
-      <w:r>
-        <w:rPr>
-          <w:color w:val="000000"/>
-        </w:rPr>
-        <w:t>/workflows/. The workflow must be syntactically correct, well-commented YAML.</w:t>
+        <w:t>Author the assigned workflow file (Table 3) in .github/workflows/. The workflow must be syntactically correct, well-commented YAML.</w:t>
       </w:r>
     </w:p>
     <w:p>
@@ -12064,21 +10286,7 @@
         <w:rPr>
           <w:color w:val="000000"/>
         </w:rPr>
-        <w:t>Open a Pull Request targeting the develop branch with a meaningful PR description. Verify the CI workflow (ci-</w:t>
-      </w:r>
-      <w:proofErr w:type="spellStart"/>
-      <w:r>
-        <w:rPr>
-          <w:color w:val="000000"/>
-        </w:rPr>
-        <w:t>dev.yml</w:t>
-      </w:r>
-      <w:proofErr w:type="spellEnd"/>
-      <w:r>
-        <w:rPr>
-          <w:color w:val="000000"/>
-        </w:rPr>
-        <w:t>) fires and all steps pass.</w:t>
+        <w:t>Open a Pull Request targeting the develop branch with a meaningful PR description. Verify the CI workflow (ci-dev.yml) fires and all steps pass.</w:t>
       </w:r>
     </w:p>
     <w:p>
@@ -12094,21 +10302,7 @@
         <w:rPr>
           <w:color w:val="000000"/>
         </w:rPr>
-        <w:t>After the Team Lead reviews and approves the PR, confirm the PR is merged and the CD workflow (cd-</w:t>
-      </w:r>
-      <w:proofErr w:type="spellStart"/>
-      <w:r>
-        <w:rPr>
-          <w:color w:val="000000"/>
-        </w:rPr>
-        <w:t>dev.yml</w:t>
-      </w:r>
-      <w:proofErr w:type="spellEnd"/>
-      <w:r>
-        <w:rPr>
-          <w:color w:val="000000"/>
-        </w:rPr>
-        <w:t>) fires automatically.</w:t>
+        <w:t>After the Team Lead reviews and approves the PR, confirm the PR is merged and the CD workflow (cd-dev.yml) fires automatically.</w:t>
       </w:r>
     </w:p>
     <w:p>
@@ -12124,21 +10318,7 @@
         <w:rPr>
           <w:color w:val="000000"/>
         </w:rPr>
-        <w:t xml:space="preserve">Verify the live </w:t>
-      </w:r>
-      <w:proofErr w:type="spellStart"/>
-      <w:r>
-        <w:rPr>
-          <w:color w:val="000000"/>
-        </w:rPr>
-        <w:t>PakVista</w:t>
-      </w:r>
-      <w:proofErr w:type="spellEnd"/>
-      <w:r>
-        <w:rPr>
-          <w:color w:val="000000"/>
-        </w:rPr>
-        <w:t xml:space="preserve"> Development site on Render reflects the newly added page.</w:t>
+        <w:t>Verify the live PakVista Development site on Render reflects the newly added page.</w:t>
       </w:r>
     </w:p>
     <w:p>
@@ -12452,25 +10632,7 @@
                 <w:sz w:val="20"/>
                 <w:szCs w:val="20"/>
               </w:rPr>
-              <w:t>Create a new GitHub repository from scratch (</w:t>
-            </w:r>
-            <w:proofErr w:type="spellStart"/>
-            <w:r>
-              <w:rPr>
-                <w:color w:val="000000"/>
-                <w:sz w:val="20"/>
-                <w:szCs w:val="20"/>
-              </w:rPr>
-              <w:t>pakvista-cicd</w:t>
-            </w:r>
-            <w:proofErr w:type="spellEnd"/>
-            <w:r>
-              <w:rPr>
-                <w:color w:val="000000"/>
-                <w:sz w:val="20"/>
-                <w:szCs w:val="20"/>
-              </w:rPr>
-              <w:t xml:space="preserve"> or team-agreed name). Do NOT reuse any previous assignment repository.</w:t>
+              <w:t>Create a new GitHub repository from scratch (pakvista-cicd or team-agreed name). Do NOT reuse any previous assignment repository.</w:t>
             </w:r>
           </w:p>
         </w:tc>
@@ -13549,43 +11711,7 @@
                 <w:sz w:val="20"/>
                 <w:szCs w:val="20"/>
               </w:rPr>
-              <w:t>ci-</w:t>
-            </w:r>
-            <w:proofErr w:type="spellStart"/>
-            <w:r>
-              <w:rPr>
-                <w:color w:val="000000"/>
-                <w:sz w:val="20"/>
-                <w:szCs w:val="20"/>
-              </w:rPr>
-              <w:t>dev.yml</w:t>
-            </w:r>
-            <w:proofErr w:type="spellEnd"/>
-            <w:r>
-              <w:rPr>
-                <w:color w:val="000000"/>
-                <w:sz w:val="20"/>
-                <w:szCs w:val="20"/>
-              </w:rPr>
-              <w:t xml:space="preserve">: correct </w:t>
-            </w:r>
-            <w:proofErr w:type="spellStart"/>
-            <w:r>
-              <w:rPr>
-                <w:color w:val="000000"/>
-                <w:sz w:val="20"/>
-                <w:szCs w:val="20"/>
-              </w:rPr>
-              <w:t>pull_request</w:t>
-            </w:r>
-            <w:proofErr w:type="spellEnd"/>
-            <w:r>
-              <w:rPr>
-                <w:color w:val="000000"/>
-                <w:sz w:val="20"/>
-                <w:szCs w:val="20"/>
-              </w:rPr>
-              <w:t xml:space="preserve"> trigger targeting develop, all five mandatory steps present and correctly configured.</w:t>
+              <w:t>ci-dev.yml: correct pull_request trigger targeting develop, all five mandatory steps present and correctly configured.</w:t>
             </w:r>
           </w:p>
         </w:tc>
@@ -13682,43 +11808,7 @@
                 <w:sz w:val="20"/>
                 <w:szCs w:val="20"/>
               </w:rPr>
-              <w:t>ci-</w:t>
-            </w:r>
-            <w:proofErr w:type="spellStart"/>
-            <w:r>
-              <w:rPr>
-                <w:color w:val="000000"/>
-                <w:sz w:val="20"/>
-                <w:szCs w:val="20"/>
-              </w:rPr>
-              <w:t>staging.yml</w:t>
-            </w:r>
-            <w:proofErr w:type="spellEnd"/>
-            <w:r>
-              <w:rPr>
-                <w:color w:val="000000"/>
-                <w:sz w:val="20"/>
-                <w:szCs w:val="20"/>
-              </w:rPr>
-              <w:t xml:space="preserve">: correct </w:t>
-            </w:r>
-            <w:proofErr w:type="spellStart"/>
-            <w:r>
-              <w:rPr>
-                <w:color w:val="000000"/>
-                <w:sz w:val="20"/>
-                <w:szCs w:val="20"/>
-              </w:rPr>
-              <w:t>pull_request</w:t>
-            </w:r>
-            <w:proofErr w:type="spellEnd"/>
-            <w:r>
-              <w:rPr>
-                <w:color w:val="000000"/>
-                <w:sz w:val="20"/>
-                <w:szCs w:val="20"/>
-              </w:rPr>
-              <w:t xml:space="preserve"> trigger targeting staging, environment-specific image tags (:staging-latest, :staging-&lt;sha&gt;), push to Docker Hub succeeds.</w:t>
+              <w:t>ci-staging.yml: correct pull_request trigger targeting staging, environment-specific image tags (:staging-latest, :staging-&lt;sha&gt;), push to Docker Hub succeeds.</w:t>
             </w:r>
           </w:p>
         </w:tc>
@@ -13815,43 +11905,7 @@
                 <w:sz w:val="20"/>
                 <w:szCs w:val="20"/>
               </w:rPr>
-              <w:t>ci-</w:t>
-            </w:r>
-            <w:proofErr w:type="spellStart"/>
-            <w:r>
-              <w:rPr>
-                <w:color w:val="000000"/>
-                <w:sz w:val="20"/>
-                <w:szCs w:val="20"/>
-              </w:rPr>
-              <w:t>prod.yml</w:t>
-            </w:r>
-            <w:proofErr w:type="spellEnd"/>
-            <w:r>
-              <w:rPr>
-                <w:color w:val="000000"/>
-                <w:sz w:val="20"/>
-                <w:szCs w:val="20"/>
-              </w:rPr>
-              <w:t xml:space="preserve">: correct </w:t>
-            </w:r>
-            <w:proofErr w:type="spellStart"/>
-            <w:r>
-              <w:rPr>
-                <w:color w:val="000000"/>
-                <w:sz w:val="20"/>
-                <w:szCs w:val="20"/>
-              </w:rPr>
-              <w:t>pull_request</w:t>
-            </w:r>
-            <w:proofErr w:type="spellEnd"/>
-            <w:r>
-              <w:rPr>
-                <w:color w:val="000000"/>
-                <w:sz w:val="20"/>
-                <w:szCs w:val="20"/>
-              </w:rPr>
-              <w:t xml:space="preserve"> trigger targeting main, environment-specific image tags (:prod-latest, :prod-&lt;sha&gt;), push to Docker Hub succeeds.</w:t>
+              <w:t>ci-prod.yml: correct pull_request trigger targeting main, environment-specific image tags (:prod-latest, :prod-&lt;sha&gt;), push to Docker Hub succeeds.</w:t>
             </w:r>
           </w:p>
         </w:tc>
@@ -14015,25 +12069,7 @@
                 <w:sz w:val="20"/>
                 <w:szCs w:val="20"/>
               </w:rPr>
-              <w:t>cd-</w:t>
-            </w:r>
-            <w:proofErr w:type="spellStart"/>
-            <w:r>
-              <w:rPr>
-                <w:color w:val="000000"/>
-                <w:sz w:val="20"/>
-                <w:szCs w:val="20"/>
-              </w:rPr>
-              <w:t>dev.yml</w:t>
-            </w:r>
-            <w:proofErr w:type="spellEnd"/>
-            <w:r>
-              <w:rPr>
-                <w:color w:val="000000"/>
-                <w:sz w:val="20"/>
-                <w:szCs w:val="20"/>
-              </w:rPr>
-              <w:t>: correct push trigger on develop, declares environment: development, curl POST to RENDER_DEPLOY_HOOK_DEV_URL, echo confirmation.</w:t>
+              <w:t>cd-dev.yml: correct push trigger on develop, declares environment: development, curl POST to RENDER_DEPLOY_HOOK_DEV_URL, echo confirmation.</w:t>
             </w:r>
           </w:p>
         </w:tc>
@@ -14130,25 +12166,7 @@
                 <w:sz w:val="20"/>
                 <w:szCs w:val="20"/>
               </w:rPr>
-              <w:t>cd-</w:t>
-            </w:r>
-            <w:proofErr w:type="spellStart"/>
-            <w:r>
-              <w:rPr>
-                <w:color w:val="000000"/>
-                <w:sz w:val="20"/>
-                <w:szCs w:val="20"/>
-              </w:rPr>
-              <w:t>staging.yml</w:t>
-            </w:r>
-            <w:proofErr w:type="spellEnd"/>
-            <w:r>
-              <w:rPr>
-                <w:color w:val="000000"/>
-                <w:sz w:val="20"/>
-                <w:szCs w:val="20"/>
-              </w:rPr>
-              <w:t>: correct push trigger on staging, declares environment: staging, curl POST to RENDER_DEPLOY_HOOK_STAGING_URL, echo confirmation.</w:t>
+              <w:t>cd-staging.yml: correct push trigger on staging, declares environment: staging, curl POST to RENDER_DEPLOY_HOOK_STAGING_URL, echo confirmation.</w:t>
             </w:r>
           </w:p>
         </w:tc>
@@ -14245,43 +12263,7 @@
                 <w:sz w:val="20"/>
                 <w:szCs w:val="20"/>
               </w:rPr>
-              <w:t>cd-</w:t>
-            </w:r>
-            <w:proofErr w:type="spellStart"/>
-            <w:r>
-              <w:rPr>
-                <w:color w:val="000000"/>
-                <w:sz w:val="20"/>
-                <w:szCs w:val="20"/>
-              </w:rPr>
-              <w:t>prod.yml</w:t>
-            </w:r>
-            <w:proofErr w:type="spellEnd"/>
-            <w:r>
-              <w:rPr>
-                <w:color w:val="000000"/>
-                <w:sz w:val="20"/>
-                <w:szCs w:val="20"/>
-              </w:rPr>
-              <w:t xml:space="preserve">: correct push trigger on main, declares environment: production, curl POST to RENDER_DEPLOY_HOOK_PROD_URL, echo confirmation. Live production </w:t>
-            </w:r>
-            <w:proofErr w:type="spellStart"/>
-            <w:r>
-              <w:rPr>
-                <w:color w:val="000000"/>
-                <w:sz w:val="20"/>
-                <w:szCs w:val="20"/>
-              </w:rPr>
-              <w:t>PakVista</w:t>
-            </w:r>
-            <w:proofErr w:type="spellEnd"/>
-            <w:r>
-              <w:rPr>
-                <w:color w:val="000000"/>
-                <w:sz w:val="20"/>
-                <w:szCs w:val="20"/>
-              </w:rPr>
-              <w:t xml:space="preserve"> on Render displays all five pages.</w:t>
+              <w:t>cd-prod.yml: correct push trigger on main, declares environment: production, curl POST to RENDER_DEPLOY_HOOK_PROD_URL, echo confirmation. Live production PakVista on Render displays all five pages.</w:t>
             </w:r>
           </w:p>
         </w:tc>
@@ -14752,21 +12734,7 @@
         <w:rPr>
           <w:color w:val="000000"/>
         </w:rPr>
-        <w:t>Screenshot 2: Each member's CI workflow run (ci-</w:t>
-      </w:r>
-      <w:proofErr w:type="spellStart"/>
-      <w:r>
-        <w:rPr>
-          <w:color w:val="000000"/>
-        </w:rPr>
-        <w:t>dev.yml</w:t>
-      </w:r>
-      <w:proofErr w:type="spellEnd"/>
-      <w:r>
-        <w:rPr>
-          <w:color w:val="000000"/>
-        </w:rPr>
-        <w:t>) triggered by their individual PR – all steps green. One screenshot per member or a combined view showing all members' runs.</w:t>
+        <w:t>Screenshot 2: Each member's CI workflow run (ci-dev.yml) triggered by their individual PR – all steps green. One screenshot per member or a combined view showing all members' runs.</w:t>
       </w:r>
     </w:p>
     <w:p>
@@ -14798,49 +12766,7 @@
         <w:rPr>
           <w:color w:val="000000"/>
         </w:rPr>
-        <w:t>Screenshot 4: All three CD workflow runs (cd-</w:t>
-      </w:r>
-      <w:proofErr w:type="spellStart"/>
-      <w:r>
-        <w:rPr>
-          <w:color w:val="000000"/>
-        </w:rPr>
-        <w:t>dev.yml</w:t>
-      </w:r>
-      <w:proofErr w:type="spellEnd"/>
-      <w:r>
-        <w:rPr>
-          <w:color w:val="000000"/>
-        </w:rPr>
-        <w:t>, cd-</w:t>
-      </w:r>
-      <w:proofErr w:type="spellStart"/>
-      <w:r>
-        <w:rPr>
-          <w:color w:val="000000"/>
-        </w:rPr>
-        <w:t>staging.yml</w:t>
-      </w:r>
-      <w:proofErr w:type="spellEnd"/>
-      <w:r>
-        <w:rPr>
-          <w:color w:val="000000"/>
-        </w:rPr>
-        <w:t>, cd-</w:t>
-      </w:r>
-      <w:proofErr w:type="spellStart"/>
-      <w:r>
-        <w:rPr>
-          <w:color w:val="000000"/>
-        </w:rPr>
-        <w:t>prod.yml</w:t>
-      </w:r>
-      <w:proofErr w:type="spellEnd"/>
-      <w:r>
-        <w:rPr>
-          <w:color w:val="000000"/>
-        </w:rPr>
-        <w:t>) – deploy step completed and confirmation echo visible.</w:t>
+        <w:t>Screenshot 4: All three CD workflow runs (cd-dev.yml, cd-staging.yml, cd-prod.yml) – deploy step completed and confirmation echo visible.</w:t>
       </w:r>
     </w:p>
     <w:p>
@@ -14856,21 +12782,7 @@
         <w:rPr>
           <w:color w:val="000000"/>
         </w:rPr>
-        <w:t xml:space="preserve">Screenshot 5: Live </w:t>
-      </w:r>
-      <w:proofErr w:type="spellStart"/>
-      <w:r>
-        <w:rPr>
-          <w:color w:val="000000"/>
-        </w:rPr>
-        <w:t>PakVista</w:t>
-      </w:r>
-      <w:proofErr w:type="spellEnd"/>
-      <w:r>
-        <w:rPr>
-          <w:color w:val="000000"/>
-        </w:rPr>
-        <w:t xml:space="preserve"> site on each of the three Render services showing all five pages are accessible (three screenshots total, one per environment).</w:t>
+        <w:t>Screenshot 5: Live PakVista site on each of the three Render services showing all five pages are accessible (three screenshots total, one per environment).</w:t>
       </w:r>
     </w:p>
     <w:p>
@@ -15142,6 +13054,9 @@
               <w:br/>
             </w:r>
             <w:r>
+              <w:rPr>
+                <w:noProof/>
+              </w:rPr>
               <w:drawing>
                 <wp:inline distT="0" distB="0" distL="0" distR="0" wp14:anchorId="42696D8C" wp14:editId="619C77AA">
                   <wp:extent cx="6400800" cy="3408045"/>
@@ -15191,25 +13106,150 @@
               <w:bottom w:val="single" w:sz="1" w:space="0" w:color="AAAAAA"/>
               <w:right w:val="single" w:sz="1" w:space="0" w:color="AAAAAA"/>
             </w:tcBorders>
-            <w:shd w:val="clear" w:color="auto" w:fill="EBF3FA"/>
-            <w:tcMar>
-              <w:top w:w="80" w:type="dxa"/>
-              <w:left w:w="120" w:type="dxa"/>
-              <w:bottom w:w="80" w:type="dxa"/>
-              <w:right w:w="120" w:type="dxa"/>
-            </w:tcMar>
-            <w:vAlign w:val="center"/>
-          </w:tcPr>
-          <w:p>
-            <w:r>
-              <w:rPr>
-                <w:b/>
-                <w:bCs/>
-                <w:color w:val="000000"/>
-                <w:sz w:val="20"/>
-                <w:szCs w:val="20"/>
-              </w:rPr>
-              <w:t>Docker Hub – Pushed Images with All Environment Tags (dev, staging, prod)</w:t>
+            <w:shd w:val="clear" w:color="auto" w:fill="FFFFFF"/>
+            <w:tcMar>
+              <w:top w:w="80" w:type="dxa"/>
+              <w:left w:w="120" w:type="dxa"/>
+              <w:bottom w:w="80" w:type="dxa"/>
+              <w:right w:w="120" w:type="dxa"/>
+            </w:tcMar>
+            <w:vAlign w:val="center"/>
+          </w:tcPr>
+          <w:p>
+            <w:pPr>
+              <w:rPr>
+                <w:b/>
+                <w:bCs/>
+                <w:color w:val="000000"/>
+                <w:sz w:val="20"/>
+                <w:szCs w:val="20"/>
+              </w:rPr>
+            </w:pPr>
+          </w:p>
+        </w:tc>
+        <w:tc>
+          <w:tcPr>
+            <w:tcW w:w="6160" w:type="dxa"/>
+            <w:tcBorders>
+              <w:top w:val="single" w:sz="1" w:space="0" w:color="AAAAAA"/>
+              <w:left w:val="single" w:sz="1" w:space="0" w:color="AAAAAA"/>
+              <w:bottom w:val="single" w:sz="1" w:space="0" w:color="AAAAAA"/>
+              <w:right w:val="single" w:sz="1" w:space="0" w:color="AAAAAA"/>
+            </w:tcBorders>
+            <w:shd w:val="clear" w:color="auto" w:fill="FFFFFF"/>
+            <w:tcMar>
+              <w:top w:w="80" w:type="dxa"/>
+              <w:left w:w="120" w:type="dxa"/>
+              <w:bottom w:w="80" w:type="dxa"/>
+              <w:right w:w="120" w:type="dxa"/>
+            </w:tcMar>
+          </w:tcPr>
+          <w:p>
+            <w:pPr>
+              <w:rPr>
+                <w:b/>
+                <w:bCs/>
+              </w:rPr>
+            </w:pPr>
+            <w:r>
+              <w:rPr>
+                <w:b/>
+                <w:bCs/>
+              </w:rPr>
+              <w:t>Member 3</w:t>
+            </w:r>
+          </w:p>
+          <w:p>
+            <w:pPr>
+              <w:rPr>
+                <w:b/>
+                <w:bCs/>
+              </w:rPr>
+            </w:pPr>
+            <w:r>
+              <w:rPr>
+                <w:b/>
+                <w:bCs/>
+              </w:rPr>
+              <w:drawing>
+                <wp:inline distT="0" distB="0" distL="0" distR="0" wp14:anchorId="39D6140F" wp14:editId="6682B9DC">
+                  <wp:extent cx="3352800" cy="3953301"/>
+                  <wp:effectExtent l="0" t="0" r="0" b="9525"/>
+                  <wp:docPr id="1" name="Picture 1"/>
+                  <wp:cNvGraphicFramePr>
+                    <a:graphicFrameLocks xmlns:a="http://schemas.openxmlformats.org/drawingml/2006/main" noChangeAspect="1"/>
+                  </wp:cNvGraphicFramePr>
+                  <a:graphic xmlns:a="http://schemas.openxmlformats.org/drawingml/2006/main">
+                    <a:graphicData uri="http://schemas.openxmlformats.org/drawingml/2006/picture">
+                      <pic:pic xmlns:pic="http://schemas.openxmlformats.org/drawingml/2006/picture">
+                        <pic:nvPicPr>
+                          <pic:cNvPr id="1" name=""/>
+                          <pic:cNvPicPr/>
+                        </pic:nvPicPr>
+                        <pic:blipFill>
+                          <a:blip r:embed="rId8"/>
+                          <a:stretch>
+                            <a:fillRect/>
+                          </a:stretch>
+                        </pic:blipFill>
+                        <pic:spPr>
+                          <a:xfrm>
+                            <a:off x="0" y="0"/>
+                            <a:ext cx="3358209" cy="3959679"/>
+                          </a:xfrm>
+                          <a:prstGeom prst="rect">
+                            <a:avLst/>
+                          </a:prstGeom>
+                        </pic:spPr>
+                      </pic:pic>
+                    </a:graphicData>
+                  </a:graphic>
+                </wp:inline>
+              </w:drawing>
+            </w:r>
+          </w:p>
+        </w:tc>
+      </w:tr>
+      <w:tr>
+        <w:tc>
+          <w:tcPr>
+            <w:tcW w:w="3200" w:type="dxa"/>
+            <w:tcBorders>
+              <w:top w:val="single" w:sz="1" w:space="0" w:color="AAAAAA"/>
+              <w:left w:val="single" w:sz="1" w:space="0" w:color="AAAAAA"/>
+              <w:bottom w:val="single" w:sz="1" w:space="0" w:color="AAAAAA"/>
+              <w:right w:val="single" w:sz="1" w:space="0" w:color="AAAAAA"/>
+            </w:tcBorders>
+            <w:shd w:val="clear" w:color="auto" w:fill="EBF3FA"/>
+            <w:tcMar>
+              <w:top w:w="80" w:type="dxa"/>
+              <w:left w:w="120" w:type="dxa"/>
+              <w:bottom w:w="80" w:type="dxa"/>
+              <w:right w:w="120" w:type="dxa"/>
+            </w:tcMar>
+            <w:vAlign w:val="center"/>
+          </w:tcPr>
+          <w:p>
+            <w:r>
+              <w:rPr>
+                <w:b/>
+                <w:bCs/>
+                <w:color w:val="000000"/>
+                <w:sz w:val="20"/>
+                <w:szCs w:val="20"/>
+              </w:rPr>
+              <w:t xml:space="preserve">Docker Hub – Pushed Images with All </w:t>
+            </w:r>
+            <w:r>
+              <w:rPr>
+                <w:b/>
+                <w:bCs/>
+                <w:color w:val="000000"/>
+                <w:sz w:val="20"/>
+                <w:szCs w:val="20"/>
+              </w:rPr>
+              <w:lastRenderedPageBreak/>
+              <w:t>Environment Tags (dev, staging, prod)</w:t>
             </w:r>
           </w:p>
         </w:tc>
@@ -15239,6 +13279,7 @@
                 <w:sz w:val="20"/>
                 <w:szCs w:val="20"/>
               </w:rPr>
+              <w:lastRenderedPageBreak/>
               <w:t>[Paste screenshot here]</w:t>
             </w:r>
           </w:p>
@@ -15335,29 +13376,7 @@
                 <w:sz w:val="20"/>
                 <w:szCs w:val="20"/>
               </w:rPr>
-              <w:t xml:space="preserve">Live </w:t>
-            </w:r>
-            <w:proofErr w:type="spellStart"/>
-            <w:r>
-              <w:rPr>
-                <w:b/>
-                <w:bCs/>
-                <w:color w:val="000000"/>
-                <w:sz w:val="20"/>
-                <w:szCs w:val="20"/>
-              </w:rPr>
-              <w:t>PakVista</w:t>
-            </w:r>
-            <w:proofErr w:type="spellEnd"/>
-            <w:r>
-              <w:rPr>
-                <w:b/>
-                <w:bCs/>
-                <w:color w:val="000000"/>
-                <w:sz w:val="20"/>
-                <w:szCs w:val="20"/>
-              </w:rPr>
-              <w:t xml:space="preserve"> – Development Render Service (all 5 pages accessible)</w:t>
+              <w:t>Live PakVista – Development Render Service (all 5 pages accessible)</w:t>
             </w:r>
           </w:p>
         </w:tc>
@@ -15420,29 +13439,7 @@
                 <w:sz w:val="20"/>
                 <w:szCs w:val="20"/>
               </w:rPr>
-              <w:t xml:space="preserve">Live </w:t>
-            </w:r>
-            <w:proofErr w:type="spellStart"/>
-            <w:r>
-              <w:rPr>
-                <w:b/>
-                <w:bCs/>
-                <w:color w:val="000000"/>
-                <w:sz w:val="20"/>
-                <w:szCs w:val="20"/>
-              </w:rPr>
-              <w:t>PakVista</w:t>
-            </w:r>
-            <w:proofErr w:type="spellEnd"/>
-            <w:r>
-              <w:rPr>
-                <w:b/>
-                <w:bCs/>
-                <w:color w:val="000000"/>
-                <w:sz w:val="20"/>
-                <w:szCs w:val="20"/>
-              </w:rPr>
-              <w:t xml:space="preserve"> – Staging Render Service (all 5 pages accessible)</w:t>
+              <w:t>Live PakVista – Staging Render Service (all 5 pages accessible)</w:t>
             </w:r>
           </w:p>
         </w:tc>
@@ -15505,30 +13502,7 @@
                 <w:sz w:val="20"/>
                 <w:szCs w:val="20"/>
               </w:rPr>
-              <w:lastRenderedPageBreak/>
-              <w:t xml:space="preserve">Live </w:t>
-            </w:r>
-            <w:proofErr w:type="spellStart"/>
-            <w:r>
-              <w:rPr>
-                <w:b/>
-                <w:bCs/>
-                <w:color w:val="000000"/>
-                <w:sz w:val="20"/>
-                <w:szCs w:val="20"/>
-              </w:rPr>
-              <w:t>PakVista</w:t>
-            </w:r>
-            <w:proofErr w:type="spellEnd"/>
-            <w:r>
-              <w:rPr>
-                <w:b/>
-                <w:bCs/>
-                <w:color w:val="000000"/>
-                <w:sz w:val="20"/>
-                <w:szCs w:val="20"/>
-              </w:rPr>
-              <w:t xml:space="preserve"> – Production Render Service (all 5 pages accessible)</w:t>
+              <w:t>Live PakVista – Production Render Service (all 5 pages accessible)</w:t>
             </w:r>
           </w:p>
         </w:tc>
@@ -15699,23 +13673,7 @@
         <w:spacing w:before="160" w:after="40"/>
       </w:pPr>
       <w:r>
-        <w:t xml:space="preserve">During this term project, I learned how a multi-environment CI/CD pipeline automates software delivery from code changes to a live website. I built lahore.html as Member 2, creating a complete destination page about Badshahi Mosque, Lahore Fort, and Shalimar Gardens while linking to the shared style.css and following the same navigation and layout used across </w:t>
-      </w:r>
-      <w:proofErr w:type="spellStart"/>
-      <w:r>
-        <w:t>PakVista</w:t>
-      </w:r>
-      <w:proofErr w:type="spellEnd"/>
-      <w:r>
-        <w:t>. I also authored cd-</w:t>
-      </w:r>
-      <w:proofErr w:type="spellStart"/>
-      <w:r>
-        <w:t>dev.yml</w:t>
-      </w:r>
-      <w:proofErr w:type="spellEnd"/>
-      <w:r>
-        <w:t>, which triggers an automatic deployment to the Render development environment whenever changes are merged into the develop branch. One challenge I faced was that some external image links did not display correctly on the page, so I replaced them with verified image URLs from TripAdvisor, Britannica, and Wikimedia Commons. This project helped me understand how developers, GitHub Actions, Docker, and Render work together to deliver updates quickly and reliably.</w:t>
+        <w:t>During this term project, I learned how a multi-environment CI/CD pipeline automates software delivery from code changes to a live website. I built lahore.html as Member 2, creating a complete destination page about Badshahi Mosque, Lahore Fort, and Shalimar Gardens while linking to the shared style.css and following the same navigation and layout used across PakVista. I also authored cd-dev.yml, which triggers an automatic deployment to the Render development environment whenever changes are merged into the develop branch. One challenge I faced was that some external image links did not display correctly on the page, so I replaced them with verified image URLs from TripAdvisor, Britannica, and Wikimedia Commons. This project helped me understand how developers, GitHub Actions, Docker, and Render work together to deliver updates quickly and reliably.</w:t>
       </w:r>
     </w:p>
     <w:p/>
@@ -15730,6 +13688,44 @@
           <w:color w:val="2E75B6"/>
         </w:rPr>
         <w:t>Member 3: [Student Name] – Reflection</w:t>
+      </w:r>
+    </w:p>
+    <w:p>
+      <w:r>
+        <w:t xml:space="preserve">As Member 3, I worked on the Hunza Valley page and the CI workflow for the staging environment. </w:t>
+      </w:r>
+    </w:p>
+    <w:p>
+      <w:r>
+        <w:t xml:space="preserve">I learned how a feature branch is created from develop and how Pull Requests are used in a DevOps workflow. </w:t>
+      </w:r>
+    </w:p>
+    <w:p>
+      <w:r>
+        <w:t xml:space="preserve">While writing ci-staging.yml, I understood how GitHub Actions can lint code, build a project, and push Docker images to Docker Hub. </w:t>
+      </w:r>
+    </w:p>
+    <w:p>
+      <w:r>
+        <w:t xml:space="preserve">The main challenge was understanding the difference between development and staging triggers, but I resolved it by checking the branch-based workflow rules. </w:t>
+      </w:r>
+    </w:p>
+    <w:p>
+      <w:r>
+        <w:t>This task helped me understand how CI/CD supports automated and reliable deployment.</w:t>
+      </w:r>
+    </w:p>
+    <w:p>
+      <w:pPr>
+        <w:spacing w:before="100" w:after="40"/>
+      </w:pPr>
+      <w:r>
+        <w:rPr>
+          <w:b/>
+          <w:bCs/>
+          <w:color w:val="2E75B6"/>
+        </w:rPr>
+        <w:t>Member 4: [Student Name] – Reflection</w:t>
       </w:r>
     </w:p>
     <w:p>
@@ -15759,7 +13755,7 @@
           <w:bCs/>
           <w:color w:val="2E75B6"/>
         </w:rPr>
-        <w:t>Member 4: [Student Name] – Reflection</w:t>
+        <w:t>Member 5: [Student Name] – Reflection</w:t>
       </w:r>
     </w:p>
     <w:p>
@@ -15780,36 +13776,6 @@
     </w:p>
     <w:p/>
     <w:p>
-      <w:pPr>
-        <w:spacing w:before="100" w:after="40"/>
-      </w:pPr>
-      <w:r>
-        <w:rPr>
-          <w:b/>
-          <w:bCs/>
-          <w:color w:val="2E75B6"/>
-        </w:rPr>
-        <w:t>Member 5: [Student Name] – Reflection</w:t>
-      </w:r>
-    </w:p>
-    <w:p>
-      <w:pPr>
-        <w:pBdr>
-          <w:bottom w:val="single" w:sz="2" w:space="1" w:color="CCCCCC"/>
-        </w:pBdr>
-        <w:spacing w:before="160" w:after="40"/>
-      </w:pPr>
-      <w:r>
-        <w:rPr>
-          <w:i/>
-          <w:iCs/>
-          <w:color w:val="595959"/>
-        </w:rPr>
-        <w:t>[Write your 4–5 line reflection here]</w:t>
-      </w:r>
-    </w:p>
-    <w:p/>
-    <w:p>
       <w:r>
         <w:br w:type="page"/>
       </w:r>
@@ -15831,21 +13797,7 @@
         <w:rPr>
           <w:color w:val="000000"/>
         </w:rPr>
-        <w:t xml:space="preserve">All technical work must align with the official documentation listed below. Students are expected to consult these resources while building their workflow files, </w:t>
-      </w:r>
-      <w:proofErr w:type="spellStart"/>
-      <w:r>
-        <w:rPr>
-          <w:color w:val="000000"/>
-        </w:rPr>
-        <w:t>Dockerfile</w:t>
-      </w:r>
-      <w:proofErr w:type="spellEnd"/>
-      <w:r>
-        <w:rPr>
-          <w:color w:val="000000"/>
-        </w:rPr>
-        <w:t>, and HTML pages.</w:t>
+        <w:t>All technical work must align with the official documentation listed below. Students are expected to consult these resources while building their workflow files, Dockerfile, and HTML pages.</w:t>
       </w:r>
     </w:p>
     <w:p/>
@@ -16092,29 +14044,7 @@
                 <w:sz w:val="20"/>
                 <w:szCs w:val="20"/>
               </w:rPr>
-              <w:t>GitHub Actions – Contexts (</w:t>
-            </w:r>
-            <w:proofErr w:type="spellStart"/>
-            <w:r>
-              <w:rPr>
-                <w:b/>
-                <w:bCs/>
-                <w:color w:val="000000"/>
-                <w:sz w:val="20"/>
-                <w:szCs w:val="20"/>
-              </w:rPr>
-              <w:t>github.sha</w:t>
-            </w:r>
-            <w:proofErr w:type="spellEnd"/>
-            <w:r>
-              <w:rPr>
-                <w:b/>
-                <w:bCs/>
-                <w:color w:val="000000"/>
-                <w:sz w:val="20"/>
-                <w:szCs w:val="20"/>
-              </w:rPr>
-              <w:t>, secrets, etc.)</w:t>
+              <w:t>GitHub Actions – Contexts (github.sha, secrets, etc.)</w:t>
             </w:r>
           </w:p>
         </w:tc>
@@ -16726,27 +14656,15 @@
             <w:vAlign w:val="center"/>
           </w:tcPr>
           <w:p>
-            <w:proofErr w:type="spellStart"/>
-            <w:r>
-              <w:rPr>
-                <w:b/>
-                <w:bCs/>
-                <w:color w:val="000000"/>
-                <w:sz w:val="20"/>
-                <w:szCs w:val="20"/>
-              </w:rPr>
-              <w:t>Dockerfile</w:t>
-            </w:r>
-            <w:proofErr w:type="spellEnd"/>
-            <w:r>
-              <w:rPr>
-                <w:b/>
-                <w:bCs/>
-                <w:color w:val="000000"/>
-                <w:sz w:val="20"/>
-                <w:szCs w:val="20"/>
-              </w:rPr>
-              <w:t xml:space="preserve"> Reference</w:t>
+            <w:r>
+              <w:rPr>
+                <w:b/>
+                <w:bCs/>
+                <w:color w:val="000000"/>
+                <w:sz w:val="20"/>
+                <w:szCs w:val="20"/>
+              </w:rPr>
+              <w:t>Dockerfile Reference</w:t>
             </w:r>
           </w:p>
         </w:tc>
@@ -17156,8 +15074,8 @@
     </w:tbl>
     <w:p/>
     <w:sectPr>
-      <w:headerReference w:type="default" r:id="rId8"/>
-      <w:footerReference w:type="default" r:id="rId9"/>
+      <w:headerReference w:type="default" r:id="rId9"/>
+      <w:footerReference w:type="default" r:id="rId10"/>
       <w:pgSz w:w="12240" w:h="15840"/>
       <w:pgMar w:top="1080" w:right="1080" w:bottom="1080" w:left="1080" w:header="708" w:footer="708" w:gutter="0"/>
       <w:cols w:space="720"/>
@@ -17168,7 +15086,7 @@
 </file>
 
 <file path=word/endnotes.xml><?xml version="1.0" encoding="utf-8"?>
-<w:endnotes xmlns:wpc="http://schemas.microsoft.com/office/word/2010/wordprocessingCanvas" xmlns:cx="http://schemas.microsoft.com/office/drawing/2014/chartex" xmlns:cx1="http://schemas.microsoft.com/office/drawing/2015/9/8/chartex" xmlns:cx2="http://schemas.microsoft.com/office/drawing/2015/10/21/chartex" xmlns:cx3="http://schemas.microsoft.com/office/drawing/2016/5/9/chartex" xmlns:cx4="http://schemas.microsoft.com/office/drawing/2016/5/10/chartex" xmlns:cx5="http://schemas.microsoft.com/office/drawing/2016/5/11/chartex" xmlns:cx6="http://schemas.microsoft.com/office/drawing/2016/5/12/chartex" xmlns:cx7="http://schemas.microsoft.com/office/drawing/2016/5/13/chartex" xmlns:cx8="http://schemas.microsoft.com/office/drawing/2016/5/14/chartex" xmlns:mc="http://schemas.openxmlformats.org/markup-compatibility/2006" xmlns:aink="http://schemas.microsoft.com/office/drawing/2016/ink" xmlns:am3d="http://schemas.microsoft.com/office/drawing/2017/model3d" xmlns:o="urn:schemas-microsoft-com:office:office" xmlns:oel="http://schemas.microsoft.com/office/2019/extlst" xmlns:r="http://schemas.openxmlformats.org/officeDocument/2006/relationships" xmlns:m="http://schemas.openxmlformats.org/officeDocument/2006/math" xmlns:v="urn:schemas-microsoft-com:vml" xmlns:wp14="http://schemas.microsoft.com/office/word/2010/wordprocessingDrawing" xmlns:wp="http://schemas.openxmlformats.org/drawingml/2006/wordprocessingDrawing" xmlns:w10="urn:schemas-microsoft-com:office:word" xmlns:w="http://schemas.openxmlformats.org/wordprocessingml/2006/main" xmlns:w14="http://schemas.microsoft.com/office/word/2010/wordml" xmlns:w15="http://schemas.microsoft.com/office/word/2012/wordml" xmlns:w16cex="http://schemas.microsoft.com/office/word/2018/wordml/cex" xmlns:w16cid="http://schemas.microsoft.com/office/word/2016/wordml/cid" xmlns:w16="http://schemas.microsoft.com/office/word/2018/wordml" xmlns:w16du="http://schemas.microsoft.com/office/word/2023/wordml/word16du" xmlns:w16sdtdh="http://schemas.microsoft.com/office/word/2020/wordml/sdtdatahash" xmlns:w16sdtfl="http://schemas.microsoft.com/office/word/2024/wordml/sdtformatlock" xmlns:w16se="http://schemas.microsoft.com/office/word/2015/wordml/symex" xmlns:wpg="http://schemas.microsoft.com/office/word/2010/wordprocessingGroup" xmlns:wpi="http://schemas.microsoft.com/office/word/2010/wordprocessingInk" xmlns:wne="http://schemas.microsoft.com/office/word/2006/wordml" xmlns:wps="http://schemas.microsoft.com/office/word/2010/wordprocessingShape" mc:Ignorable="w14 w15 w16se w16cid w16 w16cex w16sdtdh w16sdtfl w16du wp14">
+<w:endnotes xmlns:wpc="http://schemas.microsoft.com/office/word/2010/wordprocessingCanvas" xmlns:cx="http://schemas.microsoft.com/office/drawing/2014/chartex" xmlns:cx1="http://schemas.microsoft.com/office/drawing/2015/9/8/chartex" xmlns:cx2="http://schemas.microsoft.com/office/drawing/2015/10/21/chartex" xmlns:cx3="http://schemas.microsoft.com/office/drawing/2016/5/9/chartex" xmlns:cx4="http://schemas.microsoft.com/office/drawing/2016/5/10/chartex" xmlns:cx5="http://schemas.microsoft.com/office/drawing/2016/5/11/chartex" xmlns:cx6="http://schemas.microsoft.com/office/drawing/2016/5/12/chartex" xmlns:cx7="http://schemas.microsoft.com/office/drawing/2016/5/13/chartex" xmlns:cx8="http://schemas.microsoft.com/office/drawing/2016/5/14/chartex" xmlns:mc="http://schemas.openxmlformats.org/markup-compatibility/2006" xmlns:aink="http://schemas.microsoft.com/office/drawing/2016/ink" xmlns:am3d="http://schemas.microsoft.com/office/drawing/2017/model3d" xmlns:o="urn:schemas-microsoft-com:office:office" xmlns:oel="http://schemas.microsoft.com/office/2019/extlst" xmlns:r="http://schemas.openxmlformats.org/officeDocument/2006/relationships" xmlns:m="http://schemas.openxmlformats.org/officeDocument/2006/math" xmlns:v="urn:schemas-microsoft-com:vml" xmlns:wp14="http://schemas.microsoft.com/office/word/2010/wordprocessingDrawing" xmlns:wp="http://schemas.openxmlformats.org/drawingml/2006/wordprocessingDrawing" xmlns:w10="urn:schemas-microsoft-com:office:word" xmlns:w="http://schemas.openxmlformats.org/wordprocessingml/2006/main" xmlns:w14="http://schemas.microsoft.com/office/word/2010/wordml" xmlns:w15="http://schemas.microsoft.com/office/word/2012/wordml" xmlns:w16cex="http://schemas.microsoft.com/office/word/2018/wordml/cex" xmlns:w16cid="http://schemas.microsoft.com/office/word/2016/wordml/cid" xmlns:w16="http://schemas.microsoft.com/office/word/2018/wordml" xmlns:w16sdtdh="http://schemas.microsoft.com/office/word/2020/wordml/sdtdatahash" xmlns:w16se="http://schemas.microsoft.com/office/word/2015/wordml/symex" xmlns:wpg="http://schemas.microsoft.com/office/word/2010/wordprocessingGroup" xmlns:wpi="http://schemas.microsoft.com/office/word/2010/wordprocessingInk" xmlns:wne="http://schemas.microsoft.com/office/word/2006/wordml" xmlns:wps="http://schemas.microsoft.com/office/word/2010/wordprocessingShape" mc:Ignorable="w14 w15 w16se w16cid w16 w16cex w16sdtdh wp14">
   <w:endnote w:type="separator" w:id="-1">
     <w:p>
       <w:r>
@@ -17187,7 +15105,7 @@
 </file>
 
 <file path=word/footer1.xml><?xml version="1.0" encoding="utf-8"?>
-<w:ftr xmlns:wpc="http://schemas.microsoft.com/office/word/2010/wordprocessingCanvas" xmlns:cx="http://schemas.microsoft.com/office/drawing/2014/chartex" xmlns:cx1="http://schemas.microsoft.com/office/drawing/2015/9/8/chartex" xmlns:cx2="http://schemas.microsoft.com/office/drawing/2015/10/21/chartex" xmlns:cx3="http://schemas.microsoft.com/office/drawing/2016/5/9/chartex" xmlns:cx4="http://schemas.microsoft.com/office/drawing/2016/5/10/chartex" xmlns:cx5="http://schemas.microsoft.com/office/drawing/2016/5/11/chartex" xmlns:cx6="http://schemas.microsoft.com/office/drawing/2016/5/12/chartex" xmlns:cx7="http://schemas.microsoft.com/office/drawing/2016/5/13/chartex" xmlns:cx8="http://schemas.microsoft.com/office/drawing/2016/5/14/chartex" xmlns:mc="http://schemas.openxmlformats.org/markup-compatibility/2006" xmlns:aink="http://schemas.microsoft.com/office/drawing/2016/ink" xmlns:am3d="http://schemas.microsoft.com/office/drawing/2017/model3d" xmlns:o="urn:schemas-microsoft-com:office:office" xmlns:oel="http://schemas.microsoft.com/office/2019/extlst" xmlns:r="http://schemas.openxmlformats.org/officeDocument/2006/relationships" xmlns:m="http://schemas.openxmlformats.org/officeDocument/2006/math" xmlns:v="urn:schemas-microsoft-com:vml" xmlns:wp14="http://schemas.microsoft.com/office/word/2010/wordprocessingDrawing" xmlns:wp="http://schemas.openxmlformats.org/drawingml/2006/wordprocessingDrawing" xmlns:w10="urn:schemas-microsoft-com:office:word" xmlns:w="http://schemas.openxmlformats.org/wordprocessingml/2006/main" xmlns:w14="http://schemas.microsoft.com/office/word/2010/wordml" xmlns:w15="http://schemas.microsoft.com/office/word/2012/wordml" xmlns:w16cex="http://schemas.microsoft.com/office/word/2018/wordml/cex" xmlns:w16cid="http://schemas.microsoft.com/office/word/2016/wordml/cid" xmlns:w16="http://schemas.microsoft.com/office/word/2018/wordml" xmlns:w16du="http://schemas.microsoft.com/office/word/2023/wordml/word16du" xmlns:w16sdtdh="http://schemas.microsoft.com/office/word/2020/wordml/sdtdatahash" xmlns:w16sdtfl="http://schemas.microsoft.com/office/word/2024/wordml/sdtformatlock" xmlns:w16se="http://schemas.microsoft.com/office/word/2015/wordml/symex" xmlns:wpg="http://schemas.microsoft.com/office/word/2010/wordprocessingGroup" xmlns:wpi="http://schemas.microsoft.com/office/word/2010/wordprocessingInk" xmlns:wne="http://schemas.microsoft.com/office/word/2006/wordml" xmlns:wps="http://schemas.microsoft.com/office/word/2010/wordprocessingShape" mc:Ignorable="w14 w15 w16se w16cid w16 w16cex w16sdtdh w16sdtfl w16du wp14">
+<w:ftr xmlns:wpc="http://schemas.microsoft.com/office/word/2010/wordprocessingCanvas" xmlns:cx="http://schemas.microsoft.com/office/drawing/2014/chartex" xmlns:cx1="http://schemas.microsoft.com/office/drawing/2015/9/8/chartex" xmlns:cx2="http://schemas.microsoft.com/office/drawing/2015/10/21/chartex" xmlns:cx3="http://schemas.microsoft.com/office/drawing/2016/5/9/chartex" xmlns:cx4="http://schemas.microsoft.com/office/drawing/2016/5/10/chartex" xmlns:cx5="http://schemas.microsoft.com/office/drawing/2016/5/11/chartex" xmlns:cx6="http://schemas.microsoft.com/office/drawing/2016/5/12/chartex" xmlns:cx7="http://schemas.microsoft.com/office/drawing/2016/5/13/chartex" xmlns:cx8="http://schemas.microsoft.com/office/drawing/2016/5/14/chartex" xmlns:mc="http://schemas.openxmlformats.org/markup-compatibility/2006" xmlns:aink="http://schemas.microsoft.com/office/drawing/2016/ink" xmlns:am3d="http://schemas.microsoft.com/office/drawing/2017/model3d" xmlns:o="urn:schemas-microsoft-com:office:office" xmlns:oel="http://schemas.microsoft.com/office/2019/extlst" xmlns:r="http://schemas.openxmlformats.org/officeDocument/2006/relationships" xmlns:m="http://schemas.openxmlformats.org/officeDocument/2006/math" xmlns:v="urn:schemas-microsoft-com:vml" xmlns:wp14="http://schemas.microsoft.com/office/word/2010/wordprocessingDrawing" xmlns:wp="http://schemas.openxmlformats.org/drawingml/2006/wordprocessingDrawing" xmlns:w10="urn:schemas-microsoft-com:office:word" xmlns:w="http://schemas.openxmlformats.org/wordprocessingml/2006/main" xmlns:w14="http://schemas.microsoft.com/office/word/2010/wordml" xmlns:w15="http://schemas.microsoft.com/office/word/2012/wordml" xmlns:w16cex="http://schemas.microsoft.com/office/word/2018/wordml/cex" xmlns:w16cid="http://schemas.microsoft.com/office/word/2016/wordml/cid" xmlns:w16="http://schemas.microsoft.com/office/word/2018/wordml" xmlns:w16sdtdh="http://schemas.microsoft.com/office/word/2020/wordml/sdtdatahash" xmlns:w16se="http://schemas.microsoft.com/office/word/2015/wordml/symex" xmlns:wpg="http://schemas.microsoft.com/office/word/2010/wordprocessingGroup" xmlns:wpi="http://schemas.microsoft.com/office/word/2010/wordprocessingInk" xmlns:wne="http://schemas.microsoft.com/office/word/2006/wordml" xmlns:wps="http://schemas.microsoft.com/office/word/2010/wordprocessingShape" mc:Ignorable="w14 w15 w16se w16cid w16 w16cex w16sdtdh wp14">
   <w:p>
     <w:pPr>
       <w:pBdr>
@@ -17309,7 +15227,7 @@
 </file>
 
 <file path=word/footnotes.xml><?xml version="1.0" encoding="utf-8"?>
-<w:footnotes xmlns:wpc="http://schemas.microsoft.com/office/word/2010/wordprocessingCanvas" xmlns:cx="http://schemas.microsoft.com/office/drawing/2014/chartex" xmlns:cx1="http://schemas.microsoft.com/office/drawing/2015/9/8/chartex" xmlns:cx2="http://schemas.microsoft.com/office/drawing/2015/10/21/chartex" xmlns:cx3="http://schemas.microsoft.com/office/drawing/2016/5/9/chartex" xmlns:cx4="http://schemas.microsoft.com/office/drawing/2016/5/10/chartex" xmlns:cx5="http://schemas.microsoft.com/office/drawing/2016/5/11/chartex" xmlns:cx6="http://schemas.microsoft.com/office/drawing/2016/5/12/chartex" xmlns:cx7="http://schemas.microsoft.com/office/drawing/2016/5/13/chartex" xmlns:cx8="http://schemas.microsoft.com/office/drawing/2016/5/14/chartex" xmlns:mc="http://schemas.openxmlformats.org/markup-compatibility/2006" xmlns:aink="http://schemas.microsoft.com/office/drawing/2016/ink" xmlns:am3d="http://schemas.microsoft.com/office/drawing/2017/model3d" xmlns:o="urn:schemas-microsoft-com:office:office" xmlns:oel="http://schemas.microsoft.com/office/2019/extlst" xmlns:r="http://schemas.openxmlformats.org/officeDocument/2006/relationships" xmlns:m="http://schemas.openxmlformats.org/officeDocument/2006/math" xmlns:v="urn:schemas-microsoft-com:vml" xmlns:wp14="http://schemas.microsoft.com/office/word/2010/wordprocessingDrawing" xmlns:wp="http://schemas.openxmlformats.org/drawingml/2006/wordprocessingDrawing" xmlns:w10="urn:schemas-microsoft-com:office:word" xmlns:w="http://schemas.openxmlformats.org/wordprocessingml/2006/main" xmlns:w14="http://schemas.microsoft.com/office/word/2010/wordml" xmlns:w15="http://schemas.microsoft.com/office/word/2012/wordml" xmlns:w16cex="http://schemas.microsoft.com/office/word/2018/wordml/cex" xmlns:w16cid="http://schemas.microsoft.com/office/word/2016/wordml/cid" xmlns:w16="http://schemas.microsoft.com/office/word/2018/wordml" xmlns:w16du="http://schemas.microsoft.com/office/word/2023/wordml/word16du" xmlns:w16sdtdh="http://schemas.microsoft.com/office/word/2020/wordml/sdtdatahash" xmlns:w16sdtfl="http://schemas.microsoft.com/office/word/2024/wordml/sdtformatlock" xmlns:w16se="http://schemas.microsoft.com/office/word/2015/wordml/symex" xmlns:wpg="http://schemas.microsoft.com/office/word/2010/wordprocessingGroup" xmlns:wpi="http://schemas.microsoft.com/office/word/2010/wordprocessingInk" xmlns:wne="http://schemas.microsoft.com/office/word/2006/wordml" xmlns:wps="http://schemas.microsoft.com/office/word/2010/wordprocessingShape" mc:Ignorable="w14 w15 w16se w16cid w16 w16cex w16sdtdh w16sdtfl w16du wp14">
+<w:footnotes xmlns:wpc="http://schemas.microsoft.com/office/word/2010/wordprocessingCanvas" xmlns:cx="http://schemas.microsoft.com/office/drawing/2014/chartex" xmlns:cx1="http://schemas.microsoft.com/office/drawing/2015/9/8/chartex" xmlns:cx2="http://schemas.microsoft.com/office/drawing/2015/10/21/chartex" xmlns:cx3="http://schemas.microsoft.com/office/drawing/2016/5/9/chartex" xmlns:cx4="http://schemas.microsoft.com/office/drawing/2016/5/10/chartex" xmlns:cx5="http://schemas.microsoft.com/office/drawing/2016/5/11/chartex" xmlns:cx6="http://schemas.microsoft.com/office/drawing/2016/5/12/chartex" xmlns:cx7="http://schemas.microsoft.com/office/drawing/2016/5/13/chartex" xmlns:cx8="http://schemas.microsoft.com/office/drawing/2016/5/14/chartex" xmlns:mc="http://schemas.openxmlformats.org/markup-compatibility/2006" xmlns:aink="http://schemas.microsoft.com/office/drawing/2016/ink" xmlns:am3d="http://schemas.microsoft.com/office/drawing/2017/model3d" xmlns:o="urn:schemas-microsoft-com:office:office" xmlns:oel="http://schemas.microsoft.com/office/2019/extlst" xmlns:r="http://schemas.openxmlformats.org/officeDocument/2006/relationships" xmlns:m="http://schemas.openxmlformats.org/officeDocument/2006/math" xmlns:v="urn:schemas-microsoft-com:vml" xmlns:wp14="http://schemas.microsoft.com/office/word/2010/wordprocessingDrawing" xmlns:wp="http://schemas.openxmlformats.org/drawingml/2006/wordprocessingDrawing" xmlns:w10="urn:schemas-microsoft-com:office:word" xmlns:w="http://schemas.openxmlformats.org/wordprocessingml/2006/main" xmlns:w14="http://schemas.microsoft.com/office/word/2010/wordml" xmlns:w15="http://schemas.microsoft.com/office/word/2012/wordml" xmlns:w16cex="http://schemas.microsoft.com/office/word/2018/wordml/cex" xmlns:w16cid="http://schemas.microsoft.com/office/word/2016/wordml/cid" xmlns:w16="http://schemas.microsoft.com/office/word/2018/wordml" xmlns:w16sdtdh="http://schemas.microsoft.com/office/word/2020/wordml/sdtdatahash" xmlns:w16se="http://schemas.microsoft.com/office/word/2015/wordml/symex" xmlns:wpg="http://schemas.microsoft.com/office/word/2010/wordprocessingGroup" xmlns:wpi="http://schemas.microsoft.com/office/word/2010/wordprocessingInk" xmlns:wne="http://schemas.microsoft.com/office/word/2006/wordml" xmlns:wps="http://schemas.microsoft.com/office/word/2010/wordprocessingShape" mc:Ignorable="w14 w15 w16se w16cid w16 w16cex w16sdtdh wp14">
   <w:footnote w:type="separator" w:id="-1">
     <w:p>
       <w:r>
@@ -17328,7 +15246,7 @@
 </file>
 
 <file path=word/header1.xml><?xml version="1.0" encoding="utf-8"?>
-<w:hdr xmlns:wpc="http://schemas.microsoft.com/office/word/2010/wordprocessingCanvas" xmlns:cx="http://schemas.microsoft.com/office/drawing/2014/chartex" xmlns:cx1="http://schemas.microsoft.com/office/drawing/2015/9/8/chartex" xmlns:cx2="http://schemas.microsoft.com/office/drawing/2015/10/21/chartex" xmlns:cx3="http://schemas.microsoft.com/office/drawing/2016/5/9/chartex" xmlns:cx4="http://schemas.microsoft.com/office/drawing/2016/5/10/chartex" xmlns:cx5="http://schemas.microsoft.com/office/drawing/2016/5/11/chartex" xmlns:cx6="http://schemas.microsoft.com/office/drawing/2016/5/12/chartex" xmlns:cx7="http://schemas.microsoft.com/office/drawing/2016/5/13/chartex" xmlns:cx8="http://schemas.microsoft.com/office/drawing/2016/5/14/chartex" xmlns:mc="http://schemas.openxmlformats.org/markup-compatibility/2006" xmlns:aink="http://schemas.microsoft.com/office/drawing/2016/ink" xmlns:am3d="http://schemas.microsoft.com/office/drawing/2017/model3d" xmlns:o="urn:schemas-microsoft-com:office:office" xmlns:oel="http://schemas.microsoft.com/office/2019/extlst" xmlns:r="http://schemas.openxmlformats.org/officeDocument/2006/relationships" xmlns:m="http://schemas.openxmlformats.org/officeDocument/2006/math" xmlns:v="urn:schemas-microsoft-com:vml" xmlns:wp14="http://schemas.microsoft.com/office/word/2010/wordprocessingDrawing" xmlns:wp="http://schemas.openxmlformats.org/drawingml/2006/wordprocessingDrawing" xmlns:w10="urn:schemas-microsoft-com:office:word" xmlns:w="http://schemas.openxmlformats.org/wordprocessingml/2006/main" xmlns:w14="http://schemas.microsoft.com/office/word/2010/wordml" xmlns:w15="http://schemas.microsoft.com/office/word/2012/wordml" xmlns:w16cex="http://schemas.microsoft.com/office/word/2018/wordml/cex" xmlns:w16cid="http://schemas.microsoft.com/office/word/2016/wordml/cid" xmlns:w16="http://schemas.microsoft.com/office/word/2018/wordml" xmlns:w16du="http://schemas.microsoft.com/office/word/2023/wordml/word16du" xmlns:w16sdtdh="http://schemas.microsoft.com/office/word/2020/wordml/sdtdatahash" xmlns:w16sdtfl="http://schemas.microsoft.com/office/word/2024/wordml/sdtformatlock" xmlns:w16se="http://schemas.microsoft.com/office/word/2015/wordml/symex" xmlns:wpg="http://schemas.microsoft.com/office/word/2010/wordprocessingGroup" xmlns:wpi="http://schemas.microsoft.com/office/word/2010/wordprocessingInk" xmlns:wne="http://schemas.microsoft.com/office/word/2006/wordml" xmlns:wps="http://schemas.microsoft.com/office/word/2010/wordprocessingShape" mc:Ignorable="w14 w15 w16se w16cid w16 w16cex w16sdtdh w16sdtfl w16du wp14">
+<w:hdr xmlns:wpc="http://schemas.microsoft.com/office/word/2010/wordprocessingCanvas" xmlns:cx="http://schemas.microsoft.com/office/drawing/2014/chartex" xmlns:cx1="http://schemas.microsoft.com/office/drawing/2015/9/8/chartex" xmlns:cx2="http://schemas.microsoft.com/office/drawing/2015/10/21/chartex" xmlns:cx3="http://schemas.microsoft.com/office/drawing/2016/5/9/chartex" xmlns:cx4="http://schemas.microsoft.com/office/drawing/2016/5/10/chartex" xmlns:cx5="http://schemas.microsoft.com/office/drawing/2016/5/11/chartex" xmlns:cx6="http://schemas.microsoft.com/office/drawing/2016/5/12/chartex" xmlns:cx7="http://schemas.microsoft.com/office/drawing/2016/5/13/chartex" xmlns:cx8="http://schemas.microsoft.com/office/drawing/2016/5/14/chartex" xmlns:mc="http://schemas.openxmlformats.org/markup-compatibility/2006" xmlns:aink="http://schemas.microsoft.com/office/drawing/2016/ink" xmlns:am3d="http://schemas.microsoft.com/office/drawing/2017/model3d" xmlns:o="urn:schemas-microsoft-com:office:office" xmlns:oel="http://schemas.microsoft.com/office/2019/extlst" xmlns:r="http://schemas.openxmlformats.org/officeDocument/2006/relationships" xmlns:m="http://schemas.openxmlformats.org/officeDocument/2006/math" xmlns:v="urn:schemas-microsoft-com:vml" xmlns:wp14="http://schemas.microsoft.com/office/word/2010/wordprocessingDrawing" xmlns:wp="http://schemas.openxmlformats.org/drawingml/2006/wordprocessingDrawing" xmlns:w10="urn:schemas-microsoft-com:office:word" xmlns:w="http://schemas.openxmlformats.org/wordprocessingml/2006/main" xmlns:w14="http://schemas.microsoft.com/office/word/2010/wordml" xmlns:w15="http://schemas.microsoft.com/office/word/2012/wordml" xmlns:w16cex="http://schemas.microsoft.com/office/word/2018/wordml/cex" xmlns:w16cid="http://schemas.microsoft.com/office/word/2016/wordml/cid" xmlns:w16="http://schemas.microsoft.com/office/word/2018/wordml" xmlns:w16sdtdh="http://schemas.microsoft.com/office/word/2020/wordml/sdtdatahash" xmlns:w16se="http://schemas.microsoft.com/office/word/2015/wordml/symex" xmlns:wpg="http://schemas.microsoft.com/office/word/2010/wordprocessingGroup" xmlns:wpi="http://schemas.microsoft.com/office/word/2010/wordprocessingInk" xmlns:wne="http://schemas.microsoft.com/office/word/2006/wordml" xmlns:wps="http://schemas.microsoft.com/office/word/2010/wordprocessingShape" mc:Ignorable="w14 w15 w16se w16cid w16 w16cex w16sdtdh wp14">
   <w:p>
     <w:pPr>
       <w:pBdr>
@@ -17362,7 +15280,7 @@
 </file>
 
 <file path=word/numbering.xml><?xml version="1.0" encoding="utf-8"?>
-<w:numbering xmlns:wpc="http://schemas.microsoft.com/office/word/2010/wordprocessingCanvas" xmlns:cx="http://schemas.microsoft.com/office/drawing/2014/chartex" xmlns:cx1="http://schemas.microsoft.com/office/drawing/2015/9/8/chartex" xmlns:cx2="http://schemas.microsoft.com/office/drawing/2015/10/21/chartex" xmlns:cx3="http://schemas.microsoft.com/office/drawing/2016/5/9/chartex" xmlns:cx4="http://schemas.microsoft.com/office/drawing/2016/5/10/chartex" xmlns:cx5="http://schemas.microsoft.com/office/drawing/2016/5/11/chartex" xmlns:cx6="http://schemas.microsoft.com/office/drawing/2016/5/12/chartex" xmlns:cx7="http://schemas.microsoft.com/office/drawing/2016/5/13/chartex" xmlns:cx8="http://schemas.microsoft.com/office/drawing/2016/5/14/chartex" xmlns:mc="http://schemas.openxmlformats.org/markup-compatibility/2006" xmlns:aink="http://schemas.microsoft.com/office/drawing/2016/ink" xmlns:am3d="http://schemas.microsoft.com/office/drawing/2017/model3d" xmlns:o="urn:schemas-microsoft-com:office:office" xmlns:oel="http://schemas.microsoft.com/office/2019/extlst" xmlns:r="http://schemas.openxmlformats.org/officeDocument/2006/relationships" xmlns:m="http://schemas.openxmlformats.org/officeDocument/2006/math" xmlns:v="urn:schemas-microsoft-com:vml" xmlns:wp14="http://schemas.microsoft.com/office/word/2010/wordprocessingDrawing" xmlns:wp="http://schemas.openxmlformats.org/drawingml/2006/wordprocessingDrawing" xmlns:w10="urn:schemas-microsoft-com:office:word" xmlns:w="http://schemas.openxmlformats.org/wordprocessingml/2006/main" xmlns:w14="http://schemas.microsoft.com/office/word/2010/wordml" xmlns:w15="http://schemas.microsoft.com/office/word/2012/wordml" xmlns:w16cex="http://schemas.microsoft.com/office/word/2018/wordml/cex" xmlns:w16cid="http://schemas.microsoft.com/office/word/2016/wordml/cid" xmlns:w16="http://schemas.microsoft.com/office/word/2018/wordml" xmlns:w16du="http://schemas.microsoft.com/office/word/2023/wordml/word16du" xmlns:w16sdtdh="http://schemas.microsoft.com/office/word/2020/wordml/sdtdatahash" xmlns:w16sdtfl="http://schemas.microsoft.com/office/word/2024/wordml/sdtformatlock" xmlns:w16se="http://schemas.microsoft.com/office/word/2015/wordml/symex" xmlns:wpg="http://schemas.microsoft.com/office/word/2010/wordprocessingGroup" xmlns:wpi="http://schemas.microsoft.com/office/word/2010/wordprocessingInk" xmlns:wne="http://schemas.microsoft.com/office/word/2006/wordml" xmlns:wps="http://schemas.microsoft.com/office/word/2010/wordprocessingShape" mc:Ignorable="w14 w15 w16se w16cid w16 w16cex w16sdtdh w16sdtfl w16du wp14">
+<w:numbering xmlns:wpc="http://schemas.microsoft.com/office/word/2010/wordprocessingCanvas" xmlns:cx="http://schemas.microsoft.com/office/drawing/2014/chartex" xmlns:cx1="http://schemas.microsoft.com/office/drawing/2015/9/8/chartex" xmlns:cx2="http://schemas.microsoft.com/office/drawing/2015/10/21/chartex" xmlns:cx3="http://schemas.microsoft.com/office/drawing/2016/5/9/chartex" xmlns:cx4="http://schemas.microsoft.com/office/drawing/2016/5/10/chartex" xmlns:cx5="http://schemas.microsoft.com/office/drawing/2016/5/11/chartex" xmlns:cx6="http://schemas.microsoft.com/office/drawing/2016/5/12/chartex" xmlns:cx7="http://schemas.microsoft.com/office/drawing/2016/5/13/chartex" xmlns:cx8="http://schemas.microsoft.com/office/drawing/2016/5/14/chartex" xmlns:mc="http://schemas.openxmlformats.org/markup-compatibility/2006" xmlns:aink="http://schemas.microsoft.com/office/drawing/2016/ink" xmlns:am3d="http://schemas.microsoft.com/office/drawing/2017/model3d" xmlns:o="urn:schemas-microsoft-com:office:office" xmlns:oel="http://schemas.microsoft.com/office/2019/extlst" xmlns:r="http://schemas.openxmlformats.org/officeDocument/2006/relationships" xmlns:m="http://schemas.openxmlformats.org/officeDocument/2006/math" xmlns:v="urn:schemas-microsoft-com:vml" xmlns:wp14="http://schemas.microsoft.com/office/word/2010/wordprocessingDrawing" xmlns:wp="http://schemas.openxmlformats.org/drawingml/2006/wordprocessingDrawing" xmlns:w10="urn:schemas-microsoft-com:office:word" xmlns:w="http://schemas.openxmlformats.org/wordprocessingml/2006/main" xmlns:w14="http://schemas.microsoft.com/office/word/2010/wordml" xmlns:w15="http://schemas.microsoft.com/office/word/2012/wordml" xmlns:w16cex="http://schemas.microsoft.com/office/word/2018/wordml/cex" xmlns:w16cid="http://schemas.microsoft.com/office/word/2016/wordml/cid" xmlns:w16="http://schemas.microsoft.com/office/word/2018/wordml" xmlns:w16sdtdh="http://schemas.microsoft.com/office/word/2020/wordml/sdtdatahash" xmlns:w16se="http://schemas.microsoft.com/office/word/2015/wordml/symex" xmlns:wpg="http://schemas.microsoft.com/office/word/2010/wordprocessingGroup" xmlns:wpi="http://schemas.microsoft.com/office/word/2010/wordprocessingInk" xmlns:wne="http://schemas.microsoft.com/office/word/2006/wordml" xmlns:wps="http://schemas.microsoft.com/office/word/2010/wordprocessingShape" mc:Ignorable="w14 w15 w16se w16cid w16 w16cex w16sdtdh wp14">
   <w:abstractNum w:abstractNumId="0" w15:restartNumberingAfterBreak="0">
     <w:nsid w:val="0C5F5D60"/>
     <w:multiLevelType w:val="hybridMultilevel"/>
@@ -17830,7 +15748,7 @@
 </file>
 
 <file path=word/styles.xml><?xml version="1.0" encoding="utf-8"?>
-<w:styles xmlns:mc="http://schemas.openxmlformats.org/markup-compatibility/2006" xmlns:r="http://schemas.openxmlformats.org/officeDocument/2006/relationships" xmlns:w="http://schemas.openxmlformats.org/wordprocessingml/2006/main" xmlns:w14="http://schemas.microsoft.com/office/word/2010/wordml" xmlns:w15="http://schemas.microsoft.com/office/word/2012/wordml" xmlns:w16cex="http://schemas.microsoft.com/office/word/2018/wordml/cex" xmlns:w16cid="http://schemas.microsoft.com/office/word/2016/wordml/cid" xmlns:w16="http://schemas.microsoft.com/office/word/2018/wordml" xmlns:w16du="http://schemas.microsoft.com/office/word/2023/wordml/word16du" xmlns:w16sdtdh="http://schemas.microsoft.com/office/word/2020/wordml/sdtdatahash" xmlns:w16sdtfl="http://schemas.microsoft.com/office/word/2024/wordml/sdtformatlock" xmlns:w16se="http://schemas.microsoft.com/office/word/2015/wordml/symex" mc:Ignorable="w14 w15 w16se w16cid w16 w16cex w16sdtdh w16sdtfl w16du">
+<w:styles xmlns:mc="http://schemas.openxmlformats.org/markup-compatibility/2006" xmlns:r="http://schemas.openxmlformats.org/officeDocument/2006/relationships" xmlns:w="http://schemas.openxmlformats.org/wordprocessingml/2006/main" xmlns:w14="http://schemas.microsoft.com/office/word/2010/wordml" xmlns:w15="http://schemas.microsoft.com/office/word/2012/wordml" xmlns:w16cex="http://schemas.microsoft.com/office/word/2018/wordml/cex" xmlns:w16cid="http://schemas.microsoft.com/office/word/2016/wordml/cid" xmlns:w16="http://schemas.microsoft.com/office/word/2018/wordml" xmlns:w16sdtdh="http://schemas.microsoft.com/office/word/2020/wordml/sdtdatahash" xmlns:w16se="http://schemas.microsoft.com/office/word/2015/wordml/symex" mc:Ignorable="w14 w15 w16se w16cid w16 w16cex w16sdtdh">
   <w:docDefaults>
     <w:rPrDefault>
       <w:rPr>

</xml_diff>

<commit_message>
improvement in code and update document
</commit_message>
<xml_diff>
--- a/DF_TermProject_Spring2026.docx
+++ b/DF_TermProject_Spring2026.docx
@@ -1,6 +1,6 @@
 
 <file path=word/document.xml><?xml version="1.0" encoding="utf-8"?>
-<w:document xmlns:wpc="http://schemas.microsoft.com/office/word/2010/wordprocessingCanvas" xmlns:cx="http://schemas.microsoft.com/office/drawing/2014/chartex" xmlns:cx1="http://schemas.microsoft.com/office/drawing/2015/9/8/chartex" xmlns:cx2="http://schemas.microsoft.com/office/drawing/2015/10/21/chartex" xmlns:cx3="http://schemas.microsoft.com/office/drawing/2016/5/9/chartex" xmlns:cx4="http://schemas.microsoft.com/office/drawing/2016/5/10/chartex" xmlns:cx5="http://schemas.microsoft.com/office/drawing/2016/5/11/chartex" xmlns:cx6="http://schemas.microsoft.com/office/drawing/2016/5/12/chartex" xmlns:cx7="http://schemas.microsoft.com/office/drawing/2016/5/13/chartex" xmlns:cx8="http://schemas.microsoft.com/office/drawing/2016/5/14/chartex" xmlns:mc="http://schemas.openxmlformats.org/markup-compatibility/2006" xmlns:aink="http://schemas.microsoft.com/office/drawing/2016/ink" xmlns:am3d="http://schemas.microsoft.com/office/drawing/2017/model3d" xmlns:o="urn:schemas-microsoft-com:office:office" xmlns:oel="http://schemas.microsoft.com/office/2019/extlst" xmlns:r="http://schemas.openxmlformats.org/officeDocument/2006/relationships" xmlns:m="http://schemas.openxmlformats.org/officeDocument/2006/math" xmlns:v="urn:schemas-microsoft-com:vml" xmlns:wp14="http://schemas.microsoft.com/office/word/2010/wordprocessingDrawing" xmlns:wp="http://schemas.openxmlformats.org/drawingml/2006/wordprocessingDrawing" xmlns:w10="urn:schemas-microsoft-com:office:word" xmlns:w="http://schemas.openxmlformats.org/wordprocessingml/2006/main" xmlns:w14="http://schemas.microsoft.com/office/word/2010/wordml" xmlns:w15="http://schemas.microsoft.com/office/word/2012/wordml" xmlns:w16cex="http://schemas.microsoft.com/office/word/2018/wordml/cex" xmlns:w16cid="http://schemas.microsoft.com/office/word/2016/wordml/cid" xmlns:w16="http://schemas.microsoft.com/office/word/2018/wordml" xmlns:w16sdtdh="http://schemas.microsoft.com/office/word/2020/wordml/sdtdatahash" xmlns:w16se="http://schemas.microsoft.com/office/word/2015/wordml/symex" xmlns:wpg="http://schemas.microsoft.com/office/word/2010/wordprocessingGroup" xmlns:wpi="http://schemas.microsoft.com/office/word/2010/wordprocessingInk" xmlns:wne="http://schemas.microsoft.com/office/word/2006/wordml" xmlns:wps="http://schemas.microsoft.com/office/word/2010/wordprocessingShape" mc:Ignorable="w14 w15 w16se w16cid w16 w16cex w16sdtdh wp14">
+<w:document xmlns:wpc="http://schemas.microsoft.com/office/word/2010/wordprocessingCanvas" xmlns:cx="http://schemas.microsoft.com/office/drawing/2014/chartex" xmlns:cx1="http://schemas.microsoft.com/office/drawing/2015/9/8/chartex" xmlns:cx2="http://schemas.microsoft.com/office/drawing/2015/10/21/chartex" xmlns:cx3="http://schemas.microsoft.com/office/drawing/2016/5/9/chartex" xmlns:cx4="http://schemas.microsoft.com/office/drawing/2016/5/10/chartex" xmlns:cx5="http://schemas.microsoft.com/office/drawing/2016/5/11/chartex" xmlns:cx6="http://schemas.microsoft.com/office/drawing/2016/5/12/chartex" xmlns:cx7="http://schemas.microsoft.com/office/drawing/2016/5/13/chartex" xmlns:cx8="http://schemas.microsoft.com/office/drawing/2016/5/14/chartex" xmlns:mc="http://schemas.openxmlformats.org/markup-compatibility/2006" xmlns:aink="http://schemas.microsoft.com/office/drawing/2016/ink" xmlns:am3d="http://schemas.microsoft.com/office/drawing/2017/model3d" xmlns:o="urn:schemas-microsoft-com:office:office" xmlns:oel="http://schemas.microsoft.com/office/2019/extlst" xmlns:r="http://schemas.openxmlformats.org/officeDocument/2006/relationships" xmlns:m="http://schemas.openxmlformats.org/officeDocument/2006/math" xmlns:v="urn:schemas-microsoft-com:vml" xmlns:wp14="http://schemas.microsoft.com/office/word/2010/wordprocessingDrawing" xmlns:wp="http://schemas.openxmlformats.org/drawingml/2006/wordprocessingDrawing" xmlns:w10="urn:schemas-microsoft-com:office:word" xmlns:w="http://schemas.openxmlformats.org/wordprocessingml/2006/main" xmlns:w14="http://schemas.microsoft.com/office/word/2010/wordml" xmlns:w15="http://schemas.microsoft.com/office/word/2012/wordml" xmlns:w16cex="http://schemas.microsoft.com/office/word/2018/wordml/cex" xmlns:w16cid="http://schemas.microsoft.com/office/word/2016/wordml/cid" xmlns:w16="http://schemas.microsoft.com/office/word/2018/wordml" xmlns:w16du="http://schemas.microsoft.com/office/word/2023/wordml/word16du" xmlns:w16sdtdh="http://schemas.microsoft.com/office/word/2020/wordml/sdtdatahash" xmlns:w16sdtfl="http://schemas.microsoft.com/office/word/2024/wordml/sdtformatlock" xmlns:w16se="http://schemas.microsoft.com/office/word/2015/wordml/symex" xmlns:wpg="http://schemas.microsoft.com/office/word/2010/wordprocessingGroup" xmlns:wpi="http://schemas.microsoft.com/office/word/2010/wordprocessingInk" xmlns:wne="http://schemas.microsoft.com/office/word/2006/wordml" xmlns:wps="http://schemas.microsoft.com/office/word/2010/wordprocessingShape" mc:Ignorable="w14 w15 w16se w16cid w16 w16cex w16sdtdh w16sdtfl w16du wp14">
   <w:body>
     <w:p>
       <w:pPr>
@@ -13170,6 +13170,7 @@
               <w:rPr>
                 <w:b/>
                 <w:bCs/>
+                <w:noProof/>
               </w:rPr>
               <w:drawing>
                 <wp:inline distT="0" distB="0" distL="0" distR="0" wp14:anchorId="39D6140F" wp14:editId="6682B9DC">
@@ -13632,7 +13633,23 @@
           <w:bCs/>
           <w:color w:val="2E75B6"/>
         </w:rPr>
-        <w:t>Member 1: [Student Name] – Reflection</w:t>
+        <w:t>Member 1: [</w:t>
+      </w:r>
+      <w:r>
+        <w:rPr>
+          <w:b/>
+          <w:bCs/>
+          <w:color w:val="2E75B6"/>
+        </w:rPr>
+        <w:t>Abdul Moeez Tariq</w:t>
+      </w:r>
+      <w:r>
+        <w:rPr>
+          <w:b/>
+          <w:bCs/>
+          <w:color w:val="2E75B6"/>
+        </w:rPr>
+        <w:t>] – Reflection</w:t>
       </w:r>
     </w:p>
     <w:p>
@@ -13643,26 +13660,11 @@
         <w:spacing w:before="160" w:after="40"/>
       </w:pPr>
       <w:r>
-        <w:rPr>
-          <w:i/>
-          <w:iCs/>
-          <w:color w:val="595959"/>
-        </w:rPr>
-        <w:t>[Write your 4–5 line reflection here]</w:t>
-      </w:r>
-    </w:p>
-    <w:p/>
-    <w:p>
-      <w:pPr>
-        <w:spacing w:before="100" w:after="40"/>
-      </w:pPr>
-      <w:r>
-        <w:rPr>
-          <w:b/>
-          <w:bCs/>
-          <w:color w:val="2E75B6"/>
-        </w:rPr>
-        <w:t>Member 2: [Student Name] – Reflection</w:t>
+        <w:t xml:space="preserve">As the Team Lead, this project helped me gain practical experience in managing a complete multi-environment CI/CD pipeline and coordinating team collaboration. I created and managed the GitHub </w:t>
+      </w:r>
+      <w:r>
+        <w:lastRenderedPageBreak/>
+        <w:t>repository, configured environments and secrets, reviewed Pull Requests, and ensured smooth integration of all team contributions. A major challenge was setting up automated workflows for different environments, which I resolved through proper configuration and testing of GitHub Actions, Docker, and Render deployments. This experience improved my understanding of DevOps practices, version control strategies, and team leadership in a real-world development workflow.</w:t>
       </w:r>
     </w:p>
     <w:p>
@@ -13672,9 +13674,6 @@
         </w:pBdr>
         <w:spacing w:before="160" w:after="40"/>
       </w:pPr>
-      <w:r>
-        <w:t>During this term project, I learned how a multi-environment CI/CD pipeline automates software delivery from code changes to a live website. I built lahore.html as Member 2, creating a complete destination page about Badshahi Mosque, Lahore Fort, and Shalimar Gardens while linking to the shared style.css and following the same navigation and layout used across PakVista. I also authored cd-dev.yml, which triggers an automatic deployment to the Render development environment whenever changes are merged into the develop branch. One challenge I faced was that some external image links did not display correctly on the page, so I replaced them with verified image URLs from TripAdvisor, Britannica, and Wikimedia Commons. This project helped me understand how developers, GitHub Actions, Docker, and Render work together to deliver updates quickly and reliably.</w:t>
-      </w:r>
     </w:p>
     <w:p/>
     <w:p>
@@ -13687,45 +13686,23 @@
           <w:bCs/>
           <w:color w:val="2E75B6"/>
         </w:rPr>
-        <w:t>Member 3: [Student Name] – Reflection</w:t>
-      </w:r>
-    </w:p>
-    <w:p>
-      <w:r>
-        <w:t xml:space="preserve">As Member 3, I worked on the Hunza Valley page and the CI workflow for the staging environment. </w:t>
-      </w:r>
-    </w:p>
-    <w:p>
-      <w:r>
-        <w:t xml:space="preserve">I learned how a feature branch is created from develop and how Pull Requests are used in a DevOps workflow. </w:t>
-      </w:r>
-    </w:p>
-    <w:p>
-      <w:r>
-        <w:t xml:space="preserve">While writing ci-staging.yml, I understood how GitHub Actions can lint code, build a project, and push Docker images to Docker Hub. </w:t>
-      </w:r>
-    </w:p>
-    <w:p>
-      <w:r>
-        <w:t xml:space="preserve">The main challenge was understanding the difference between development and staging triggers, but I resolved it by checking the branch-based workflow rules. </w:t>
-      </w:r>
-    </w:p>
-    <w:p>
-      <w:r>
-        <w:t>This task helped me understand how CI/CD supports automated and reliable deployment.</w:t>
-      </w:r>
-    </w:p>
-    <w:p>
-      <w:pPr>
-        <w:spacing w:before="100" w:after="40"/>
-      </w:pPr>
+        <w:t>Member 2: [</w:t>
+      </w:r>
       <w:r>
         <w:rPr>
           <w:b/>
           <w:bCs/>
           <w:color w:val="2E75B6"/>
         </w:rPr>
-        <w:t>Member 4: [Student Name] – Reflection</w:t>
+        <w:t>Abdullah Butt</w:t>
+      </w:r>
+      <w:r>
+        <w:rPr>
+          <w:b/>
+          <w:bCs/>
+          <w:color w:val="2E75B6"/>
+        </w:rPr>
+        <w:t>] – Reflection</w:t>
       </w:r>
     </w:p>
     <w:p>
@@ -13736,12 +13713,7 @@
         <w:spacing w:before="160" w:after="40"/>
       </w:pPr>
       <w:r>
-        <w:rPr>
-          <w:i/>
-          <w:iCs/>
-          <w:color w:val="595959"/>
-        </w:rPr>
-        <w:t>[Write your 4–5 line reflection here]</w:t>
+        <w:t>During this term project, I learned how a multi-environment CI/CD pipeline automates software delivery from code changes to a live website. I built lahore.html as Member 2, creating a complete destination page about Badshahi Mosque, Lahore Fort, and Shalimar Gardens while linking to the shared style.css and following the same navigation and layout used across PakVista. I also authored cd-dev.yml, which triggers an automatic deployment to the Render development environment whenever changes are merged into the develop branch. One challenge I faced was that some external image links did not display correctly on the page, so I replaced them with verified image URLs from TripAdvisor, Britannica, and Wikimedia Commons. This project helped me understand how developers, GitHub Actions, Docker, and Render work together to deliver updates quickly and reliably.</w:t>
       </w:r>
     </w:p>
     <w:p/>
@@ -13755,7 +13727,77 @@
           <w:bCs/>
           <w:color w:val="2E75B6"/>
         </w:rPr>
-        <w:t>Member 5: [Student Name] – Reflection</w:t>
+        <w:t>Member 3: [</w:t>
+      </w:r>
+      <w:r>
+        <w:rPr>
+          <w:b/>
+          <w:bCs/>
+          <w:color w:val="2E75B6"/>
+        </w:rPr>
+        <w:t>Mukarram</w:t>
+      </w:r>
+      <w:r>
+        <w:rPr>
+          <w:b/>
+          <w:bCs/>
+          <w:color w:val="2E75B6"/>
+        </w:rPr>
+        <w:t>] – Reflection</w:t>
+      </w:r>
+    </w:p>
+    <w:p>
+      <w:r>
+        <w:t xml:space="preserve">As Member 3, I worked on the Hunza Valley page and the CI workflow for the staging environment. </w:t>
+      </w:r>
+    </w:p>
+    <w:p>
+      <w:r>
+        <w:t xml:space="preserve">I learned how a feature branch is created from develop and how Pull Requests are used in a DevOps workflow. </w:t>
+      </w:r>
+    </w:p>
+    <w:p>
+      <w:r>
+        <w:t xml:space="preserve">While writing ci-staging.yml, I understood how GitHub Actions can lint code, build a project, and push Docker images to Docker Hub. </w:t>
+      </w:r>
+    </w:p>
+    <w:p>
+      <w:r>
+        <w:t xml:space="preserve">The main challenge was understanding the difference between development and staging triggers, but I resolved it by checking the branch-based workflow rules. </w:t>
+      </w:r>
+    </w:p>
+    <w:p>
+      <w:r>
+        <w:t>This task helped me understand how CI/CD supports automated and reliable deployment.</w:t>
+      </w:r>
+    </w:p>
+    <w:p>
+      <w:pPr>
+        <w:spacing w:before="100" w:after="40"/>
+      </w:pPr>
+      <w:r>
+        <w:rPr>
+          <w:b/>
+          <w:bCs/>
+          <w:color w:val="2E75B6"/>
+        </w:rPr>
+        <w:t>Member 4: [</w:t>
+      </w:r>
+      <w:r>
+        <w:rPr>
+          <w:b/>
+          <w:bCs/>
+          <w:color w:val="2E75B6"/>
+        </w:rPr>
+        <w:t>Nurooz amin</w:t>
+      </w:r>
+      <w:r>
+        <w:rPr>
+          <w:b/>
+          <w:bCs/>
+          <w:color w:val="2E75B6"/>
+        </w:rPr>
+        <w:t>] – Reflection</w:t>
       </w:r>
     </w:p>
     <w:p>
@@ -13766,12 +13808,48 @@
         <w:spacing w:before="160" w:after="40"/>
       </w:pPr>
       <w:r>
-        <w:rPr>
-          <w:i/>
-          <w:iCs/>
-          <w:color w:val="595959"/>
-        </w:rPr>
-        <w:t>[Write your 4–5 line reflection here]</w:t>
+        <w:t>As Member 4, I worked on the Karachi page and learned how to develop a complete HTML page while maintaining a consistent design using the shared CSS stylesheet. I also gained experience in creating the cd-staging.yml workflow and understood how GitHub Actions automate deployment to the staging environment. One challenge I faced was ensuring the correct workflow configuration and proper deployment trigger, which I solved through testing and reviewing the CI/CD process. This project enhanced my knowledge of Git, Docker, Render, and collaborative DevOps development practices.</w:t>
+      </w:r>
+    </w:p>
+    <w:p/>
+    <w:p>
+      <w:pPr>
+        <w:spacing w:before="100" w:after="40"/>
+      </w:pPr>
+      <w:r>
+        <w:rPr>
+          <w:b/>
+          <w:bCs/>
+          <w:color w:val="2E75B6"/>
+        </w:rPr>
+        <w:t>Member 5: [</w:t>
+      </w:r>
+      <w:r>
+        <w:rPr>
+          <w:b/>
+          <w:bCs/>
+          <w:color w:val="2E75B6"/>
+        </w:rPr>
+        <w:t>Abdur raffay Iftikhar Durrani</w:t>
+      </w:r>
+      <w:r>
+        <w:rPr>
+          <w:b/>
+          <w:bCs/>
+          <w:color w:val="2E75B6"/>
+        </w:rPr>
+        <w:t>] – Reflection</w:t>
+      </w:r>
+    </w:p>
+    <w:p>
+      <w:pPr>
+        <w:pBdr>
+          <w:bottom w:val="single" w:sz="2" w:space="1" w:color="CCCCCC"/>
+        </w:pBdr>
+        <w:spacing w:before="160" w:after="40"/>
+      </w:pPr>
+      <w:r>
+        <w:t>As Member 5, I worked on the Swat Valley page and learned how to create a well-structured HTML page while maintaining a consistent design using the shared CSS file. I also gained practical experience in authoring the ci-prod.yml workflow and understanding how GitHub Actions automate the process of building, testing, and pushing Docker images. The main challenge I faced was correctly configuring the production environment workflow and ensuring that the required steps and tags were properly set. This project improved my understanding of CI/CD pipelines, Git, Docker, and collaborative development practices.</w:t>
       </w:r>
     </w:p>
     <w:p/>
@@ -15086,7 +15164,7 @@
 </file>
 
 <file path=word/endnotes.xml><?xml version="1.0" encoding="utf-8"?>
-<w:endnotes xmlns:wpc="http://schemas.microsoft.com/office/word/2010/wordprocessingCanvas" xmlns:cx="http://schemas.microsoft.com/office/drawing/2014/chartex" xmlns:cx1="http://schemas.microsoft.com/office/drawing/2015/9/8/chartex" xmlns:cx2="http://schemas.microsoft.com/office/drawing/2015/10/21/chartex" xmlns:cx3="http://schemas.microsoft.com/office/drawing/2016/5/9/chartex" xmlns:cx4="http://schemas.microsoft.com/office/drawing/2016/5/10/chartex" xmlns:cx5="http://schemas.microsoft.com/office/drawing/2016/5/11/chartex" xmlns:cx6="http://schemas.microsoft.com/office/drawing/2016/5/12/chartex" xmlns:cx7="http://schemas.microsoft.com/office/drawing/2016/5/13/chartex" xmlns:cx8="http://schemas.microsoft.com/office/drawing/2016/5/14/chartex" xmlns:mc="http://schemas.openxmlformats.org/markup-compatibility/2006" xmlns:aink="http://schemas.microsoft.com/office/drawing/2016/ink" xmlns:am3d="http://schemas.microsoft.com/office/drawing/2017/model3d" xmlns:o="urn:schemas-microsoft-com:office:office" xmlns:oel="http://schemas.microsoft.com/office/2019/extlst" xmlns:r="http://schemas.openxmlformats.org/officeDocument/2006/relationships" xmlns:m="http://schemas.openxmlformats.org/officeDocument/2006/math" xmlns:v="urn:schemas-microsoft-com:vml" xmlns:wp14="http://schemas.microsoft.com/office/word/2010/wordprocessingDrawing" xmlns:wp="http://schemas.openxmlformats.org/drawingml/2006/wordprocessingDrawing" xmlns:w10="urn:schemas-microsoft-com:office:word" xmlns:w="http://schemas.openxmlformats.org/wordprocessingml/2006/main" xmlns:w14="http://schemas.microsoft.com/office/word/2010/wordml" xmlns:w15="http://schemas.microsoft.com/office/word/2012/wordml" xmlns:w16cex="http://schemas.microsoft.com/office/word/2018/wordml/cex" xmlns:w16cid="http://schemas.microsoft.com/office/word/2016/wordml/cid" xmlns:w16="http://schemas.microsoft.com/office/word/2018/wordml" xmlns:w16sdtdh="http://schemas.microsoft.com/office/word/2020/wordml/sdtdatahash" xmlns:w16se="http://schemas.microsoft.com/office/word/2015/wordml/symex" xmlns:wpg="http://schemas.microsoft.com/office/word/2010/wordprocessingGroup" xmlns:wpi="http://schemas.microsoft.com/office/word/2010/wordprocessingInk" xmlns:wne="http://schemas.microsoft.com/office/word/2006/wordml" xmlns:wps="http://schemas.microsoft.com/office/word/2010/wordprocessingShape" mc:Ignorable="w14 w15 w16se w16cid w16 w16cex w16sdtdh wp14">
+<w:endnotes xmlns:wpc="http://schemas.microsoft.com/office/word/2010/wordprocessingCanvas" xmlns:cx="http://schemas.microsoft.com/office/drawing/2014/chartex" xmlns:cx1="http://schemas.microsoft.com/office/drawing/2015/9/8/chartex" xmlns:cx2="http://schemas.microsoft.com/office/drawing/2015/10/21/chartex" xmlns:cx3="http://schemas.microsoft.com/office/drawing/2016/5/9/chartex" xmlns:cx4="http://schemas.microsoft.com/office/drawing/2016/5/10/chartex" xmlns:cx5="http://schemas.microsoft.com/office/drawing/2016/5/11/chartex" xmlns:cx6="http://schemas.microsoft.com/office/drawing/2016/5/12/chartex" xmlns:cx7="http://schemas.microsoft.com/office/drawing/2016/5/13/chartex" xmlns:cx8="http://schemas.microsoft.com/office/drawing/2016/5/14/chartex" xmlns:mc="http://schemas.openxmlformats.org/markup-compatibility/2006" xmlns:aink="http://schemas.microsoft.com/office/drawing/2016/ink" xmlns:am3d="http://schemas.microsoft.com/office/drawing/2017/model3d" xmlns:o="urn:schemas-microsoft-com:office:office" xmlns:oel="http://schemas.microsoft.com/office/2019/extlst" xmlns:r="http://schemas.openxmlformats.org/officeDocument/2006/relationships" xmlns:m="http://schemas.openxmlformats.org/officeDocument/2006/math" xmlns:v="urn:schemas-microsoft-com:vml" xmlns:wp14="http://schemas.microsoft.com/office/word/2010/wordprocessingDrawing" xmlns:wp="http://schemas.openxmlformats.org/drawingml/2006/wordprocessingDrawing" xmlns:w10="urn:schemas-microsoft-com:office:word" xmlns:w="http://schemas.openxmlformats.org/wordprocessingml/2006/main" xmlns:w14="http://schemas.microsoft.com/office/word/2010/wordml" xmlns:w15="http://schemas.microsoft.com/office/word/2012/wordml" xmlns:w16cex="http://schemas.microsoft.com/office/word/2018/wordml/cex" xmlns:w16cid="http://schemas.microsoft.com/office/word/2016/wordml/cid" xmlns:w16="http://schemas.microsoft.com/office/word/2018/wordml" xmlns:w16du="http://schemas.microsoft.com/office/word/2023/wordml/word16du" xmlns:w16sdtdh="http://schemas.microsoft.com/office/word/2020/wordml/sdtdatahash" xmlns:w16sdtfl="http://schemas.microsoft.com/office/word/2024/wordml/sdtformatlock" xmlns:w16se="http://schemas.microsoft.com/office/word/2015/wordml/symex" xmlns:wpg="http://schemas.microsoft.com/office/word/2010/wordprocessingGroup" xmlns:wpi="http://schemas.microsoft.com/office/word/2010/wordprocessingInk" xmlns:wne="http://schemas.microsoft.com/office/word/2006/wordml" xmlns:wps="http://schemas.microsoft.com/office/word/2010/wordprocessingShape" mc:Ignorable="w14 w15 w16se w16cid w16 w16cex w16sdtdh w16sdtfl w16du wp14">
   <w:endnote w:type="separator" w:id="-1">
     <w:p>
       <w:r>
@@ -15105,7 +15183,7 @@
 </file>
 
 <file path=word/footer1.xml><?xml version="1.0" encoding="utf-8"?>
-<w:ftr xmlns:wpc="http://schemas.microsoft.com/office/word/2010/wordprocessingCanvas" xmlns:cx="http://schemas.microsoft.com/office/drawing/2014/chartex" xmlns:cx1="http://schemas.microsoft.com/office/drawing/2015/9/8/chartex" xmlns:cx2="http://schemas.microsoft.com/office/drawing/2015/10/21/chartex" xmlns:cx3="http://schemas.microsoft.com/office/drawing/2016/5/9/chartex" xmlns:cx4="http://schemas.microsoft.com/office/drawing/2016/5/10/chartex" xmlns:cx5="http://schemas.microsoft.com/office/drawing/2016/5/11/chartex" xmlns:cx6="http://schemas.microsoft.com/office/drawing/2016/5/12/chartex" xmlns:cx7="http://schemas.microsoft.com/office/drawing/2016/5/13/chartex" xmlns:cx8="http://schemas.microsoft.com/office/drawing/2016/5/14/chartex" xmlns:mc="http://schemas.openxmlformats.org/markup-compatibility/2006" xmlns:aink="http://schemas.microsoft.com/office/drawing/2016/ink" xmlns:am3d="http://schemas.microsoft.com/office/drawing/2017/model3d" xmlns:o="urn:schemas-microsoft-com:office:office" xmlns:oel="http://schemas.microsoft.com/office/2019/extlst" xmlns:r="http://schemas.openxmlformats.org/officeDocument/2006/relationships" xmlns:m="http://schemas.openxmlformats.org/officeDocument/2006/math" xmlns:v="urn:schemas-microsoft-com:vml" xmlns:wp14="http://schemas.microsoft.com/office/word/2010/wordprocessingDrawing" xmlns:wp="http://schemas.openxmlformats.org/drawingml/2006/wordprocessingDrawing" xmlns:w10="urn:schemas-microsoft-com:office:word" xmlns:w="http://schemas.openxmlformats.org/wordprocessingml/2006/main" xmlns:w14="http://schemas.microsoft.com/office/word/2010/wordml" xmlns:w15="http://schemas.microsoft.com/office/word/2012/wordml" xmlns:w16cex="http://schemas.microsoft.com/office/word/2018/wordml/cex" xmlns:w16cid="http://schemas.microsoft.com/office/word/2016/wordml/cid" xmlns:w16="http://schemas.microsoft.com/office/word/2018/wordml" xmlns:w16sdtdh="http://schemas.microsoft.com/office/word/2020/wordml/sdtdatahash" xmlns:w16se="http://schemas.microsoft.com/office/word/2015/wordml/symex" xmlns:wpg="http://schemas.microsoft.com/office/word/2010/wordprocessingGroup" xmlns:wpi="http://schemas.microsoft.com/office/word/2010/wordprocessingInk" xmlns:wne="http://schemas.microsoft.com/office/word/2006/wordml" xmlns:wps="http://schemas.microsoft.com/office/word/2010/wordprocessingShape" mc:Ignorable="w14 w15 w16se w16cid w16 w16cex w16sdtdh wp14">
+<w:ftr xmlns:wpc="http://schemas.microsoft.com/office/word/2010/wordprocessingCanvas" xmlns:cx="http://schemas.microsoft.com/office/drawing/2014/chartex" xmlns:cx1="http://schemas.microsoft.com/office/drawing/2015/9/8/chartex" xmlns:cx2="http://schemas.microsoft.com/office/drawing/2015/10/21/chartex" xmlns:cx3="http://schemas.microsoft.com/office/drawing/2016/5/9/chartex" xmlns:cx4="http://schemas.microsoft.com/office/drawing/2016/5/10/chartex" xmlns:cx5="http://schemas.microsoft.com/office/drawing/2016/5/11/chartex" xmlns:cx6="http://schemas.microsoft.com/office/drawing/2016/5/12/chartex" xmlns:cx7="http://schemas.microsoft.com/office/drawing/2016/5/13/chartex" xmlns:cx8="http://schemas.microsoft.com/office/drawing/2016/5/14/chartex" xmlns:mc="http://schemas.openxmlformats.org/markup-compatibility/2006" xmlns:aink="http://schemas.microsoft.com/office/drawing/2016/ink" xmlns:am3d="http://schemas.microsoft.com/office/drawing/2017/model3d" xmlns:o="urn:schemas-microsoft-com:office:office" xmlns:oel="http://schemas.microsoft.com/office/2019/extlst" xmlns:r="http://schemas.openxmlformats.org/officeDocument/2006/relationships" xmlns:m="http://schemas.openxmlformats.org/officeDocument/2006/math" xmlns:v="urn:schemas-microsoft-com:vml" xmlns:wp14="http://schemas.microsoft.com/office/word/2010/wordprocessingDrawing" xmlns:wp="http://schemas.openxmlformats.org/drawingml/2006/wordprocessingDrawing" xmlns:w10="urn:schemas-microsoft-com:office:word" xmlns:w="http://schemas.openxmlformats.org/wordprocessingml/2006/main" xmlns:w14="http://schemas.microsoft.com/office/word/2010/wordml" xmlns:w15="http://schemas.microsoft.com/office/word/2012/wordml" xmlns:w16cex="http://schemas.microsoft.com/office/word/2018/wordml/cex" xmlns:w16cid="http://schemas.microsoft.com/office/word/2016/wordml/cid" xmlns:w16="http://schemas.microsoft.com/office/word/2018/wordml" xmlns:w16du="http://schemas.microsoft.com/office/word/2023/wordml/word16du" xmlns:w16sdtdh="http://schemas.microsoft.com/office/word/2020/wordml/sdtdatahash" xmlns:w16sdtfl="http://schemas.microsoft.com/office/word/2024/wordml/sdtformatlock" xmlns:w16se="http://schemas.microsoft.com/office/word/2015/wordml/symex" xmlns:wpg="http://schemas.microsoft.com/office/word/2010/wordprocessingGroup" xmlns:wpi="http://schemas.microsoft.com/office/word/2010/wordprocessingInk" xmlns:wne="http://schemas.microsoft.com/office/word/2006/wordml" xmlns:wps="http://schemas.microsoft.com/office/word/2010/wordprocessingShape" mc:Ignorable="w14 w15 w16se w16cid w16 w16cex w16sdtdh w16sdtfl w16du wp14">
   <w:p>
     <w:pPr>
       <w:pBdr>
@@ -15227,7 +15305,7 @@
 </file>
 
 <file path=word/footnotes.xml><?xml version="1.0" encoding="utf-8"?>
-<w:footnotes xmlns:wpc="http://schemas.microsoft.com/office/word/2010/wordprocessingCanvas" xmlns:cx="http://schemas.microsoft.com/office/drawing/2014/chartex" xmlns:cx1="http://schemas.microsoft.com/office/drawing/2015/9/8/chartex" xmlns:cx2="http://schemas.microsoft.com/office/drawing/2015/10/21/chartex" xmlns:cx3="http://schemas.microsoft.com/office/drawing/2016/5/9/chartex" xmlns:cx4="http://schemas.microsoft.com/office/drawing/2016/5/10/chartex" xmlns:cx5="http://schemas.microsoft.com/office/drawing/2016/5/11/chartex" xmlns:cx6="http://schemas.microsoft.com/office/drawing/2016/5/12/chartex" xmlns:cx7="http://schemas.microsoft.com/office/drawing/2016/5/13/chartex" xmlns:cx8="http://schemas.microsoft.com/office/drawing/2016/5/14/chartex" xmlns:mc="http://schemas.openxmlformats.org/markup-compatibility/2006" xmlns:aink="http://schemas.microsoft.com/office/drawing/2016/ink" xmlns:am3d="http://schemas.microsoft.com/office/drawing/2017/model3d" xmlns:o="urn:schemas-microsoft-com:office:office" xmlns:oel="http://schemas.microsoft.com/office/2019/extlst" xmlns:r="http://schemas.openxmlformats.org/officeDocument/2006/relationships" xmlns:m="http://schemas.openxmlformats.org/officeDocument/2006/math" xmlns:v="urn:schemas-microsoft-com:vml" xmlns:wp14="http://schemas.microsoft.com/office/word/2010/wordprocessingDrawing" xmlns:wp="http://schemas.openxmlformats.org/drawingml/2006/wordprocessingDrawing" xmlns:w10="urn:schemas-microsoft-com:office:word" xmlns:w="http://schemas.openxmlformats.org/wordprocessingml/2006/main" xmlns:w14="http://schemas.microsoft.com/office/word/2010/wordml" xmlns:w15="http://schemas.microsoft.com/office/word/2012/wordml" xmlns:w16cex="http://schemas.microsoft.com/office/word/2018/wordml/cex" xmlns:w16cid="http://schemas.microsoft.com/office/word/2016/wordml/cid" xmlns:w16="http://schemas.microsoft.com/office/word/2018/wordml" xmlns:w16sdtdh="http://schemas.microsoft.com/office/word/2020/wordml/sdtdatahash" xmlns:w16se="http://schemas.microsoft.com/office/word/2015/wordml/symex" xmlns:wpg="http://schemas.microsoft.com/office/word/2010/wordprocessingGroup" xmlns:wpi="http://schemas.microsoft.com/office/word/2010/wordprocessingInk" xmlns:wne="http://schemas.microsoft.com/office/word/2006/wordml" xmlns:wps="http://schemas.microsoft.com/office/word/2010/wordprocessingShape" mc:Ignorable="w14 w15 w16se w16cid w16 w16cex w16sdtdh wp14">
+<w:footnotes xmlns:wpc="http://schemas.microsoft.com/office/word/2010/wordprocessingCanvas" xmlns:cx="http://schemas.microsoft.com/office/drawing/2014/chartex" xmlns:cx1="http://schemas.microsoft.com/office/drawing/2015/9/8/chartex" xmlns:cx2="http://schemas.microsoft.com/office/drawing/2015/10/21/chartex" xmlns:cx3="http://schemas.microsoft.com/office/drawing/2016/5/9/chartex" xmlns:cx4="http://schemas.microsoft.com/office/drawing/2016/5/10/chartex" xmlns:cx5="http://schemas.microsoft.com/office/drawing/2016/5/11/chartex" xmlns:cx6="http://schemas.microsoft.com/office/drawing/2016/5/12/chartex" xmlns:cx7="http://schemas.microsoft.com/office/drawing/2016/5/13/chartex" xmlns:cx8="http://schemas.microsoft.com/office/drawing/2016/5/14/chartex" xmlns:mc="http://schemas.openxmlformats.org/markup-compatibility/2006" xmlns:aink="http://schemas.microsoft.com/office/drawing/2016/ink" xmlns:am3d="http://schemas.microsoft.com/office/drawing/2017/model3d" xmlns:o="urn:schemas-microsoft-com:office:office" xmlns:oel="http://schemas.microsoft.com/office/2019/extlst" xmlns:r="http://schemas.openxmlformats.org/officeDocument/2006/relationships" xmlns:m="http://schemas.openxmlformats.org/officeDocument/2006/math" xmlns:v="urn:schemas-microsoft-com:vml" xmlns:wp14="http://schemas.microsoft.com/office/word/2010/wordprocessingDrawing" xmlns:wp="http://schemas.openxmlformats.org/drawingml/2006/wordprocessingDrawing" xmlns:w10="urn:schemas-microsoft-com:office:word" xmlns:w="http://schemas.openxmlformats.org/wordprocessingml/2006/main" xmlns:w14="http://schemas.microsoft.com/office/word/2010/wordml" xmlns:w15="http://schemas.microsoft.com/office/word/2012/wordml" xmlns:w16cex="http://schemas.microsoft.com/office/word/2018/wordml/cex" xmlns:w16cid="http://schemas.microsoft.com/office/word/2016/wordml/cid" xmlns:w16="http://schemas.microsoft.com/office/word/2018/wordml" xmlns:w16du="http://schemas.microsoft.com/office/word/2023/wordml/word16du" xmlns:w16sdtdh="http://schemas.microsoft.com/office/word/2020/wordml/sdtdatahash" xmlns:w16sdtfl="http://schemas.microsoft.com/office/word/2024/wordml/sdtformatlock" xmlns:w16se="http://schemas.microsoft.com/office/word/2015/wordml/symex" xmlns:wpg="http://schemas.microsoft.com/office/word/2010/wordprocessingGroup" xmlns:wpi="http://schemas.microsoft.com/office/word/2010/wordprocessingInk" xmlns:wne="http://schemas.microsoft.com/office/word/2006/wordml" xmlns:wps="http://schemas.microsoft.com/office/word/2010/wordprocessingShape" mc:Ignorable="w14 w15 w16se w16cid w16 w16cex w16sdtdh w16sdtfl w16du wp14">
   <w:footnote w:type="separator" w:id="-1">
     <w:p>
       <w:r>
@@ -15246,7 +15324,7 @@
 </file>
 
 <file path=word/header1.xml><?xml version="1.0" encoding="utf-8"?>
-<w:hdr xmlns:wpc="http://schemas.microsoft.com/office/word/2010/wordprocessingCanvas" xmlns:cx="http://schemas.microsoft.com/office/drawing/2014/chartex" xmlns:cx1="http://schemas.microsoft.com/office/drawing/2015/9/8/chartex" xmlns:cx2="http://schemas.microsoft.com/office/drawing/2015/10/21/chartex" xmlns:cx3="http://schemas.microsoft.com/office/drawing/2016/5/9/chartex" xmlns:cx4="http://schemas.microsoft.com/office/drawing/2016/5/10/chartex" xmlns:cx5="http://schemas.microsoft.com/office/drawing/2016/5/11/chartex" xmlns:cx6="http://schemas.microsoft.com/office/drawing/2016/5/12/chartex" xmlns:cx7="http://schemas.microsoft.com/office/drawing/2016/5/13/chartex" xmlns:cx8="http://schemas.microsoft.com/office/drawing/2016/5/14/chartex" xmlns:mc="http://schemas.openxmlformats.org/markup-compatibility/2006" xmlns:aink="http://schemas.microsoft.com/office/drawing/2016/ink" xmlns:am3d="http://schemas.microsoft.com/office/drawing/2017/model3d" xmlns:o="urn:schemas-microsoft-com:office:office" xmlns:oel="http://schemas.microsoft.com/office/2019/extlst" xmlns:r="http://schemas.openxmlformats.org/officeDocument/2006/relationships" xmlns:m="http://schemas.openxmlformats.org/officeDocument/2006/math" xmlns:v="urn:schemas-microsoft-com:vml" xmlns:wp14="http://schemas.microsoft.com/office/word/2010/wordprocessingDrawing" xmlns:wp="http://schemas.openxmlformats.org/drawingml/2006/wordprocessingDrawing" xmlns:w10="urn:schemas-microsoft-com:office:word" xmlns:w="http://schemas.openxmlformats.org/wordprocessingml/2006/main" xmlns:w14="http://schemas.microsoft.com/office/word/2010/wordml" xmlns:w15="http://schemas.microsoft.com/office/word/2012/wordml" xmlns:w16cex="http://schemas.microsoft.com/office/word/2018/wordml/cex" xmlns:w16cid="http://schemas.microsoft.com/office/word/2016/wordml/cid" xmlns:w16="http://schemas.microsoft.com/office/word/2018/wordml" xmlns:w16sdtdh="http://schemas.microsoft.com/office/word/2020/wordml/sdtdatahash" xmlns:w16se="http://schemas.microsoft.com/office/word/2015/wordml/symex" xmlns:wpg="http://schemas.microsoft.com/office/word/2010/wordprocessingGroup" xmlns:wpi="http://schemas.microsoft.com/office/word/2010/wordprocessingInk" xmlns:wne="http://schemas.microsoft.com/office/word/2006/wordml" xmlns:wps="http://schemas.microsoft.com/office/word/2010/wordprocessingShape" mc:Ignorable="w14 w15 w16se w16cid w16 w16cex w16sdtdh wp14">
+<w:hdr xmlns:wpc="http://schemas.microsoft.com/office/word/2010/wordprocessingCanvas" xmlns:cx="http://schemas.microsoft.com/office/drawing/2014/chartex" xmlns:cx1="http://schemas.microsoft.com/office/drawing/2015/9/8/chartex" xmlns:cx2="http://schemas.microsoft.com/office/drawing/2015/10/21/chartex" xmlns:cx3="http://schemas.microsoft.com/office/drawing/2016/5/9/chartex" xmlns:cx4="http://schemas.microsoft.com/office/drawing/2016/5/10/chartex" xmlns:cx5="http://schemas.microsoft.com/office/drawing/2016/5/11/chartex" xmlns:cx6="http://schemas.microsoft.com/office/drawing/2016/5/12/chartex" xmlns:cx7="http://schemas.microsoft.com/office/drawing/2016/5/13/chartex" xmlns:cx8="http://schemas.microsoft.com/office/drawing/2016/5/14/chartex" xmlns:mc="http://schemas.openxmlformats.org/markup-compatibility/2006" xmlns:aink="http://schemas.microsoft.com/office/drawing/2016/ink" xmlns:am3d="http://schemas.microsoft.com/office/drawing/2017/model3d" xmlns:o="urn:schemas-microsoft-com:office:office" xmlns:oel="http://schemas.microsoft.com/office/2019/extlst" xmlns:r="http://schemas.openxmlformats.org/officeDocument/2006/relationships" xmlns:m="http://schemas.openxmlformats.org/officeDocument/2006/math" xmlns:v="urn:schemas-microsoft-com:vml" xmlns:wp14="http://schemas.microsoft.com/office/word/2010/wordprocessingDrawing" xmlns:wp="http://schemas.openxmlformats.org/drawingml/2006/wordprocessingDrawing" xmlns:w10="urn:schemas-microsoft-com:office:word" xmlns:w="http://schemas.openxmlformats.org/wordprocessingml/2006/main" xmlns:w14="http://schemas.microsoft.com/office/word/2010/wordml" xmlns:w15="http://schemas.microsoft.com/office/word/2012/wordml" xmlns:w16cex="http://schemas.microsoft.com/office/word/2018/wordml/cex" xmlns:w16cid="http://schemas.microsoft.com/office/word/2016/wordml/cid" xmlns:w16="http://schemas.microsoft.com/office/word/2018/wordml" xmlns:w16du="http://schemas.microsoft.com/office/word/2023/wordml/word16du" xmlns:w16sdtdh="http://schemas.microsoft.com/office/word/2020/wordml/sdtdatahash" xmlns:w16sdtfl="http://schemas.microsoft.com/office/word/2024/wordml/sdtformatlock" xmlns:w16se="http://schemas.microsoft.com/office/word/2015/wordml/symex" xmlns:wpg="http://schemas.microsoft.com/office/word/2010/wordprocessingGroup" xmlns:wpi="http://schemas.microsoft.com/office/word/2010/wordprocessingInk" xmlns:wne="http://schemas.microsoft.com/office/word/2006/wordml" xmlns:wps="http://schemas.microsoft.com/office/word/2010/wordprocessingShape" mc:Ignorable="w14 w15 w16se w16cid w16 w16cex w16sdtdh w16sdtfl w16du wp14">
   <w:p>
     <w:pPr>
       <w:pBdr>
@@ -15280,7 +15358,7 @@
 </file>
 
 <file path=word/numbering.xml><?xml version="1.0" encoding="utf-8"?>
-<w:numbering xmlns:wpc="http://schemas.microsoft.com/office/word/2010/wordprocessingCanvas" xmlns:cx="http://schemas.microsoft.com/office/drawing/2014/chartex" xmlns:cx1="http://schemas.microsoft.com/office/drawing/2015/9/8/chartex" xmlns:cx2="http://schemas.microsoft.com/office/drawing/2015/10/21/chartex" xmlns:cx3="http://schemas.microsoft.com/office/drawing/2016/5/9/chartex" xmlns:cx4="http://schemas.microsoft.com/office/drawing/2016/5/10/chartex" xmlns:cx5="http://schemas.microsoft.com/office/drawing/2016/5/11/chartex" xmlns:cx6="http://schemas.microsoft.com/office/drawing/2016/5/12/chartex" xmlns:cx7="http://schemas.microsoft.com/office/drawing/2016/5/13/chartex" xmlns:cx8="http://schemas.microsoft.com/office/drawing/2016/5/14/chartex" xmlns:mc="http://schemas.openxmlformats.org/markup-compatibility/2006" xmlns:aink="http://schemas.microsoft.com/office/drawing/2016/ink" xmlns:am3d="http://schemas.microsoft.com/office/drawing/2017/model3d" xmlns:o="urn:schemas-microsoft-com:office:office" xmlns:oel="http://schemas.microsoft.com/office/2019/extlst" xmlns:r="http://schemas.openxmlformats.org/officeDocument/2006/relationships" xmlns:m="http://schemas.openxmlformats.org/officeDocument/2006/math" xmlns:v="urn:schemas-microsoft-com:vml" xmlns:wp14="http://schemas.microsoft.com/office/word/2010/wordprocessingDrawing" xmlns:wp="http://schemas.openxmlformats.org/drawingml/2006/wordprocessingDrawing" xmlns:w10="urn:schemas-microsoft-com:office:word" xmlns:w="http://schemas.openxmlformats.org/wordprocessingml/2006/main" xmlns:w14="http://schemas.microsoft.com/office/word/2010/wordml" xmlns:w15="http://schemas.microsoft.com/office/word/2012/wordml" xmlns:w16cex="http://schemas.microsoft.com/office/word/2018/wordml/cex" xmlns:w16cid="http://schemas.microsoft.com/office/word/2016/wordml/cid" xmlns:w16="http://schemas.microsoft.com/office/word/2018/wordml" xmlns:w16sdtdh="http://schemas.microsoft.com/office/word/2020/wordml/sdtdatahash" xmlns:w16se="http://schemas.microsoft.com/office/word/2015/wordml/symex" xmlns:wpg="http://schemas.microsoft.com/office/word/2010/wordprocessingGroup" xmlns:wpi="http://schemas.microsoft.com/office/word/2010/wordprocessingInk" xmlns:wne="http://schemas.microsoft.com/office/word/2006/wordml" xmlns:wps="http://schemas.microsoft.com/office/word/2010/wordprocessingShape" mc:Ignorable="w14 w15 w16se w16cid w16 w16cex w16sdtdh wp14">
+<w:numbering xmlns:wpc="http://schemas.microsoft.com/office/word/2010/wordprocessingCanvas" xmlns:cx="http://schemas.microsoft.com/office/drawing/2014/chartex" xmlns:cx1="http://schemas.microsoft.com/office/drawing/2015/9/8/chartex" xmlns:cx2="http://schemas.microsoft.com/office/drawing/2015/10/21/chartex" xmlns:cx3="http://schemas.microsoft.com/office/drawing/2016/5/9/chartex" xmlns:cx4="http://schemas.microsoft.com/office/drawing/2016/5/10/chartex" xmlns:cx5="http://schemas.microsoft.com/office/drawing/2016/5/11/chartex" xmlns:cx6="http://schemas.microsoft.com/office/drawing/2016/5/12/chartex" xmlns:cx7="http://schemas.microsoft.com/office/drawing/2016/5/13/chartex" xmlns:cx8="http://schemas.microsoft.com/office/drawing/2016/5/14/chartex" xmlns:mc="http://schemas.openxmlformats.org/markup-compatibility/2006" xmlns:aink="http://schemas.microsoft.com/office/drawing/2016/ink" xmlns:am3d="http://schemas.microsoft.com/office/drawing/2017/model3d" xmlns:o="urn:schemas-microsoft-com:office:office" xmlns:oel="http://schemas.microsoft.com/office/2019/extlst" xmlns:r="http://schemas.openxmlformats.org/officeDocument/2006/relationships" xmlns:m="http://schemas.openxmlformats.org/officeDocument/2006/math" xmlns:v="urn:schemas-microsoft-com:vml" xmlns:wp14="http://schemas.microsoft.com/office/word/2010/wordprocessingDrawing" xmlns:wp="http://schemas.openxmlformats.org/drawingml/2006/wordprocessingDrawing" xmlns:w10="urn:schemas-microsoft-com:office:word" xmlns:w="http://schemas.openxmlformats.org/wordprocessingml/2006/main" xmlns:w14="http://schemas.microsoft.com/office/word/2010/wordml" xmlns:w15="http://schemas.microsoft.com/office/word/2012/wordml" xmlns:w16cex="http://schemas.microsoft.com/office/word/2018/wordml/cex" xmlns:w16cid="http://schemas.microsoft.com/office/word/2016/wordml/cid" xmlns:w16="http://schemas.microsoft.com/office/word/2018/wordml" xmlns:w16du="http://schemas.microsoft.com/office/word/2023/wordml/word16du" xmlns:w16sdtdh="http://schemas.microsoft.com/office/word/2020/wordml/sdtdatahash" xmlns:w16sdtfl="http://schemas.microsoft.com/office/word/2024/wordml/sdtformatlock" xmlns:w16se="http://schemas.microsoft.com/office/word/2015/wordml/symex" xmlns:wpg="http://schemas.microsoft.com/office/word/2010/wordprocessingGroup" xmlns:wpi="http://schemas.microsoft.com/office/word/2010/wordprocessingInk" xmlns:wne="http://schemas.microsoft.com/office/word/2006/wordml" xmlns:wps="http://schemas.microsoft.com/office/word/2010/wordprocessingShape" mc:Ignorable="w14 w15 w16se w16cid w16 w16cex w16sdtdh w16sdtfl w16du wp14">
   <w:abstractNum w:abstractNumId="0" w15:restartNumberingAfterBreak="0">
     <w:nsid w:val="0C5F5D60"/>
     <w:multiLevelType w:val="hybridMultilevel"/>
@@ -15748,7 +15826,7 @@
 </file>
 
 <file path=word/styles.xml><?xml version="1.0" encoding="utf-8"?>
-<w:styles xmlns:mc="http://schemas.openxmlformats.org/markup-compatibility/2006" xmlns:r="http://schemas.openxmlformats.org/officeDocument/2006/relationships" xmlns:w="http://schemas.openxmlformats.org/wordprocessingml/2006/main" xmlns:w14="http://schemas.microsoft.com/office/word/2010/wordml" xmlns:w15="http://schemas.microsoft.com/office/word/2012/wordml" xmlns:w16cex="http://schemas.microsoft.com/office/word/2018/wordml/cex" xmlns:w16cid="http://schemas.microsoft.com/office/word/2016/wordml/cid" xmlns:w16="http://schemas.microsoft.com/office/word/2018/wordml" xmlns:w16sdtdh="http://schemas.microsoft.com/office/word/2020/wordml/sdtdatahash" xmlns:w16se="http://schemas.microsoft.com/office/word/2015/wordml/symex" mc:Ignorable="w14 w15 w16se w16cid w16 w16cex w16sdtdh">
+<w:styles xmlns:mc="http://schemas.openxmlformats.org/markup-compatibility/2006" xmlns:r="http://schemas.openxmlformats.org/officeDocument/2006/relationships" xmlns:w="http://schemas.openxmlformats.org/wordprocessingml/2006/main" xmlns:w14="http://schemas.microsoft.com/office/word/2010/wordml" xmlns:w15="http://schemas.microsoft.com/office/word/2012/wordml" xmlns:w16cex="http://schemas.microsoft.com/office/word/2018/wordml/cex" xmlns:w16cid="http://schemas.microsoft.com/office/word/2016/wordml/cid" xmlns:w16="http://schemas.microsoft.com/office/word/2018/wordml" xmlns:w16du="http://schemas.microsoft.com/office/word/2023/wordml/word16du" xmlns:w16sdtdh="http://schemas.microsoft.com/office/word/2020/wordml/sdtdatahash" xmlns:w16sdtfl="http://schemas.microsoft.com/office/word/2024/wordml/sdtformatlock" xmlns:w16se="http://schemas.microsoft.com/office/word/2015/wordml/symex" mc:Ignorable="w14 w15 w16se w16cid w16 w16cex w16sdtdh w16sdtfl w16du">
   <w:docDefaults>
     <w:rPrDefault>
       <w:rPr>
@@ -16238,7 +16316,6 @@
   <w:style w:type="character" w:default="1" w:styleId="DefaultParagraphFont">
     <w:name w:val="Default Paragraph Font"/>
     <w:uiPriority w:val="1"/>
-    <w:semiHidden/>
     <w:unhideWhenUsed/>
   </w:style>
   <w:style w:type="table" w:default="1" w:styleId="TableNormal">

</xml_diff>